<commit_message>
docs(zappa): musician guide FZ_* receipts (P3 addendum)
Add COMPOSER_OS_MUSICIAN_GUIDE section 2.7 for all 15 FZ_* stubs and promoted BURST/METRIC_SHIFT/REGISTER_COLLISION; regenerate docx.

Co-authored-by: Cursor <cursoragent@cursor.com>
</commit_message>
<xml_diff>
--- a/docs/COMPOSER_OS_MUSICIAN_GUIDE.docx
+++ b/docs/COMPOSER_OS_MUSICIAN_GUIDE.docx
@@ -19,7 +19,7 @@
           <w:sz w:val="48"/>
           <w:szCs w:val="48"/>
         </w:rPr>
-        <w:t xml:space="preserve">Composer OS Musician Guide</w:t>
+        <w:t xml:space="preserve">Composer OS — Musician Guide</w:t>
       </w:r>
     </w:p>
     <w:p>
@@ -34,7 +34,7 @@
           <w:sz w:val="28"/>
           <w:szCs w:val="28"/>
         </w:rPr>
-        <w:t xml:space="preserve">Composer OS â€” SQâ†’BB User Guide</w:t>
+        <w:t xml:space="preserve">Plain-English guide for writers and performers</w:t>
       </w:r>
     </w:p>
     <w:p>
@@ -557,7 +557,7 @@
         <w:ind w:left="360" w:hanging="260"/>
       </w:pPr>
       <w:r>
-        <w:t xml:space="preserve">â€¢ </w:t>
+        <w:t xml:space="preserve">• </w:t>
       </w:r>
       <w:r>
         <w:t xml:space="preserve">Loop length: 1, 2, 4, 8, 16, or 32 bars</w:t>
@@ -569,7 +569,7 @@
         <w:ind w:left="360" w:hanging="260"/>
       </w:pPr>
       <w:r>
-        <w:t xml:space="preserve">â€¢ </w:t>
+        <w:t xml:space="preserve">• </w:t>
       </w:r>
       <w:r>
         <w:t xml:space="preserve">Family: Funk / Rock / Fusion / Art Rock</w:t>
@@ -581,7 +581,7 @@
         <w:ind w:left="360" w:hanging="260"/>
       </w:pPr>
       <w:r>
-        <w:t xml:space="preserve">â€¢ </w:t>
+        <w:t xml:space="preserve">• </w:t>
       </w:r>
       <w:r>
         <w:t xml:space="preserve">VRB: Nile Rodgers, Led Zeppelin, Weather Report, Fripp, and others</w:t>
@@ -593,7 +593,7 @@
         <w:ind w:left="360" w:hanging="260"/>
       </w:pPr>
       <w:r>
-        <w:t xml:space="preserve">â€¢ </w:t>
+        <w:t xml:space="preserve">• </w:t>
       </w:r>
       <w:r>
         <w:t xml:space="preserve">Density: Sparse / Medium / Dense</w:t>
@@ -605,7 +605,7 @@
         <w:ind w:left="360" w:hanging="260"/>
       </w:pPr>
       <w:r>
-        <w:t xml:space="preserve">â€¢ </w:t>
+        <w:t xml:space="preserve">• </w:t>
       </w:r>
       <w:r>
         <w:t xml:space="preserve">Grid: Eighth / Sixteenth</w:t>
@@ -617,7 +617,7 @@
         <w:ind w:left="360" w:hanging="260"/>
       </w:pPr>
       <w:r>
-        <w:t xml:space="preserve">â€¢ </w:t>
+        <w:t xml:space="preserve">• </w:t>
       </w:r>
       <w:r>
         <w:t xml:space="preserve">Line mode: Single line / Guitar-bass / Octave double</w:t>
@@ -629,7 +629,7 @@
         <w:ind w:left="360" w:hanging="260"/>
       </w:pPr>
       <w:r>
-        <w:t xml:space="preserve">â€¢ </w:t>
+        <w:t xml:space="preserve">• </w:t>
       </w:r>
       <w:r>
         <w:t xml:space="preserve">Odd meter: Meter 5 / Meter 7 / Mahavishnu (Fusion and Art Rock only)</w:t>
@@ -1102,7 +1102,7 @@
         <w:ind w:left="360" w:hanging="260"/>
       </w:pPr>
       <w:r>
-        <w:t xml:space="preserve">â€¢ </w:t>
+        <w:t xml:space="preserve">• </w:t>
       </w:r>
       <w:r>
         <w:rPr>
@@ -1121,7 +1121,7 @@
         <w:ind w:left="360" w:hanging="260"/>
       </w:pPr>
       <w:r>
-        <w:t xml:space="preserve">â€¢ </w:t>
+        <w:t xml:space="preserve">• </w:t>
       </w:r>
       <w:r>
         <w:rPr>
@@ -1140,7 +1140,7 @@
         <w:ind w:left="360" w:hanging="260"/>
       </w:pPr>
       <w:r>
-        <w:t xml:space="preserve">â€¢ </w:t>
+        <w:t xml:space="preserve">• </w:t>
       </w:r>
       <w:r>
         <w:rPr>
@@ -1159,7 +1159,7 @@
         <w:ind w:left="360" w:hanging="260"/>
       </w:pPr>
       <w:r>
-        <w:t xml:space="preserve">â€¢ </w:t>
+        <w:t xml:space="preserve">• </w:t>
       </w:r>
       <w:r>
         <w:rPr>
@@ -1178,7 +1178,7 @@
         <w:ind w:left="360" w:hanging="260"/>
       </w:pPr>
       <w:r>
-        <w:t xml:space="preserve">â€¢ </w:t>
+        <w:t xml:space="preserve">• </w:t>
       </w:r>
       <w:r>
         <w:rPr>
@@ -2358,6 +2358,1198 @@
         <w:spacing w:after="100" w:before="160"/>
       </w:pPr>
       <w:r>
+        <w:t xml:space="preserve">2.7 Frank Zappa — FZ_* receipt fingerprints (V64 P3)</w:t>
+      </w:r>
+    </w:p>
+    <w:p>
+      <w:pPr>
+        <w:spacing w:after="160"/>
+      </w:pPr>
+      <w:r>
+        <w:t xml:space="preserve">When </w:t>
+      </w:r>
+      <w:r>
+        <w:rPr>
+          <w:b/>
+          <w:bCs/>
+        </w:rPr>
+        <w:t xml:space="preserve">Frank Zappa</w:t>
+      </w:r>
+      <w:r>
+        <w:t xml:space="preserve"> is the Song Mode writer or harmonic voice, the engine loads </w:t>
+      </w:r>
+      <w:r>
+        <w:rPr>
+          <w:b/>
+          <w:bCs/>
+        </w:rPr>
+        <w:t xml:space="preserve">fifteen `FZ_*` fingerprint receipts</w:t>
+      </w:r>
+      <w:r>
+        <w:t xml:space="preserve"> on the Frank Zappa VRB. These are planning rules that compile into the </w:t>
+      </w:r>
+      <w:r>
+        <w:rPr>
+          <w:b/>
+          <w:bCs/>
+        </w:rPr>
+        <w:t xml:space="preserve">riff profile</w:t>
+      </w:r>
+      <w:r>
+        <w:t xml:space="preserve"> (density, meter feel, register, variation operators) — not the separate </w:t>
+      </w:r>
+      <w:r>
+        <w:rPr>
+          <w:b/>
+          <w:bCs/>
+        </w:rPr>
+        <w:t xml:space="preserve">GCE structural</w:t>
+      </w:r>
+      <w:r>
+        <w:t xml:space="preserve"> layer (odd-meter maps, absurdist section kinds, register-swap bars) that P2 added. Think of </w:t>
+      </w:r>
+      <w:r>
+        <w:rPr>
+          <w:b/>
+          <w:bCs/>
+        </w:rPr>
+        <w:t xml:space="preserve">P2</w:t>
+      </w:r>
+      <w:r>
+        <w:t xml:space="preserve"> as *form and meter architecture*; </w:t>
+      </w:r>
+      <w:r>
+        <w:rPr>
+          <w:b/>
+          <w:bCs/>
+        </w:rPr>
+        <w:t xml:space="preserve">FZ_</w:t>
+      </w:r>
+      <w:r>
+        <w:t xml:space="preserve">* as *how the guitar/solo lane behaves* inside that architecture.</w:t>
+      </w:r>
+    </w:p>
+    <w:p>
+      <w:pPr>
+        <w:spacing w:after="160"/>
+      </w:pPr>
+      <w:r>
+        <w:rPr>
+          <w:b/>
+          <w:bCs/>
+        </w:rPr>
+        <w:t xml:space="preserve">When they fire:</w:t>
+      </w:r>
+      <w:r>
+        <w:t xml:space="preserve"> On every generate where `frank_zappa` resolves to the Frank Zappa VRB — Song Mode duo, riff generator, and blues-rock ferocity solo path. Receipts merge into `riffProfile` before notes are written. Twelve receipts apply broad prefix rules (harmony, melody, rhythm, etc.); </w:t>
+      </w:r>
+      <w:r>
+        <w:rPr>
+          <w:b/>
+          <w:bCs/>
+        </w:rPr>
+        <w:t xml:space="preserve">three are fully promoted (P3)</w:t>
+      </w:r>
+      <w:r>
+        <w:t xml:space="preserve"> with dedicated patches and golden fixtures (seeds </w:t>
+      </w:r>
+      <w:r>
+        <w:rPr>
+          <w:b/>
+          <w:bCs/>
+        </w:rPr>
+        <w:t xml:space="preserve">77001–77003</w:t>
+      </w:r>
+      <w:r>
+        <w:t xml:space="preserve">, off smoke until P8).</w:t>
+      </w:r>
+    </w:p>
+    <w:p>
+      <w:pPr>
+        <w:pStyle w:val="Heading3"/>
+        <w:spacing w:after="80" w:before="120"/>
+      </w:pPr>
+      <w:r>
+        <w:t xml:space="preserve">All 15 FZ_* stubs (one line each)</w:t>
+      </w:r>
+    </w:p>
+    <w:tbl>
+      <w:tblPr>
+        <w:tblW w:type="pct" w:w="100%"/>
+        <w:tblBorders>
+          <w:top w:val="single" w:color="auto" w:sz="4"/>
+          <w:left w:val="single" w:color="auto" w:sz="4"/>
+          <w:bottom w:val="single" w:color="auto" w:sz="4"/>
+          <w:right w:val="single" w:color="auto" w:sz="4"/>
+          <w:insideH w:val="single" w:color="auto" w:sz="4"/>
+          <w:insideV w:val="single" w:color="auto" w:sz="4"/>
+        </w:tblBorders>
+      </w:tblPr>
+      <w:tblGrid>
+        <w:gridCol w:w="4500"/>
+        <w:gridCol w:w="4500"/>
+      </w:tblGrid>
+      <w:tr>
+        <w:tc>
+          <w:tcPr>
+            <w:tcW w:type="pct" w:w="4500%"/>
+          </w:tcPr>
+          <w:p>
+            <w:pPr>
+              <w:spacing w:after="60"/>
+            </w:pPr>
+            <w:r>
+              <w:t xml:space="preserve">Receipt</w:t>
+            </w:r>
+          </w:p>
+        </w:tc>
+        <w:tc>
+          <w:tcPr>
+            <w:tcW w:type="pct" w:w="4500%"/>
+          </w:tcPr>
+          <w:p>
+            <w:pPr>
+              <w:spacing w:after="60"/>
+            </w:pPr>
+            <w:r>
+              <w:t xml:space="preserve">Description</w:t>
+            </w:r>
+          </w:p>
+        </w:tc>
+      </w:tr>
+      <w:tr>
+        <w:tc>
+          <w:tcPr>
+            <w:tcW w:type="pct" w:w="4500%"/>
+          </w:tcPr>
+          <w:p>
+            <w:pPr>
+              <w:spacing w:after="60"/>
+            </w:pPr>
+            <w:r>
+              <w:rPr>
+                <w:b/>
+                <w:bCs/>
+              </w:rPr>
+              <w:t xml:space="preserve">FZ_HARM_01</w:t>
+            </w:r>
+          </w:p>
+        </w:tc>
+        <w:tc>
+          <w:tcPr>
+            <w:tcW w:type="pct" w:w="4500%"/>
+          </w:tcPr>
+          <w:p>
+            <w:pPr>
+              <w:spacing w:after="60"/>
+            </w:pPr>
+            <w:r>
+              <w:t xml:space="preserve">Polytonal overlays; slash-chords and sudden unrelated tonal islands.</w:t>
+            </w:r>
+          </w:p>
+        </w:tc>
+      </w:tr>
+      <w:tr>
+        <w:tc>
+          <w:tcPr>
+            <w:tcW w:type="pct" w:w="4500%"/>
+          </w:tcPr>
+          <w:p>
+            <w:pPr>
+              <w:spacing w:after="60"/>
+            </w:pPr>
+            <w:r>
+              <w:rPr>
+                <w:b/>
+                <w:bCs/>
+              </w:rPr>
+              <w:t xml:space="preserve">FZ_HARM_02</w:t>
+            </w:r>
+          </w:p>
+        </w:tc>
+        <w:tc>
+          <w:tcPr>
+            <w:tcW w:type="pct" w:w="4500%"/>
+          </w:tcPr>
+          <w:p>
+            <w:pPr>
+              <w:spacing w:after="60"/>
+            </w:pPr>
+            <w:r>
+              <w:t xml:space="preserve">Jazz, rock, and neo-classical harmonic fragments in one phrase window.</w:t>
+            </w:r>
+          </w:p>
+        </w:tc>
+      </w:tr>
+      <w:tr>
+        <w:tc>
+          <w:tcPr>
+            <w:tcW w:type="pct" w:w="4500%"/>
+          </w:tcPr>
+          <w:p>
+            <w:pPr>
+              <w:spacing w:after="60"/>
+            </w:pPr>
+            <w:r>
+              <w:rPr>
+                <w:b/>
+                <w:bCs/>
+              </w:rPr>
+              <w:t xml:space="preserve">FZ_MELO_01</w:t>
+            </w:r>
+          </w:p>
+        </w:tc>
+        <w:tc>
+          <w:tcPr>
+            <w:tcW w:type="pct" w:w="4500%"/>
+          </w:tcPr>
+          <w:p>
+            <w:pPr>
+              <w:spacing w:after="60"/>
+            </w:pPr>
+            <w:r>
+              <w:t xml:space="preserve">Angular wide leaps, register jumps, motivic cells in the “wrong” metre.</w:t>
+            </w:r>
+          </w:p>
+        </w:tc>
+      </w:tr>
+      <w:tr>
+        <w:tc>
+          <w:tcPr>
+            <w:tcW w:type="pct" w:w="4500%"/>
+          </w:tcPr>
+          <w:p>
+            <w:pPr>
+              <w:spacing w:after="60"/>
+            </w:pPr>
+            <w:r>
+              <w:rPr>
+                <w:b/>
+                <w:bCs/>
+              </w:rPr>
+              <w:t xml:space="preserve">FZ_MELO_02</w:t>
+            </w:r>
+          </w:p>
+        </w:tc>
+        <w:tc>
+          <w:tcPr>
+            <w:tcW w:type="pct" w:w="4500%"/>
+          </w:tcPr>
+          <w:p>
+            <w:pPr>
+              <w:spacing w:after="60"/>
+            </w:pPr>
+            <w:r>
+              <w:t xml:space="preserve">Sprechstimme-adjacent contour allowed as guitar colour.</w:t>
+            </w:r>
+          </w:p>
+        </w:tc>
+      </w:tr>
+      <w:tr>
+        <w:tc>
+          <w:tcPr>
+            <w:tcW w:type="pct" w:w="4500%"/>
+          </w:tcPr>
+          <w:p>
+            <w:pPr>
+              <w:spacing w:after="60"/>
+            </w:pPr>
+            <w:r>
+              <w:rPr>
+                <w:b/>
+                <w:bCs/>
+              </w:rPr>
+              <w:t xml:space="preserve">FZ_RHY_01</w:t>
+            </w:r>
+          </w:p>
+        </w:tc>
+        <w:tc>
+          <w:tcPr>
+            <w:tcW w:type="pct" w:w="4500%"/>
+          </w:tcPr>
+          <w:p>
+            <w:pPr>
+              <w:spacing w:after="60"/>
+            </w:pPr>
+            <w:r>
+              <w:t xml:space="preserve">Complex metres, sudden metric resets, anti-metric precise notation feel.</w:t>
+            </w:r>
+          </w:p>
+        </w:tc>
+      </w:tr>
+      <w:tr>
+        <w:tc>
+          <w:tcPr>
+            <w:tcW w:type="pct" w:w="4500%"/>
+          </w:tcPr>
+          <w:p>
+            <w:pPr>
+              <w:spacing w:after="60"/>
+            </w:pPr>
+            <w:r>
+              <w:rPr>
+                <w:b/>
+                <w:bCs/>
+              </w:rPr>
+              <w:t xml:space="preserve">FZ_ORCH_01</w:t>
+            </w:r>
+          </w:p>
+        </w:tc>
+        <w:tc>
+          <w:tcPr>
+            <w:tcW w:type="pct" w:w="4500%"/>
+          </w:tcPr>
+          <w:p>
+            <w:pPr>
+              <w:spacing w:after="60"/>
+            </w:pPr>
+            <w:r>
+              <w:t xml:space="preserve">Dense eclectic texture, then sudden drop to a single voice.</w:t>
+            </w:r>
+          </w:p>
+        </w:tc>
+      </w:tr>
+      <w:tr>
+        <w:tc>
+          <w:tcPr>
+            <w:tcW w:type="pct" w:w="4500%"/>
+          </w:tcPr>
+          <w:p>
+            <w:pPr>
+              <w:spacing w:after="60"/>
+            </w:pPr>
+            <w:r>
+              <w:rPr>
+                <w:b/>
+                <w:bCs/>
+              </w:rPr>
+              <w:t xml:space="preserve">FZ_DIS_01</w:t>
+            </w:r>
+          </w:p>
+        </w:tc>
+        <w:tc>
+          <w:tcPr>
+            <w:tcW w:type="pct" w:w="4500%"/>
+          </w:tcPr>
+          <w:p>
+            <w:pPr>
+              <w:spacing w:after="60"/>
+            </w:pPr>
+            <w:r>
+              <w:t xml:space="preserve">High dissonance tolerance; clusters may sustain across barlines.</w:t>
+            </w:r>
+          </w:p>
+        </w:tc>
+      </w:tr>
+      <w:tr>
+        <w:tc>
+          <w:tcPr>
+            <w:tcW w:type="pct" w:w="4500%"/>
+          </w:tcPr>
+          <w:p>
+            <w:pPr>
+              <w:spacing w:after="60"/>
+            </w:pPr>
+            <w:r>
+              <w:rPr>
+                <w:b/>
+                <w:bCs/>
+              </w:rPr>
+              <w:t xml:space="preserve">FZ_FORM_01</w:t>
+            </w:r>
+          </w:p>
+        </w:tc>
+        <w:tc>
+          <w:tcPr>
+            <w:tcW w:type="pct" w:w="4500%"/>
+          </w:tcPr>
+          <w:p>
+            <w:pPr>
+              <w:spacing w:after="60"/>
+            </w:pPr>
+            <w:r>
+              <w:t xml:space="preserve">Through-composed; anti-repetition; hard episode cuts.</w:t>
+            </w:r>
+          </w:p>
+        </w:tc>
+      </w:tr>
+      <w:tr>
+        <w:tc>
+          <w:tcPr>
+            <w:tcW w:type="pct" w:w="4500%"/>
+          </w:tcPr>
+          <w:p>
+            <w:pPr>
+              <w:spacing w:after="60"/>
+            </w:pPr>
+            <w:r>
+              <w:rPr>
+                <w:b/>
+                <w:bCs/>
+              </w:rPr>
+              <w:t xml:space="preserve">FZ_BASS_01</w:t>
+            </w:r>
+          </w:p>
+        </w:tc>
+        <w:tc>
+          <w:tcPr>
+            <w:tcW w:type="pct" w:w="4500%"/>
+          </w:tcPr>
+          <w:p>
+            <w:pPr>
+              <w:spacing w:after="60"/>
+            </w:pPr>
+            <w:r>
+              <w:t xml:space="preserve">Angular chromatic bass; no conventional walking lines.</w:t>
+            </w:r>
+          </w:p>
+        </w:tc>
+      </w:tr>
+      <w:tr>
+        <w:tc>
+          <w:tcPr>
+            <w:tcW w:type="pct" w:w="4500%"/>
+          </w:tcPr>
+          <w:p>
+            <w:pPr>
+              <w:spacing w:after="60"/>
+            </w:pPr>
+            <w:r>
+              <w:rPr>
+                <w:b/>
+                <w:bCs/>
+              </w:rPr>
+              <w:t xml:space="preserve">FZ_GTR_01</w:t>
+            </w:r>
+          </w:p>
+        </w:tc>
+        <w:tc>
+          <w:tcPr>
+            <w:tcW w:type="pct" w:w="4500%"/>
+          </w:tcPr>
+          <w:p>
+            <w:pPr>
+              <w:spacing w:after="60"/>
+            </w:pPr>
+            <w:r>
+              <w:t xml:space="preserve">Clean-tone islands inside distorted phrases; stereo ping-pong optional.</w:t>
+            </w:r>
+          </w:p>
+        </w:tc>
+      </w:tr>
+      <w:tr>
+        <w:tc>
+          <w:tcPr>
+            <w:tcW w:type="pct" w:w="4500%"/>
+          </w:tcPr>
+          <w:p>
+            <w:pPr>
+              <w:spacing w:after="60"/>
+            </w:pPr>
+            <w:r>
+              <w:rPr>
+                <w:b/>
+                <w:bCs/>
+              </w:rPr>
+              <w:t xml:space="preserve">FZ_BURST</w:t>
+            </w:r>
+          </w:p>
+        </w:tc>
+        <w:tc>
+          <w:tcPr>
+            <w:tcW w:type="pct" w:w="4500%"/>
+          </w:tcPr>
+          <w:p>
+            <w:pPr>
+              <w:spacing w:after="60"/>
+            </w:pPr>
+            <w:r>
+              <w:rPr>
+                <w:b/>
+                <w:bCs/>
+              </w:rPr>
+              <w:t xml:space="preserve">Promoted (P3)</w:t>
+            </w:r>
+            <w:r>
+              <w:t xml:space="preserve"> — density spike then hard silence tail (see below).</w:t>
+            </w:r>
+          </w:p>
+        </w:tc>
+      </w:tr>
+      <w:tr>
+        <w:tc>
+          <w:tcPr>
+            <w:tcW w:type="pct" w:w="4500%"/>
+          </w:tcPr>
+          <w:p>
+            <w:pPr>
+              <w:spacing w:after="60"/>
+            </w:pPr>
+            <w:r>
+              <w:rPr>
+                <w:b/>
+                <w:bCs/>
+              </w:rPr>
+              <w:t xml:space="preserve">FZ_METRIC_SHIFT</w:t>
+            </w:r>
+          </w:p>
+        </w:tc>
+        <w:tc>
+          <w:tcPr>
+            <w:tcW w:type="pct" w:w="4500%"/>
+          </w:tcPr>
+          <w:p>
+            <w:pPr>
+              <w:spacing w:after="60"/>
+            </w:pPr>
+            <w:r>
+              <w:rPr>
+                <w:b/>
+                <w:bCs/>
+              </w:rPr>
+              <w:t xml:space="preserve">Promoted (P3)</w:t>
+            </w:r>
+            <w:r>
+              <w:t xml:space="preserve"> — metric displacement + superimposed 7/8 feel (see below).</w:t>
+            </w:r>
+          </w:p>
+        </w:tc>
+      </w:tr>
+      <w:tr>
+        <w:tc>
+          <w:tcPr>
+            <w:tcW w:type="pct" w:w="4500%"/>
+          </w:tcPr>
+          <w:p>
+            <w:pPr>
+              <w:spacing w:after="60"/>
+            </w:pPr>
+            <w:r>
+              <w:rPr>
+                <w:b/>
+                <w:bCs/>
+              </w:rPr>
+              <w:t xml:space="preserve">FZ_REGISTER_COLLISION</w:t>
+            </w:r>
+          </w:p>
+        </w:tc>
+        <w:tc>
+          <w:tcPr>
+            <w:tcW w:type="pct" w:w="4500%"/>
+          </w:tcPr>
+          <w:p>
+            <w:pPr>
+              <w:spacing w:after="60"/>
+            </w:pPr>
+            <w:r>
+              <w:rPr>
+                <w:b/>
+                <w:bCs/>
+              </w:rPr>
+              <w:t xml:space="preserve">Promoted (P3)</w:t>
+            </w:r>
+            <w:r>
+              <w:t xml:space="preserve"> — wide register + forced register swap (see below).</w:t>
+            </w:r>
+          </w:p>
+        </w:tc>
+      </w:tr>
+      <w:tr>
+        <w:tc>
+          <w:tcPr>
+            <w:tcW w:type="pct" w:w="4500%"/>
+          </w:tcPr>
+          <w:p>
+            <w:pPr>
+              <w:spacing w:after="60"/>
+            </w:pPr>
+            <w:r>
+              <w:rPr>
+                <w:b/>
+                <w:bCs/>
+              </w:rPr>
+              <w:t xml:space="preserve">FZ_DIFF_01</w:t>
+            </w:r>
+          </w:p>
+        </w:tc>
+        <w:tc>
+          <w:tcPr>
+            <w:tcW w:type="pct" w:w="4500%"/>
+          </w:tcPr>
+          <w:p>
+            <w:pPr>
+              <w:spacing w:after="60"/>
+            </w:pPr>
+            <w:r>
+              <w:t xml:space="preserve">Not fusion smooth jazz: no continuous diatonic 8th-note spine.</w:t>
+            </w:r>
+          </w:p>
+        </w:tc>
+      </w:tr>
+      <w:tr>
+        <w:tc>
+          <w:tcPr>
+            <w:tcW w:type="pct" w:w="4500%"/>
+          </w:tcPr>
+          <w:p>
+            <w:pPr>
+              <w:spacing w:after="60"/>
+            </w:pPr>
+            <w:r>
+              <w:rPr>
+                <w:b/>
+                <w:bCs/>
+              </w:rPr>
+              <w:t xml:space="preserve">FZ_DIFF_02</w:t>
+            </w:r>
+          </w:p>
+        </w:tc>
+        <w:tc>
+          <w:tcPr>
+            <w:tcW w:type="pct" w:w="4500%"/>
+          </w:tcPr>
+          <w:p>
+            <w:pPr>
+              <w:spacing w:after="60"/>
+            </w:pPr>
+            <w:r>
+              <w:t xml:space="preserve">Not minimalism: no steady pulse without pitch chaos on top.</w:t>
+            </w:r>
+          </w:p>
+        </w:tc>
+      </w:tr>
+    </w:tbl>
+    <w:p>
+      <w:pPr>
+        <w:spacing w:after="160"/>
+      </w:pPr>
+    </w:p>
+    <w:p>
+      <w:pPr>
+        <w:spacing w:after="160"/>
+      </w:pPr>
+      <w:r>
+        <w:t xml:space="preserve">`FZ_DIFF_*` are metadata-only guardrails (they steer planning text, not a numeric patch). The other prefix families (`FZ_HARM_*`, `FZ_MELO_*`, etc.) already compile to riff-profile fields.</w:t>
+      </w:r>
+    </w:p>
+    <w:p>
+      <w:pPr>
+        <w:pStyle w:val="Heading3"/>
+        <w:spacing w:after="80" w:before="120"/>
+      </w:pPr>
+      <w:r>
+        <w:t xml:space="preserve">FZ_BURST — density spike and silence tail</w:t>
+      </w:r>
+    </w:p>
+    <w:p>
+      <w:pPr>
+        <w:spacing w:after="160"/>
+      </w:pPr>
+      <w:r>
+        <w:rPr>
+          <w:b/>
+          <w:bCs/>
+        </w:rPr>
+        <w:t xml:space="preserve">What it does:</w:t>
+      </w:r>
+      <w:r>
+        <w:t xml:space="preserve"> Raises solo </w:t>
+      </w:r>
+      <w:r>
+        <w:rPr>
+          <w:b/>
+          <w:bCs/>
+        </w:rPr>
+        <w:t xml:space="preserve">note-density ceiling</w:t>
+      </w:r>
+      <w:r>
+        <w:t xml:space="preserve">, declares </w:t>
+      </w:r>
+      <w:r>
+        <w:rPr>
+          <w:b/>
+          <w:bCs/>
+        </w:rPr>
+        <w:t xml:space="preserve">thick→thin</w:t>
+      </w:r>
+      <w:r>
+        <w:t xml:space="preserve"> section-density transitions, and sets cadence weights toward </w:t>
+      </w:r>
+      <w:r>
+        <w:rPr>
+          <w:b/>
+          <w:bCs/>
+        </w:rPr>
+        <w:t xml:space="preserve">hard_stop_rest</w:t>
+      </w:r>
+      <w:r>
+        <w:t xml:space="preserve"> (phrase ends that cut off rather than fade).</w:t>
+      </w:r>
+    </w:p>
+    <w:p>
+      <w:pPr>
+        <w:spacing w:after="160"/>
+      </w:pPr>
+      <w:r>
+        <w:rPr>
+          <w:b/>
+          <w:bCs/>
+        </w:rPr>
+        <w:t xml:space="preserve">When it fires:</w:t>
+      </w:r>
+      <w:r>
+        <w:t xml:space="preserve"> Whenever the Frank Zappa VRB profile is built for the request — including Song Mode with `frank_zappa` and ferocity solo paths that read the merged `riffProfile`.</w:t>
+      </w:r>
+    </w:p>
+    <w:p>
+      <w:pPr>
+        <w:spacing w:after="160"/>
+      </w:pPr>
+      <w:r>
+        <w:rPr>
+          <w:b/>
+          <w:bCs/>
+        </w:rPr>
+        <w:t xml:space="preserve">What you hear:</w:t>
+      </w:r>
+      <w:r>
+        <w:t xml:space="preserve"> A bar or short run suddenly </w:t>
+      </w:r>
+      <w:r>
+        <w:rPr>
+          <w:b/>
+          <w:bCs/>
+        </w:rPr>
+        <w:t xml:space="preserve">fills up</w:t>
+      </w:r>
+      <w:r>
+        <w:t xml:space="preserve"> (more attacks, busier sixteenth activity), then the next bar or phrase tail </w:t>
+      </w:r>
+      <w:r>
+        <w:rPr>
+          <w:b/>
+          <w:bCs/>
+        </w:rPr>
+        <w:t xml:space="preserve">drops out</w:t>
+      </w:r>
+      <w:r>
+        <w:t xml:space="preserve"> — explicit breath/rest (`zappa_phrase_breath_rest` on the solo staff in Song Mode), not a long decay. Feels like Zappa </w:t>
+      </w:r>
+      <w:r>
+        <w:rPr>
+          <w:b/>
+          <w:bCs/>
+        </w:rPr>
+        <w:t xml:space="preserve">yelling then walking off</w:t>
+      </w:r>
+      <w:r>
+        <w:t xml:space="preserve"> mid-groove.</w:t>
+      </w:r>
+    </w:p>
+    <w:p>
+      <w:pPr>
+        <w:spacing w:after="160"/>
+      </w:pPr>
+      <w:r>
+        <w:rPr>
+          <w:b/>
+          <w:bCs/>
+        </w:rPr>
+        <w:t xml:space="preserve">Try it:</w:t>
+      </w:r>
+      <w:r>
+        <w:t xml:space="preserve"> Static harmony (e.g. eight bars of `Am7`), writer </w:t>
+      </w:r>
+      <w:r>
+        <w:rPr>
+          <w:b/>
+          <w:bCs/>
+        </w:rPr>
+        <w:t xml:space="preserve">frank_zappa</w:t>
+      </w:r>
+      <w:r>
+        <w:t xml:space="preserve">, high Motion/Tension in the drawer — scan the </w:t>
+      </w:r>
+      <w:r>
+        <w:rPr>
+          <w:b/>
+          <w:bCs/>
+        </w:rPr>
+        <w:t xml:space="preserve">zappa_solo</w:t>
+      </w:r>
+      <w:r>
+        <w:t xml:space="preserve"> staff for one dense bar followed by a nearly empty bar.</w:t>
+      </w:r>
+    </w:p>
+    <w:p>
+      <w:pPr>
+        <w:pStyle w:val="Heading3"/>
+        <w:spacing w:after="80" w:before="120"/>
+      </w:pPr>
+      <w:r>
+        <w:t xml:space="preserve">FZ_METRIC_SHIFT — metric displacement</w:t>
+      </w:r>
+    </w:p>
+    <w:p>
+      <w:pPr>
+        <w:spacing w:after="160"/>
+      </w:pPr>
+      <w:r>
+        <w:rPr>
+          <w:b/>
+          <w:bCs/>
+        </w:rPr>
+        <w:t xml:space="preserve">What it does:</w:t>
+      </w:r>
+      <w:r>
+        <w:t xml:space="preserve"> Adds </w:t>
+      </w:r>
+      <w:r>
+        <w:rPr>
+          <w:b/>
+          <w:bCs/>
+        </w:rPr>
+        <w:t xml:space="preserve">`metricDisplacement`</w:t>
+      </w:r>
+      <w:r>
+        <w:t xml:space="preserve"> (+0.25 over the Zappa stub baseline, typically ~0.8 on the profile) plus </w:t>
+      </w:r>
+      <w:r>
+        <w:rPr>
+          <w:b/>
+          <w:bCs/>
+        </w:rPr>
+        <w:t xml:space="preserve">grouping patterns</w:t>
+      </w:r>
+      <w:r>
+        <w:t xml:space="preserve"> such as 3+3+2 and superimposed </w:t>
+      </w:r>
+      <w:r>
+        <w:rPr>
+          <w:b/>
+          <w:bCs/>
+        </w:rPr>
+        <w:t xml:space="preserve">7/8</w:t>
+      </w:r>
+      <w:r>
+        <w:t xml:space="preserve"> against a straight grid.</w:t>
+      </w:r>
+    </w:p>
+    <w:p>
+      <w:pPr>
+        <w:spacing w:after="160"/>
+      </w:pPr>
+      <w:r>
+        <w:rPr>
+          <w:b/>
+          <w:bCs/>
+        </w:rPr>
+        <w:t xml:space="preserve">When it fires:</w:t>
+      </w:r>
+      <w:r>
+        <w:t xml:space="preserve"> Same VRB merge as above; works together with P2’s bar-meter map but does not replace it — P2 still owns written `&lt;time&gt;` changes; this receipt biases </w:t>
+      </w:r>
+      <w:r>
+        <w:rPr>
+          <w:b/>
+          <w:bCs/>
+        </w:rPr>
+        <w:t xml:space="preserve">rhythmic placement</w:t>
+      </w:r>
+      <w:r>
+        <w:t xml:space="preserve"> inside each bar.</w:t>
+      </w:r>
+    </w:p>
+    <w:p>
+      <w:pPr>
+        <w:spacing w:after="160"/>
+      </w:pPr>
+      <w:r>
+        <w:rPr>
+          <w:b/>
+          <w:bCs/>
+        </w:rPr>
+        <w:t xml:space="preserve">What you hear:</w:t>
+      </w:r>
+      <w:r>
+        <w:t xml:space="preserve"> The pulse </w:t>
+      </w:r>
+      <w:r>
+        <w:rPr>
+          <w:b/>
+          <w:bCs/>
+        </w:rPr>
+        <w:t xml:space="preserve">looks straight on paper</w:t>
+      </w:r>
+      <w:r>
+        <w:t xml:space="preserve"> but riffs and solo </w:t>
+      </w:r>
+      <w:r>
+        <w:rPr>
+          <w:b/>
+          <w:bCs/>
+        </w:rPr>
+        <w:t xml:space="preserve">lean across the bar</w:t>
+      </w:r>
+      <w:r>
+        <w:t xml:space="preserve"> — accents land on unexpected eighth positions, hemiola-like </w:t>
+      </w:r>
+      <w:r>
+        <w:rPr>
+          <w:b/>
+          <w:bCs/>
+        </w:rPr>
+        <w:t xml:space="preserve">3+3+2</w:t>
+      </w:r>
+      <w:r>
+        <w:t xml:space="preserve"> cells, “wrong” downbeats. Listener feels </w:t>
+      </w:r>
+      <w:r>
+        <w:rPr>
+          <w:b/>
+          <w:bCs/>
+        </w:rPr>
+        <w:t xml:space="preserve">metric sabotage</w:t>
+      </w:r>
+      <w:r>
+        <w:t xml:space="preserve">, not a new time signature on every bar.</w:t>
+      </w:r>
+    </w:p>
+    <w:p>
+      <w:pPr>
+        <w:spacing w:after="160"/>
+      </w:pPr>
+      <w:r>
+        <w:rPr>
+          <w:b/>
+          <w:bCs/>
+        </w:rPr>
+        <w:t xml:space="preserve">Try it:</w:t>
+      </w:r>
+      <w:r>
+        <w:t xml:space="preserve"> Zappa writer on a 4/4 chart; compare feel to </w:t>
+      </w:r>
+      <w:r>
+        <w:rPr>
+          <w:b/>
+          <w:bCs/>
+        </w:rPr>
+        <w:t xml:space="preserve">bill_evans</w:t>
+      </w:r>
+      <w:r>
+        <w:t xml:space="preserve"> on the same chords — Zappa profile should show higher `metricDisplacement` in diagnostics.</w:t>
+      </w:r>
+    </w:p>
+    <w:p>
+      <w:pPr>
+        <w:pStyle w:val="Heading3"/>
+        <w:spacing w:after="80" w:before="120"/>
+      </w:pPr>
+      <w:r>
+        <w:t xml:space="preserve">FZ_REGISTER_COLLISION — wide register and swap</w:t>
+      </w:r>
+    </w:p>
+    <w:p>
+      <w:pPr>
+        <w:spacing w:after="160"/>
+      </w:pPr>
+      <w:r>
+        <w:rPr>
+          <w:b/>
+          <w:bCs/>
+        </w:rPr>
+        <w:t xml:space="preserve">What it does:</w:t>
+      </w:r>
+      <w:r>
+        <w:t xml:space="preserve"> Widens allowed </w:t>
+      </w:r>
+      <w:r>
+        <w:rPr>
+          <w:b/>
+          <w:bCs/>
+        </w:rPr>
+        <w:t xml:space="preserve">MIDI register</w:t>
+      </w:r>
+      <w:r>
+        <w:t xml:space="preserve"> (roughly 40–84 on the profile), forces </w:t>
+      </w:r>
+      <w:r>
+        <w:rPr>
+          <w:b/>
+          <w:bCs/>
+        </w:rPr>
+        <w:t xml:space="preserve">`registerShift`</w:t>
+      </w:r>
+      <w:r>
+        <w:t xml:space="preserve"> in variation operators, and sets </w:t>
+      </w:r>
+      <w:r>
+        <w:rPr>
+          <w:b/>
+          <w:bCs/>
+        </w:rPr>
+        <w:t xml:space="preserve">`zappaRegisterSwapForced`</w:t>
+      </w:r>
+      <w:r>
+        <w:t xml:space="preserve"> in tuning options so guitar and bass lanes can </w:t>
+      </w:r>
+      <w:r>
+        <w:rPr>
+          <w:b/>
+          <w:bCs/>
+        </w:rPr>
+        <w:t xml:space="preserve">exchange register roles</w:t>
+      </w:r>
+      <w:r>
+        <w:t xml:space="preserve"> more aggressively.</w:t>
+      </w:r>
+    </w:p>
+    <w:p>
+      <w:pPr>
+        <w:spacing w:after="160"/>
+      </w:pPr>
+      <w:r>
+        <w:rPr>
+          <w:b/>
+          <w:bCs/>
+        </w:rPr>
+        <w:t xml:space="preserve">When it fires:</w:t>
+      </w:r>
+      <w:r>
+        <w:t xml:space="preserve"> On Frank Zappa VRB profile merge; Song Mode </w:t>
+      </w:r>
+      <w:r>
+        <w:rPr>
+          <w:b/>
+          <w:bCs/>
+        </w:rPr>
+        <w:t xml:space="preserve">Phase 4</w:t>
+      </w:r>
+      <w:r>
+        <w:t xml:space="preserve"> register swap (P2) can still add bar-level swaps — this receipt </w:t>
+      </w:r>
+      <w:r>
+        <w:rPr>
+          <w:b/>
+          <w:bCs/>
+        </w:rPr>
+        <w:t xml:space="preserve">raises the floor/ceiling</w:t>
+      </w:r>
+      <w:r>
+        <w:t xml:space="preserve"> and the swap appetite on the riff profile.</w:t>
+      </w:r>
+    </w:p>
+    <w:p>
+      <w:pPr>
+        <w:spacing w:after="160"/>
+      </w:pPr>
+      <w:r>
+        <w:rPr>
+          <w:b/>
+          <w:bCs/>
+        </w:rPr>
+        <w:t xml:space="preserve">What you hear:</w:t>
+      </w:r>
+      <w:r>
+        <w:t xml:space="preserve"> Guitar suddenly </w:t>
+      </w:r>
+      <w:r>
+        <w:rPr>
+          <w:b/>
+          <w:bCs/>
+        </w:rPr>
+        <w:t xml:space="preserve">screams in a high cluster</w:t>
+      </w:r>
+      <w:r>
+        <w:t xml:space="preserve">, bass or inner line </w:t>
+      </w:r>
+      <w:r>
+        <w:rPr>
+          <w:b/>
+          <w:bCs/>
+        </w:rPr>
+        <w:t xml:space="preserve">drops into a muddy low register</w:t>
+      </w:r>
+      <w:r>
+        <w:t xml:space="preserve">, or the roles </w:t>
+      </w:r>
+      <w:r>
+        <w:rPr>
+          <w:b/>
+          <w:bCs/>
+        </w:rPr>
+        <w:t xml:space="preserve">flip</w:t>
+      </w:r>
+      <w:r>
+        <w:t xml:space="preserve"> for a bar — “wrong instrument in wrong octave” on purpose. Wider </w:t>
+      </w:r>
+      <w:r>
+        <w:rPr>
+          <w:b/>
+          <w:bCs/>
+        </w:rPr>
+        <w:t xml:space="preserve">vertical spread</w:t>
+      </w:r>
+      <w:r>
+        <w:t xml:space="preserve"> than a polite jazz duo.</w:t>
+      </w:r>
+    </w:p>
+    <w:p>
+      <w:pPr>
+        <w:spacing w:after="160"/>
+      </w:pPr>
+      <w:r>
+        <w:rPr>
+          <w:b/>
+          <w:bCs/>
+        </w:rPr>
+        <w:t xml:space="preserve">Try it:</w:t>
+      </w:r>
+      <w:r>
+        <w:t xml:space="preserve"> Seed </w:t>
+      </w:r>
+      <w:r>
+        <w:rPr>
+          <w:b/>
+          <w:bCs/>
+        </w:rPr>
+        <w:t xml:space="preserve">77003</w:t>
+      </w:r>
+      <w:r>
+        <w:t xml:space="preserve"> golden path — same `Bb7` loop as generic Song Mode; Zappa solo/register span should exceed a </w:t>
+      </w:r>
+      <w:r>
+        <w:rPr>
+          <w:b/>
+          <w:bCs/>
+        </w:rPr>
+        <w:t xml:space="preserve">bill_evans</w:t>
+      </w:r>
+      <w:r>
+        <w:t xml:space="preserve"> run on the same seed/chords.</w:t>
+      </w:r>
+    </w:p>
+    <w:p>
+      <w:pPr>
+        <w:spacing w:after="160"/>
+      </w:pPr>
+      <w:r>
+        <w:rPr>
+          <w:b/>
+          <w:bCs/>
+        </w:rPr>
+        <w:t xml:space="preserve">Engineering note:</w:t>
+      </w:r>
+      <w:r>
+        <w:t xml:space="preserve"> Receipt compiler path is `patchForFzReceipt` in `riffReceiptCompiler.ts`; merged profile via `buildFrankZappaVrbRiffProfile()`. GCE structural fingerprint (`fz:*` pillars) remains a separate layer — do not confuse the two when reading export receipts.</w:t>
+      </w:r>
+    </w:p>
+    <w:p>
+      <w:pPr>
+        <w:pStyle w:val="Heading2"/>
+        <w:spacing w:after="100" w:before="160"/>
+      </w:pPr>
+      <w:r>
         <w:t xml:space="preserve">2.4 Guitar-Bass Duo voices</w:t>
       </w:r>
     </w:p>
@@ -3717,7 +4909,7 @@
         <w:ind w:left="360" w:hanging="260"/>
       </w:pPr>
       <w:r>
-        <w:t xml:space="preserve">â€¢ </w:t>
+        <w:t xml:space="preserve">• </w:t>
       </w:r>
       <w:r>
         <w:t xml:space="preserve">Debussy + Ravel — impressionist watercolour, smooth</w:t>
@@ -3729,7 +4921,7 @@
         <w:ind w:left="360" w:hanging="260"/>
       </w:pPr>
       <w:r>
-        <w:t xml:space="preserve">â€¢ </w:t>
+        <w:t xml:space="preserve">• </w:t>
       </w:r>
       <w:r>
         <w:t xml:space="preserve">Morricone + Herrmann + Badalamenti — cinematic layering</w:t>
@@ -3741,7 +4933,7 @@
         <w:ind w:left="360" w:hanging="260"/>
       </w:pPr>
       <w:r>
-        <w:t xml:space="preserve">â€¢ </w:t>
+        <w:t xml:space="preserve">• </w:t>
       </w:r>
       <w:r>
         <w:t xml:space="preserve">Zimmer + Morricone — modern epic with modal drama</w:t>
@@ -3753,7 +4945,7 @@
         <w:ind w:left="360" w:hanging="260"/>
       </w:pPr>
       <w:r>
-        <w:t xml:space="preserve">â€¢ </w:t>
+        <w:t xml:space="preserve">• </w:t>
       </w:r>
       <w:r>
         <w:t xml:space="preserve">Cole Porter + Gershwin — Broadway gradient</w:t>
@@ -3777,7 +4969,7 @@
         <w:ind w:left="360" w:hanging="260"/>
       </w:pPr>
       <w:r>
-        <w:t xml:space="preserve">â€¢ </w:t>
+        <w:t xml:space="preserve">• </w:t>
       </w:r>
       <w:r>
         <w:t xml:space="preserve">Coltrane + Bartok — interval-cell density meets chromatic clusters</w:t>
@@ -3789,7 +4981,7 @@
         <w:ind w:left="360" w:hanging="260"/>
       </w:pPr>
       <w:r>
-        <w:t xml:space="preserve">â€¢ </w:t>
+        <w:t xml:space="preserve">• </w:t>
       </w:r>
       <w:r>
         <w:t xml:space="preserve">Ornette Coleman + Arvo Pärt — harmolodic freedom frames tintinnabuli stillness</w:t>
@@ -4800,7 +5992,7 @@
         <w:ind w:left="360" w:hanging="260"/>
       </w:pPr>
       <w:r>
-        <w:t xml:space="preserve">â€¢ </w:t>
+        <w:t xml:space="preserve">• </w:t>
       </w:r>
       <w:r>
         <w:t xml:space="preserve">A songwriter driving the melody and rhythm</w:t>
@@ -4812,7 +6004,7 @@
         <w:ind w:left="360" w:hanging="260"/>
       </w:pPr>
       <w:r>
-        <w:t xml:space="preserve">â€¢ </w:t>
+        <w:t xml:space="preserve">• </w:t>
       </w:r>
       <w:r>
         <w:t xml:space="preserve">A different voice coloring the harmony underneath</w:t>
@@ -5001,8 +6193,32 @@
         </w:rPr>
         <w:t xml:space="preserve">Recipe 1 — ECM ballad (Metheny / Lyrical)</w:t>
       </w:r>
-      <w:r>
-        <w:t xml:space="preserve"> ``` Chords:    Cmaj9 | Bm7 | Am9 | Gmaj7 Writer:    pat_metheny Flavor:    Lyrical Motion:    -0.3 Tension:   -0.5 Variation: -0.2 ``` *Expect:* Floating, spacious, singable. Long phrase arcs. Open inner voices. The kind of melody that sits comfortably over ECM-style chord movement.</w:t>
+    </w:p>
+    <w:p>
+      <w:pPr>
+        <w:shd w:fill="F5F5F5"/>
+        <w:spacing w:after="120"/>
+      </w:pPr>
+      <w:r>
+        <w:rPr>
+          <w:rFonts w:ascii="Consolas" w:cs="Consolas" w:eastAsia="Consolas" w:hAnsi="Consolas"/>
+          <w:sz w:val="20"/>
+          <w:szCs w:val="20"/>
+        </w:rPr>
+        <w:t xml:space="preserve">Chords:    Cmaj9 | Bm7 | Am9 | Gmaj7
+Writer:    pat_metheny
+Flavor:    Lyrical
+Motion:    -0.3
+Tension:   -0.5
+Variation: -0.2</w:t>
+      </w:r>
+    </w:p>
+    <w:p>
+      <w:pPr>
+        <w:spacing w:after="160"/>
+      </w:pPr>
+      <w:r>
+        <w:t xml:space="preserve">*Expect:* Floating, spacious, singable. Long phrase arcs. Open inner voices. The kind of melody that sits comfortably over ECM-style chord movement.</w:t>
       </w:r>
     </w:p>
     <w:p>
@@ -5016,8 +6232,32 @@
         </w:rPr>
         <w:t xml:space="preserve">Recipe 2 — Post-bop tension (Shorter / Angular)</w:t>
       </w:r>
-      <w:r>
-        <w:t xml:space="preserve"> ``` Chords:    Dm7b5 | G7alt | Cbmaj7 | Ebm9 Writer:    wayne_shorter Flavor:    Angular Motion:    +0.6 Tension:   +0.7 Variation: +0.4 ``` *Expect:* Oblique, restless, searching. Lines that imply rather than state. Harmonic ambiguity at every turn. Classic Shorter ellipsis.</w:t>
+    </w:p>
+    <w:p>
+      <w:pPr>
+        <w:shd w:fill="F5F5F5"/>
+        <w:spacing w:after="120"/>
+      </w:pPr>
+      <w:r>
+        <w:rPr>
+          <w:rFonts w:ascii="Consolas" w:cs="Consolas" w:eastAsia="Consolas" w:hAnsi="Consolas"/>
+          <w:sz w:val="20"/>
+          <w:szCs w:val="20"/>
+        </w:rPr>
+        <w:t xml:space="preserve">Chords:    Dm7b5 | G7alt | Cbmaj7 | Ebm9
+Writer:    wayne_shorter
+Flavor:    Angular
+Motion:    +0.6
+Tension:   +0.7
+Variation: +0.4</w:t>
+      </w:r>
+    </w:p>
+    <w:p>
+      <w:pPr>
+        <w:spacing w:after="160"/>
+      </w:pPr>
+      <w:r>
+        <w:t xml:space="preserve">*Expect:* Oblique, restless, searching. Lines that imply rather than state. Harmonic ambiguity at every turn. Classic Shorter ellipsis.</w:t>
       </w:r>
     </w:p>
     <w:p>
@@ -5031,8 +6271,32 @@
         </w:rPr>
         <w:t xml:space="preserve">Recipe 3 — Zappa ferocity burst</w:t>
       </w:r>
-      <w:r>
-        <w:t xml:space="preserve"> ``` Chords:    Am7 | Am7 | Am7 | Am7 | Am7 | Am7 | Am7 | Am7 Writer:    frank_zappa Flavor:    Chromatic Motion:    +0.9 Tension:   +0.8 Variation: +0.8 ``` *Expect:* Dense, jagged, unpredictable. Maximum ferocity. Burst bars with 12+ events. The engine pushes hard against the static harmony. Open in Sibelius and check the note density per bar.</w:t>
+    </w:p>
+    <w:p>
+      <w:pPr>
+        <w:shd w:fill="F5F5F5"/>
+        <w:spacing w:after="120"/>
+      </w:pPr>
+      <w:r>
+        <w:rPr>
+          <w:rFonts w:ascii="Consolas" w:cs="Consolas" w:eastAsia="Consolas" w:hAnsi="Consolas"/>
+          <w:sz w:val="20"/>
+          <w:szCs w:val="20"/>
+        </w:rPr>
+        <w:t xml:space="preserve">Chords:    Am7 | Am7 | Am7 | Am7 | Am7 | Am7 | Am7 | Am7
+Writer:    frank_zappa
+Flavor:    Chromatic
+Motion:    +0.9
+Tension:   +0.8
+Variation: +0.8</w:t>
+      </w:r>
+    </w:p>
+    <w:p>
+      <w:pPr>
+        <w:spacing w:after="160"/>
+      </w:pPr>
+      <w:r>
+        <w:t xml:space="preserve">*Expect:* Dense, jagged, unpredictable. Maximum ferocity. Burst bars with 12+ events. The engine pushes hard against the static harmony. Open in Sibelius and check the note density per bar.</w:t>
       </w:r>
     </w:p>
     <w:p>
@@ -5046,8 +6310,32 @@
         </w:rPr>
         <w:t xml:space="preserve">Recipe 4 — Folk openness (Mitchell / Lyrical)</w:t>
       </w:r>
-      <w:r>
-        <w:t xml:space="preserve"> ``` Chords:    G/B | Cadd9 | D/F# | Em Writer:    joni_mitchell Flavor:    Lyrical Motion:    -0.2 Tension:   -0.6 Variation: -0.4 ``` *Expect:* Clear, open, natural arc. Quartal inner voices. Melody that floats above the changes rather than navigating them. Mitchell's open-tuning aesthetic in a standard notation context.</w:t>
+    </w:p>
+    <w:p>
+      <w:pPr>
+        <w:shd w:fill="F5F5F5"/>
+        <w:spacing w:after="120"/>
+      </w:pPr>
+      <w:r>
+        <w:rPr>
+          <w:rFonts w:ascii="Consolas" w:cs="Consolas" w:eastAsia="Consolas" w:hAnsi="Consolas"/>
+          <w:sz w:val="20"/>
+          <w:szCs w:val="20"/>
+        </w:rPr>
+        <w:t xml:space="preserve">Chords:    G/B | Cadd9 | D/F# | Em
+Writer:    joni_mitchell
+Flavor:    Lyrical
+Motion:    -0.2
+Tension:   -0.6
+Variation: -0.4</w:t>
+      </w:r>
+    </w:p>
+    <w:p>
+      <w:pPr>
+        <w:spacing w:after="160"/>
+      </w:pPr>
+      <w:r>
+        <w:t xml:space="preserve">*Expect:* Clear, open, natural arc. Quartal inner voices. Melody that floats above the changes rather than navigating them. Mitchell's open-tuning aesthetic in a standard notation context.</w:t>
       </w:r>
     </w:p>
     <w:p>
@@ -5061,8 +6349,32 @@
         </w:rPr>
         <w:t xml:space="preserve">Recipe 5 — Art rock unease (Radiohead / Angular)</w:t>
       </w:r>
-      <w:r>
-        <w:t xml:space="preserve"> ``` Chords:    Em9 | Cmaj7#11 | Bm7 | F#m Writer:    radiohead Flavor:    Angular Motion:    +0.4 Tension:   +0.6 Variation: +0.5 ``` *Expect:* Fragile, tense, art-rock bite. Metric unease in the inner voices. Melody that feels slightly off-kilter but always intentional.</w:t>
+    </w:p>
+    <w:p>
+      <w:pPr>
+        <w:shd w:fill="F5F5F5"/>
+        <w:spacing w:after="120"/>
+      </w:pPr>
+      <w:r>
+        <w:rPr>
+          <w:rFonts w:ascii="Consolas" w:cs="Consolas" w:eastAsia="Consolas" w:hAnsi="Consolas"/>
+          <w:sz w:val="20"/>
+          <w:szCs w:val="20"/>
+        </w:rPr>
+        <w:t xml:space="preserve">Chords:    Em9 | Cmaj7#11 | Bm7 | F#m
+Writer:    radiohead
+Flavor:    Angular
+Motion:    +0.4
+Tension:   +0.6
+Variation: +0.5</w:t>
+      </w:r>
+    </w:p>
+    <w:p>
+      <w:pPr>
+        <w:spacing w:after="160"/>
+      </w:pPr>
+      <w:r>
+        <w:t xml:space="preserve">*Expect:* Fragile, tense, art-rock bite. Metric unease in the inner voices. Melody that feels slightly off-kilter but always intentional.</w:t>
       </w:r>
     </w:p>
     <w:p>
@@ -5076,8 +6388,32 @@
         </w:rPr>
         <w:t xml:space="preserve">Recipe 6 — Coltrane cycles (Coltrane / Patterned)</w:t>
       </w:r>
-      <w:r>
-        <w:t xml:space="preserve"> ``` Chords:    Emaj7 | Cmaj7 | Abmaj7 | Emaj7 Writer:    john_coltrane  (harmonic voice) Flavor:    Patterned Motion:    +0.5 Tension:   +0.6 Variation: +0.3 ``` *Expect:* Cyclic, driven, interval-cell saturation. The patterned flavor suits Coltrane's tendency to repeat and develop interval cells across the Giant Steps cycle. Feels organized but relentless.</w:t>
+    </w:p>
+    <w:p>
+      <w:pPr>
+        <w:shd w:fill="F5F5F5"/>
+        <w:spacing w:after="120"/>
+      </w:pPr>
+      <w:r>
+        <w:rPr>
+          <w:rFonts w:ascii="Consolas" w:cs="Consolas" w:eastAsia="Consolas" w:hAnsi="Consolas"/>
+          <w:sz w:val="20"/>
+          <w:szCs w:val="20"/>
+        </w:rPr>
+        <w:t xml:space="preserve">Chords:    Emaj7 | Cmaj7 | Abmaj7 | Emaj7
+Writer:    john_coltrane  (harmonic voice)
+Flavor:    Patterned
+Motion:    +0.5
+Tension:   +0.6
+Variation: +0.3</w:t>
+      </w:r>
+    </w:p>
+    <w:p>
+      <w:pPr>
+        <w:spacing w:after="160"/>
+      </w:pPr>
+      <w:r>
+        <w:t xml:space="preserve">*Expect:* Cyclic, driven, interval-cell saturation. The patterned flavor suits Coltrane's tendency to repeat and develop interval cells across the Giant Steps cycle. Feels organized but relentless.</w:t>
       </w:r>
     </w:p>
     <w:p>
@@ -5117,8 +6453,32 @@
         </w:rPr>
         <w:t xml:space="preserve">Example 1 — Simple diatonic</w:t>
       </w:r>
-      <w:r>
-        <w:t xml:space="preserve"> ``` Chords:    Fm7 | Bb7 | Ebmaj7 | Abmaj7 Writer:    mccoy_tyner Flavor:    Patterned Motion:    0 Tension:   +0.1 Variation: +0.1 ``` *Generate:* Quartal m11/sus stacks, pentatonic melody colour, IV-rooted quartal over minor pedals. *Use when:* Modal jazz ballad or McCoy-era quartet comp under a static progression.</w:t>
+    </w:p>
+    <w:p>
+      <w:pPr>
+        <w:shd w:fill="F5F5F5"/>
+        <w:spacing w:after="120"/>
+      </w:pPr>
+      <w:r>
+        <w:rPr>
+          <w:rFonts w:ascii="Consolas" w:cs="Consolas" w:eastAsia="Consolas" w:hAnsi="Consolas"/>
+          <w:sz w:val="20"/>
+          <w:szCs w:val="20"/>
+        </w:rPr>
+        <w:t xml:space="preserve">Chords:    Fm7 | Bb7 | Ebmaj7 | Abmaj7
+Writer:    mccoy_tyner
+Flavor:    Patterned
+Motion:    0
+Tension:   +0.1
+Variation: +0.1</w:t>
+      </w:r>
+    </w:p>
+    <w:p>
+      <w:pPr>
+        <w:spacing w:after="160"/>
+      </w:pPr>
+      <w:r>
+        <w:t xml:space="preserve">*Generate:* Quartal m11/sus stacks, pentatonic melody colour, IV-rooted quartal over minor pedals. *Use when:* Modal jazz ballad or McCoy-era quartet comp under a static progression.</w:t>
       </w:r>
     </w:p>
     <w:p>
@@ -5132,8 +6492,32 @@
         </w:rPr>
         <w:t xml:space="preserve">Example 2 — Modal / ambiguous</w:t>
       </w:r>
-      <w:r>
-        <w:t xml:space="preserve"> ``` Chords:    Dm7 | G7alt | Cmaj7#11 | F#m7b5 Writer:    mccoy_tyner Flavor:    Angular Motion:    +0.3 Tension:   +0.35 Variation: -0.05 ``` *Generate:* More `mt:iv_quartal` device receipts, sharper stack movement, less Metheny-like float. *Use when:* You want Tyner tension without a functional ii–V–I story.</w:t>
+    </w:p>
+    <w:p>
+      <w:pPr>
+        <w:shd w:fill="F5F5F5"/>
+        <w:spacing w:after="120"/>
+      </w:pPr>
+      <w:r>
+        <w:rPr>
+          <w:rFonts w:ascii="Consolas" w:cs="Consolas" w:eastAsia="Consolas" w:hAnsi="Consolas"/>
+          <w:sz w:val="20"/>
+          <w:szCs w:val="20"/>
+        </w:rPr>
+        <w:t xml:space="preserve">Chords:    Dm7 | G7alt | Cmaj7#11 | F#m7b5
+Writer:    mccoy_tyner
+Flavor:    Angular
+Motion:    +0.3
+Tension:   +0.35
+Variation: -0.05</w:t>
+      </w:r>
+    </w:p>
+    <w:p>
+      <w:pPr>
+        <w:spacing w:after="160"/>
+      </w:pPr>
+      <w:r>
+        <w:t xml:space="preserve">*Generate:* More `mt:iv_quartal` device receipts, sharper stack movement, less Metheny-like float. *Use when:* You want Tyner tension without a functional ii–V–I story.</w:t>
       </w:r>
     </w:p>
     <w:p>
@@ -5147,8 +6531,29 @@
         </w:rPr>
         <w:t xml:space="preserve">Example 3 — Contrast (vs Pat Metheny)</w:t>
       </w:r>
-      <w:r>
-        <w:t xml:space="preserve"> ``` Chords:    (same as Example 1) Writer A:  pat_metheny Writer B:  mccoy_tyner ``` *Differs:* Metheny = Lydian float and ECM spacing; Tyner = locked quartal harmony bars (`mccoyTynerEffectiveHarmonyBars`), higher quartal/pentatonic diagnostic counts. Same chords, different effective harmony timeline.</w:t>
+    </w:p>
+    <w:p>
+      <w:pPr>
+        <w:shd w:fill="F5F5F5"/>
+        <w:spacing w:after="120"/>
+      </w:pPr>
+      <w:r>
+        <w:rPr>
+          <w:rFonts w:ascii="Consolas" w:cs="Consolas" w:eastAsia="Consolas" w:hAnsi="Consolas"/>
+          <w:sz w:val="20"/>
+          <w:szCs w:val="20"/>
+        </w:rPr>
+        <w:t xml:space="preserve">Chords:    (same as Example 1)
+Writer A:  pat_metheny
+Writer B:  mccoy_tyner</w:t>
+      </w:r>
+    </w:p>
+    <w:p>
+      <w:pPr>
+        <w:spacing w:after="160"/>
+      </w:pPr>
+      <w:r>
+        <w:t xml:space="preserve">*Differs:* Metheny = Lydian float and ECM spacing; Tyner = locked quartal harmony bars (`mccoyTynerEffectiveHarmonyBars`), higher quartal/pentatonic diagnostic counts. Same chords, different effective harmony timeline.</w:t>
       </w:r>
     </w:p>
     <w:p>
@@ -5171,8 +6576,32 @@
         </w:rPr>
         <w:t xml:space="preserve">Example 1 — Simple diatonic</w:t>
       </w:r>
-      <w:r>
-        <w:t xml:space="preserve"> ``` Chords:    Emadd9 | Emadd9/D | Gsus2 | Asus4 Writer:    sonic_youth Harmonic:  sonic_youth Flavor:    Angular Motion:    +0.5 Tension:   +0.4 ``` *Generate:* Sus/add9 field, low loop persistence, anti-metric riff profile, texture receipts on comp chords. *Use when:* Noise-rock sketch with alternate-tuning colour, not polished pop.</w:t>
+    </w:p>
+    <w:p>
+      <w:pPr>
+        <w:shd w:fill="F5F5F5"/>
+        <w:spacing w:after="120"/>
+      </w:pPr>
+      <w:r>
+        <w:rPr>
+          <w:rFonts w:ascii="Consolas" w:cs="Consolas" w:eastAsia="Consolas" w:hAnsi="Consolas"/>
+          <w:sz w:val="20"/>
+          <w:szCs w:val="20"/>
+        </w:rPr>
+        <w:t xml:space="preserve">Chords:    Emadd9 | Emadd9/D | Gsus2 | Asus4
+Writer:    sonic_youth
+Harmonic:  sonic_youth
+Flavor:    Angular
+Motion:    +0.5
+Tension:   +0.4</w:t>
+      </w:r>
+    </w:p>
+    <w:p>
+      <w:pPr>
+        <w:spacing w:after="160"/>
+      </w:pPr>
+      <w:r>
+        <w:t xml:space="preserve">*Generate:* Sus/add9 field, low loop persistence, anti-metric riff profile, texture receipts on comp chords. *Use when:* Noise-rock sketch with alternate-tuning colour, not polished pop.</w:t>
       </w:r>
     </w:p>
     <w:p>
@@ -5186,8 +6615,32 @@
         </w:rPr>
         <w:t xml:space="preserve">Example 2 — Modal / ambiguous</w:t>
       </w:r>
-      <w:r>
-        <w:t xml:space="preserve"> ``` Chords:    Cmaj7#11 | F#7sus4 | B7alt | Emadd9 Writer:    sonic_youth Harmonic:  sonic_youth Flavor:    Chromatic Motion:    +0.35 Tension:   +0.5 ``` *Generate:* More chromatic Slonimsky cell bias (`SY_SLON_01`), higher friction / `noise_wall` texture phases. *Use when:* Deliberately ugly harmony under a “pretty” lead sheet.</w:t>
+    </w:p>
+    <w:p>
+      <w:pPr>
+        <w:shd w:fill="F5F5F5"/>
+        <w:spacing w:after="120"/>
+      </w:pPr>
+      <w:r>
+        <w:rPr>
+          <w:rFonts w:ascii="Consolas" w:cs="Consolas" w:eastAsia="Consolas" w:hAnsi="Consolas"/>
+          <w:sz w:val="20"/>
+          <w:szCs w:val="20"/>
+        </w:rPr>
+        <w:t xml:space="preserve">Chords:    Cmaj7#11 | F#7sus4 | B7alt | Emadd9
+Writer:    sonic_youth
+Harmonic:  sonic_youth
+Flavor:    Chromatic
+Motion:    +0.35
+Tension:   +0.5</w:t>
+      </w:r>
+    </w:p>
+    <w:p>
+      <w:pPr>
+        <w:spacing w:after="160"/>
+      </w:pPr>
+      <w:r>
+        <w:t xml:space="preserve">*Generate:* More chromatic Slonimsky cell bias (`SY_SLON_01`), higher friction / `noise_wall` texture phases. *Use when:* Deliberately ugly harmony under a “pretty” lead sheet.</w:t>
       </w:r>
     </w:p>
     <w:p>
@@ -5201,8 +6654,29 @@
         </w:rPr>
         <w:t xml:space="preserve">Example 3 — Contrast (vs generic VRB fallback)</w:t>
       </w:r>
-      <w:r>
-        <w:t xml:space="preserve"> ``` Chords:    (same as Example 1) Writer:    wayne_shorter Harmonic:  (none)  vs  sonic_youth ``` *Differs:* Without `harmonicVoice: sonic_youth` the engine uses neutral planning; with it you get dedicated VRB (`voiceBundleRhythmAntiMetric: true`, angular/chromatic riff profile). Golden fixture proves measurable pitch/policy delta at same seed.</w:t>
+    </w:p>
+    <w:p>
+      <w:pPr>
+        <w:shd w:fill="F5F5F5"/>
+        <w:spacing w:after="120"/>
+      </w:pPr>
+      <w:r>
+        <w:rPr>
+          <w:rFonts w:ascii="Consolas" w:cs="Consolas" w:eastAsia="Consolas" w:hAnsi="Consolas"/>
+          <w:sz w:val="20"/>
+          <w:szCs w:val="20"/>
+        </w:rPr>
+        <w:t xml:space="preserve">Chords:    (same as Example 1)
+Writer:    wayne_shorter
+Harmonic:  (none)  vs  sonic_youth</w:t>
+      </w:r>
+    </w:p>
+    <w:p>
+      <w:pPr>
+        <w:spacing w:after="160"/>
+      </w:pPr>
+      <w:r>
+        <w:t xml:space="preserve">*Differs:* Without `harmonicVoice: sonic_youth` the engine uses neutral planning; with it you get dedicated VRB (`voiceBundleRhythmAntiMetric: true`, angular/chromatic riff profile). Golden fixture proves measurable pitch/policy delta at same seed.</w:t>
       </w:r>
     </w:p>
     <w:p>
@@ -5300,7 +6774,7 @@
         <w:ind w:left="360" w:hanging="260"/>
       </w:pPr>
       <w:r>
-        <w:t xml:space="preserve">â€¢ </w:t>
+        <w:t xml:space="preserve">• </w:t>
       </w:r>
       <w:r>
         <w:rPr>
@@ -5319,7 +6793,7 @@
         <w:ind w:left="360" w:hanging="260"/>
       </w:pPr>
       <w:r>
-        <w:t xml:space="preserve">â€¢ </w:t>
+        <w:t xml:space="preserve">• </w:t>
       </w:r>
       <w:r>
         <w:rPr>
@@ -5358,7 +6832,7 @@
         <w:ind w:left="360" w:hanging="260"/>
       </w:pPr>
       <w:r>
-        <w:t xml:space="preserve">â€¢ </w:t>
+        <w:t xml:space="preserve">• </w:t>
       </w:r>
       <w:r>
         <w:rPr>
@@ -5377,7 +6851,7 @@
         <w:ind w:left="360" w:hanging="260"/>
       </w:pPr>
       <w:r>
-        <w:t xml:space="preserve">â€¢ </w:t>
+        <w:t xml:space="preserve">• </w:t>
       </w:r>
       <w:r>
         <w:rPr>
@@ -5416,7 +6890,7 @@
         <w:ind w:left="360" w:hanging="260"/>
       </w:pPr>
       <w:r>
-        <w:t xml:space="preserve">â€¢ </w:t>
+        <w:t xml:space="preserve">• </w:t>
       </w:r>
       <w:r>
         <w:rPr>
@@ -5440,16 +6914,24 @@
         </w:rPr>
         <w:t xml:space="preserve">Three-section progression (4 bars each):</w:t>
       </w:r>
-      <w:r>
-        <w:t xml:space="preserve"> ``` Section A: Dm7   | Dm7   | Dm7   | Dm7 Section B: AbMaj7 | AbMaj7 | AbMaj7 | AbMaj7 Section C: Em7(b5) | Em7(b5) | Em7(b5) | Em7(b5)</w:t>
-      </w:r>
-    </w:p>
-    <w:p>
-      <w:pPr>
-        <w:spacing w:after="160"/>
-      </w:pPr>
-      <w:r>
-        <w:t xml:space="preserve">Writer:    sonic_youth Harmonic:  sonic_youth Seed:      75001 (change per section for variation today) ```</w:t>
+    </w:p>
+    <w:p>
+      <w:pPr>
+        <w:shd w:fill="F5F5F5"/>
+        <w:spacing w:after="120"/>
+      </w:pPr>
+      <w:r>
+        <w:rPr>
+          <w:rFonts w:ascii="Consolas" w:cs="Consolas" w:eastAsia="Consolas" w:hAnsi="Consolas"/>
+          <w:sz w:val="20"/>
+          <w:szCs w:val="20"/>
+        </w:rPr>
+        <w:t xml:space="preserve">Section A: Dm7   | Dm7   | Dm7   | Dm7
+Section B: AbMaj7 | AbMaj7 | AbMaj7 | AbMaj7
+Section C: Em7(b5) | Em7(b5) | Em7(b5) | Em7(b5)
+Writer:    sonic_youth
+Harmonic:  sonic_youth
+Seed:      75001 (change per section for variation today)</w:t>
       </w:r>
     </w:p>
     <w:tbl>
@@ -5826,8 +7308,30 @@
         </w:rPr>
         <w:t xml:space="preserve">Example 1 — Simple diatonic</w:t>
       </w:r>
-      <w:r>
-        <w:t xml:space="preserve"> ``` Chords:    Am7 | D7 | Gmaj7 | Cmaj7 Harmonic:  wes_montgomery Flavor:    Lyrical Chromatic: Subtle ``` *Generate:* Warm octave-leaning line, bebop-blues riff cells, higher `octaveDisplacementTolerance` than funk grid voices. *Use when:* Lyrical GBD duo, not Nile pocket.</w:t>
+    </w:p>
+    <w:p>
+      <w:pPr>
+        <w:shd w:fill="F5F5F5"/>
+        <w:spacing w:after="120"/>
+      </w:pPr>
+      <w:r>
+        <w:rPr>
+          <w:rFonts w:ascii="Consolas" w:cs="Consolas" w:eastAsia="Consolas" w:hAnsi="Consolas"/>
+          <w:sz w:val="20"/>
+          <w:szCs w:val="20"/>
+        </w:rPr>
+        <w:t xml:space="preserve">Chords:    Am7 | D7 | Gmaj7 | Cmaj7
+Harmonic:  wes_montgomery
+Flavor:    Lyrical
+Chromatic: Subtle</w:t>
+      </w:r>
+    </w:p>
+    <w:p>
+      <w:pPr>
+        <w:spacing w:after="160"/>
+      </w:pPr>
+      <w:r>
+        <w:t xml:space="preserve">*Generate:* Warm octave-leaning line, bebop-blues riff cells, higher `octaveDisplacementTolerance` than funk grid voices. *Use when:* Lyrical GBD duo, not Nile pocket.</w:t>
       </w:r>
     </w:p>
     <w:p>
@@ -5841,8 +7345,30 @@
         </w:rPr>
         <w:t xml:space="preserve">Example 2 — Modal / ambiguous</w:t>
       </w:r>
-      <w:r>
-        <w:t xml:space="preserve"> ``` Chords:    E7alt | A7#11 | Dm9 | G7sus Harmonic:  wes_montgomery Flavor:    Riff Motion:    +0.35 ``` *Generate:* Riff-forward 8th grid, more bar-identity persistence than Holdsworth. *Use when:* Blues-modal changes with Wes-style hook repetition.</w:t>
+    </w:p>
+    <w:p>
+      <w:pPr>
+        <w:shd w:fill="F5F5F5"/>
+        <w:spacing w:after="120"/>
+      </w:pPr>
+      <w:r>
+        <w:rPr>
+          <w:rFonts w:ascii="Consolas" w:cs="Consolas" w:eastAsia="Consolas" w:hAnsi="Consolas"/>
+          <w:sz w:val="20"/>
+          <w:szCs w:val="20"/>
+        </w:rPr>
+        <w:t xml:space="preserve">Chords:    E7alt | A7#11 | Dm9 | G7sus
+Harmonic:  wes_montgomery
+Flavor:    Riff
+Motion:    +0.35</w:t>
+      </w:r>
+    </w:p>
+    <w:p>
+      <w:pPr>
+        <w:spacing w:after="160"/>
+      </w:pPr>
+      <w:r>
+        <w:t xml:space="preserve">*Generate:* Riff-forward 8th grid, more bar-identity persistence than Holdsworth. *Use when:* Blues-modal changes with Wes-style hook repetition.</w:t>
       </w:r>
     </w:p>
     <w:p>
@@ -5856,8 +7382,29 @@
         </w:rPr>
         <w:t xml:space="preserve">Example 3 — Contrast (vs Nile Rodgers)</w:t>
       </w:r>
-      <w:r>
-        <w:t xml:space="preserve"> ``` Chords:    (same as Example 1) Harmonic A: nile_rodgers Harmonic B: wes_montgomery ``` *Differs:* Nile = 16th funk top-note grid; Wes = lyrical register mean shift + octave policy (`WM_MELO_01` receipt). Same seed produces different guitar MIDI stream.</w:t>
+    </w:p>
+    <w:p>
+      <w:pPr>
+        <w:shd w:fill="F5F5F5"/>
+        <w:spacing w:after="120"/>
+      </w:pPr>
+      <w:r>
+        <w:rPr>
+          <w:rFonts w:ascii="Consolas" w:cs="Consolas" w:eastAsia="Consolas" w:hAnsi="Consolas"/>
+          <w:sz w:val="20"/>
+          <w:szCs w:val="20"/>
+        </w:rPr>
+        <w:t xml:space="preserve">Chords:    (same as Example 1)
+Harmonic A: nile_rodgers
+Harmonic B: wes_montgomery</w:t>
+      </w:r>
+    </w:p>
+    <w:p>
+      <w:pPr>
+        <w:spacing w:after="160"/>
+      </w:pPr>
+      <w:r>
+        <w:t xml:space="preserve">*Differs:* Nile = 16th funk top-note grid; Wes = lyrical register mean shift + octave policy (`WM_MELO_01` receipt). Same seed produces different guitar MIDI stream.</w:t>
       </w:r>
     </w:p>
     <w:p>
@@ -5880,8 +7427,30 @@
         </w:rPr>
         <w:t xml:space="preserve">Example 1 — Simple diatonic</w:t>
       </w:r>
-      <w:r>
-        <w:t xml:space="preserve"> ``` Chords:    Cmaj7 | Am7 | Dm7 | G7 Harmonic:  joe_pass Flavor:    Lyrical Chromatic: Subtle ``` *Generate:* Fingerstyle chord-melody approach tones, high `chromaticBudget` on VRB, stepwise targets on strong beats. *Use when:* Solo guitar+bass lead sheet reading.</w:t>
+    </w:p>
+    <w:p>
+      <w:pPr>
+        <w:shd w:fill="F5F5F5"/>
+        <w:spacing w:after="120"/>
+      </w:pPr>
+      <w:r>
+        <w:rPr>
+          <w:rFonts w:ascii="Consolas" w:cs="Consolas" w:eastAsia="Consolas" w:hAnsi="Consolas"/>
+          <w:sz w:val="20"/>
+          <w:szCs w:val="20"/>
+        </w:rPr>
+        <w:t xml:space="preserve">Chords:    Cmaj7 | Am7 | Dm7 | G7
+Harmonic:  joe_pass
+Flavor:    Lyrical
+Chromatic: Subtle</w:t>
+      </w:r>
+    </w:p>
+    <w:p>
+      <w:pPr>
+        <w:spacing w:after="160"/>
+      </w:pPr>
+      <w:r>
+        <w:t xml:space="preserve">*Generate:* Fingerstyle chord-melody approach tones, high `chromaticBudget` on VRB, stepwise targets on strong beats. *Use when:* Solo guitar+bass lead sheet reading.</w:t>
       </w:r>
     </w:p>
     <w:p>
@@ -5895,8 +7464,30 @@
         </w:rPr>
         <w:t xml:space="preserve">Example 2 — Modal / ambiguous</w:t>
       </w:r>
-      <w:r>
-        <w:t xml:space="preserve"> ``` Chords:    F#m7b5 | B7alt | Em9 | A13 Harmonic:  joe_pass Flavor:    Chromatic Motion:    +0.18 ``` *Generate:* Chromatic enclosures between chord tones; more outside colour than Larry Carlton default. *Use when:* Bebop turnaround over altered dominants.</w:t>
+    </w:p>
+    <w:p>
+      <w:pPr>
+        <w:shd w:fill="F5F5F5"/>
+        <w:spacing w:after="120"/>
+      </w:pPr>
+      <w:r>
+        <w:rPr>
+          <w:rFonts w:ascii="Consolas" w:cs="Consolas" w:eastAsia="Consolas" w:hAnsi="Consolas"/>
+          <w:sz w:val="20"/>
+          <w:szCs w:val="20"/>
+        </w:rPr>
+        <w:t xml:space="preserve">Chords:    F#m7b5 | B7alt | Em9 | A13
+Harmonic:  joe_pass
+Flavor:    Chromatic
+Motion:    +0.18</w:t>
+      </w:r>
+    </w:p>
+    <w:p>
+      <w:pPr>
+        <w:spacing w:after="160"/>
+      </w:pPr>
+      <w:r>
+        <w:t xml:space="preserve">*Generate:* Chromatic enclosures between chord tones; more outside colour than Larry Carlton default. *Use when:* Bebop turnaround over altered dominants.</w:t>
       </w:r>
     </w:p>
     <w:p>
@@ -5910,8 +7501,29 @@
         </w:rPr>
         <w:t xml:space="preserve">Example 3 — Contrast (vs Larry Carlton)</w:t>
       </w:r>
-      <w:r>
-        <w:t xml:space="preserve"> ``` Chords:    (same as Example 1) Harmonic A: larry_carlton Harmonic B: joe_pass ``` *Differs:* Larry = fusion lyrical grid; Joe = higher chromatic budget (`JP_MELO_01`), chord-melody fingerprint receipts. Distinct golden vs Larry at same seed.</w:t>
+    </w:p>
+    <w:p>
+      <w:pPr>
+        <w:shd w:fill="F5F5F5"/>
+        <w:spacing w:after="120"/>
+      </w:pPr>
+      <w:r>
+        <w:rPr>
+          <w:rFonts w:ascii="Consolas" w:cs="Consolas" w:eastAsia="Consolas" w:hAnsi="Consolas"/>
+          <w:sz w:val="20"/>
+          <w:szCs w:val="20"/>
+        </w:rPr>
+        <w:t xml:space="preserve">Chords:    (same as Example 1)
+Harmonic A: larry_carlton
+Harmonic B: joe_pass</w:t>
+      </w:r>
+    </w:p>
+    <w:p>
+      <w:pPr>
+        <w:spacing w:after="160"/>
+      </w:pPr>
+      <w:r>
+        <w:t xml:space="preserve">*Differs:* Larry = fusion lyrical grid; Joe = higher chromatic budget (`JP_MELO_01`), chord-melody fingerprint receipts. Distinct golden vs Larry at same seed.</w:t>
       </w:r>
     </w:p>
     <w:p>
@@ -5934,8 +7546,30 @@
         </w:rPr>
         <w:t xml:space="preserve">Example 1 — Simple diatonic</w:t>
       </w:r>
-      <w:r>
-        <w:t xml:space="preserve"> ``` Chords:    Cmaj7 | Bm7 | Am7 | Gmaj7 Harmonic:  allan_holdsworth Flavor:    Chromatic Chromatic: Prominent ``` *Generate:* Floating legato outside lines, wide leaps (`maxLeapSemitones` 14), low bar-identity persistence. *Use when:* Fusion pad under static maj7 vamp.</w:t>
+    </w:p>
+    <w:p>
+      <w:pPr>
+        <w:shd w:fill="F5F5F5"/>
+        <w:spacing w:after="120"/>
+      </w:pPr>
+      <w:r>
+        <w:rPr>
+          <w:rFonts w:ascii="Consolas" w:cs="Consolas" w:eastAsia="Consolas" w:hAnsi="Consolas"/>
+          <w:sz w:val="20"/>
+          <w:szCs w:val="20"/>
+        </w:rPr>
+        <w:t xml:space="preserve">Chords:    Cmaj7 | Bm7 | Am7 | Gmaj7
+Harmonic:  allan_holdsworth
+Flavor:    Chromatic
+Chromatic: Prominent</w:t>
+      </w:r>
+    </w:p>
+    <w:p>
+      <w:pPr>
+        <w:spacing w:after="160"/>
+      </w:pPr>
+      <w:r>
+        <w:t xml:space="preserve">*Generate:* Floating legato outside lines, wide leaps (`maxLeapSemitones` 14), low bar-identity persistence. *Use when:* Fusion pad under static maj7 vamp.</w:t>
       </w:r>
     </w:p>
     <w:p>
@@ -5949,8 +7583,30 @@
         </w:rPr>
         <w:t xml:space="preserve">Example 2 — Modal / ambiguous</w:t>
       </w:r>
-      <w:r>
-        <w:t xml:space="preserve"> ``` Chords:    Dm7b5 | G7alt | Cbmaj7 | F#7 Harmonic:  allan_holdsworth Flavor:    Angular Motion:    +0.4 ``` *Generate:* Dense chromatic cells, behind-grid rhythmic placement. *Use when:* Deliberately non-groove outside solo texture.</w:t>
+    </w:p>
+    <w:p>
+      <w:pPr>
+        <w:shd w:fill="F5F5F5"/>
+        <w:spacing w:after="120"/>
+      </w:pPr>
+      <w:r>
+        <w:rPr>
+          <w:rFonts w:ascii="Consolas" w:cs="Consolas" w:eastAsia="Consolas" w:hAnsi="Consolas"/>
+          <w:sz w:val="20"/>
+          <w:szCs w:val="20"/>
+        </w:rPr>
+        <w:t xml:space="preserve">Chords:    Dm7b5 | G7alt | Cbmaj7 | F#7
+Harmonic:  allan_holdsworth
+Flavor:    Angular
+Motion:    +0.4</w:t>
+      </w:r>
+    </w:p>
+    <w:p>
+      <w:pPr>
+        <w:spacing w:after="160"/>
+      </w:pPr>
+      <w:r>
+        <w:t xml:space="preserve">*Generate:* Dense chromatic cells, behind-grid rhythmic placement. *Use when:* Deliberately non-groove outside solo texture.</w:t>
       </w:r>
     </w:p>
     <w:p>
@@ -5964,8 +7620,29 @@
         </w:rPr>
         <w:t xml:space="preserve">Example 3 — Contrast (vs Scott Henderson)</w:t>
       </w:r>
-      <w:r>
-        <w:t xml:space="preserve"> ``` Chords:    (same as Example 1) Harmonic A: scott_henderson Harmonic B: allan_holdsworth ``` *Differs:* Henderson = 16th riff grid + blues chromaticism; Holdsworth = floating legato, higher chromatic budget, lower loop persistence. Cross-golden fixture locks separation.</w:t>
+    </w:p>
+    <w:p>
+      <w:pPr>
+        <w:shd w:fill="F5F5F5"/>
+        <w:spacing w:after="120"/>
+      </w:pPr>
+      <w:r>
+        <w:rPr>
+          <w:rFonts w:ascii="Consolas" w:cs="Consolas" w:eastAsia="Consolas" w:hAnsi="Consolas"/>
+          <w:sz w:val="20"/>
+          <w:szCs w:val="20"/>
+        </w:rPr>
+        <w:t xml:space="preserve">Chords:    (same as Example 1)
+Harmonic A: scott_henderson
+Harmonic B: allan_holdsworth</w:t>
+      </w:r>
+    </w:p>
+    <w:p>
+      <w:pPr>
+        <w:spacing w:after="160"/>
+      </w:pPr>
+      <w:r>
+        <w:t xml:space="preserve">*Differs:* Henderson = 16th riff grid + blues chromaticism; Holdsworth = floating legato, higher chromatic budget, lower loop persistence. Cross-golden fixture locks separation.</w:t>
       </w:r>
     </w:p>
     <w:p>
@@ -5988,8 +7665,29 @@
         </w:rPr>
         <w:t xml:space="preserve">Example 1 — Simple diatonic</w:t>
       </w:r>
-      <w:r>
-        <w:t xml:space="preserve"> ``` Chords:    G7 | C7 | F7 | Bb7 Harmonic:  scott_henderson Flavor:    Angular ``` *Generate:* Angular fusion riff hooks, grounded 16th feel, staccato attack pockets. *Use when:* Blues-fusion duo comp.</w:t>
+    </w:p>
+    <w:p>
+      <w:pPr>
+        <w:shd w:fill="F5F5F5"/>
+        <w:spacing w:after="120"/>
+      </w:pPr>
+      <w:r>
+        <w:rPr>
+          <w:rFonts w:ascii="Consolas" w:cs="Consolas" w:eastAsia="Consolas" w:hAnsi="Consolas"/>
+          <w:sz w:val="20"/>
+          <w:szCs w:val="20"/>
+        </w:rPr>
+        <w:t xml:space="preserve">Chords:    G7 | C7 | F7 | Bb7
+Harmonic:  scott_henderson
+Flavor:    Angular</w:t>
+      </w:r>
+    </w:p>
+    <w:p>
+      <w:pPr>
+        <w:spacing w:after="160"/>
+      </w:pPr>
+      <w:r>
+        <w:t xml:space="preserve">*Generate:* Angular fusion riff hooks, grounded 16th feel, staccato attack pockets. *Use when:* Blues-fusion duo comp.</w:t>
       </w:r>
     </w:p>
     <w:p>
@@ -6003,8 +7701,30 @@
         </w:rPr>
         <w:t xml:space="preserve">Example 2 — Modal / ambiguous</w:t>
       </w:r>
-      <w:r>
-        <w:t xml:space="preserve"> ``` Chords:    Em7 | A7alt | Dmaj7#11 | G7alt Harmonic:  scott_henderson Flavor:    Riff Motion:    +0.55 ``` *Generate:* Higher bar-identity persistence, riff-cell repetition (`SH_RIF_01`). *Use when:* Loop-based fusion head over ambiguous dominants.</w:t>
+    </w:p>
+    <w:p>
+      <w:pPr>
+        <w:shd w:fill="F5F5F5"/>
+        <w:spacing w:after="120"/>
+      </w:pPr>
+      <w:r>
+        <w:rPr>
+          <w:rFonts w:ascii="Consolas" w:cs="Consolas" w:eastAsia="Consolas" w:hAnsi="Consolas"/>
+          <w:sz w:val="20"/>
+          <w:szCs w:val="20"/>
+        </w:rPr>
+        <w:t xml:space="preserve">Chords:    Em7 | A7alt | Dmaj7#11 | G7alt
+Harmonic:  scott_henderson
+Flavor:    Riff
+Motion:    +0.55</w:t>
+      </w:r>
+    </w:p>
+    <w:p>
+      <w:pPr>
+        <w:spacing w:after="160"/>
+      </w:pPr>
+      <w:r>
+        <w:t xml:space="preserve">*Generate:* Higher bar-identity persistence, riff-cell repetition (`SH_RIF_01`). *Use when:* Loop-based fusion head over ambiguous dominants.</w:t>
       </w:r>
     </w:p>
     <w:p>
@@ -6018,8 +7738,29 @@
         </w:rPr>
         <w:t xml:space="preserve">Example 3 — Contrast (vs Allan Holdsworth)</w:t>
       </w:r>
-      <w:r>
-        <w:t xml:space="preserve"> ``` Chords:    (same as Example 1) Harmonic A: allan_holdsworth Harmonic B: scott_henderson ``` *Differs:* Holdsworth floats outside time; Henderson anchors 16th subdivision grid and riff loops. Same chords — Henderson reads as “fusion blues,” Holdsworth as “outside legato.”</w:t>
+    </w:p>
+    <w:p>
+      <w:pPr>
+        <w:shd w:fill="F5F5F5"/>
+        <w:spacing w:after="120"/>
+      </w:pPr>
+      <w:r>
+        <w:rPr>
+          <w:rFonts w:ascii="Consolas" w:cs="Consolas" w:eastAsia="Consolas" w:hAnsi="Consolas"/>
+          <w:sz w:val="20"/>
+          <w:szCs w:val="20"/>
+        </w:rPr>
+        <w:t xml:space="preserve">Chords:    (same as Example 1)
+Harmonic A: allan_holdsworth
+Harmonic B: scott_henderson</w:t>
+      </w:r>
+    </w:p>
+    <w:p>
+      <w:pPr>
+        <w:spacing w:after="160"/>
+      </w:pPr>
+      <w:r>
+        <w:t xml:space="preserve">*Differs:* Holdsworth floats outside time; Henderson anchors 16th subdivision grid and riff loops. Same chords — Henderson reads as “fusion blues,” Holdsworth as “outside legato.”</w:t>
       </w:r>
     </w:p>
     <w:p>
@@ -6050,8 +7791,32 @@
         </w:rPr>
         <w:t xml:space="preserve">Tension build through sections:</w:t>
       </w:r>
-      <w:r>
-        <w:t xml:space="preserve"> ``` Intro:      Pin Lyrical · Avoid Chromatic Verse:      Pin Lyrical Pre-chorus: Unpin · Allow Angular Chorus:     Pin Angular · Avoid Lyrical Bridge:     Pin Chromatic Outro:      Pin Lyrical ``` *Result:* Composition starts settled and open, builds through restlessness into maximum tension at the bridge, then resolves back to the opening character.</w:t>
+    </w:p>
+    <w:p>
+      <w:pPr>
+        <w:shd w:fill="F5F5F5"/>
+        <w:spacing w:after="120"/>
+      </w:pPr>
+      <w:r>
+        <w:rPr>
+          <w:rFonts w:ascii="Consolas" w:cs="Consolas" w:eastAsia="Consolas" w:hAnsi="Consolas"/>
+          <w:sz w:val="20"/>
+          <w:szCs w:val="20"/>
+        </w:rPr>
+        <w:t xml:space="preserve">Intro:      Pin Lyrical · Avoid Chromatic
+Verse:      Pin Lyrical
+Pre-chorus: Unpin · Allow Angular
+Chorus:     Pin Angular · Avoid Lyrical
+Bridge:     Pin Chromatic
+Outro:      Pin Lyrical</w:t>
+      </w:r>
+    </w:p>
+    <w:p>
+      <w:pPr>
+        <w:spacing w:after="160"/>
+      </w:pPr>
+      <w:r>
+        <w:t xml:space="preserve">*Result:* Composition starts settled and open, builds through restlessness into maximum tension at the bridge, then resolves back to the opening character.</w:t>
       </w:r>
     </w:p>
     <w:p>
@@ -6065,8 +7830,28 @@
         </w:rPr>
         <w:t xml:space="preserve">Contrast arc (AABA form):</w:t>
       </w:r>
-      <w:r>
-        <w:t xml:space="preserve"> ``` A sections: Pin Lyrical B section:  Pin Angular · Avoid Lyrical ``` *Result:* Classic AABA contrast — the bridge feels genuinely different, not just a different key.</w:t>
+    </w:p>
+    <w:p>
+      <w:pPr>
+        <w:shd w:fill="F5F5F5"/>
+        <w:spacing w:after="120"/>
+      </w:pPr>
+      <w:r>
+        <w:rPr>
+          <w:rFonts w:ascii="Consolas" w:cs="Consolas" w:eastAsia="Consolas" w:hAnsi="Consolas"/>
+          <w:sz w:val="20"/>
+          <w:szCs w:val="20"/>
+        </w:rPr>
+        <w:t xml:space="preserve">A sections: Pin Lyrical
+B section:  Pin Angular · Avoid Lyrical</w:t>
+      </w:r>
+    </w:p>
+    <w:p>
+      <w:pPr>
+        <w:spacing w:after="160"/>
+      </w:pPr>
+      <w:r>
+        <w:t xml:space="preserve">*Result:* Classic AABA contrast — the bridge feels genuinely different, not just a different key.</w:t>
       </w:r>
     </w:p>
     <w:p>
@@ -6089,8 +7874,33 @@
         </w:rPr>
         <w:t xml:space="preserve">Recipe 1 — Thad Jones swing</w:t>
       </w:r>
-      <w:r>
-        <w:t xml:space="preserve"> ``` Chords:       Bbmaj7 | Gm7 | Cm7 | F7 Voice:        thad_jones Flavor:       Lyrical Section Role: Lead Cohesion:     +0.6 Harmonic Grip: +0.5 Preset:       Orchestral ``` *Expect:* Warm, swinging, full ensemble. Lead section carries the melody, inner sections fill with characteristic Thad Jones voicings.</w:t>
+    </w:p>
+    <w:p>
+      <w:pPr>
+        <w:shd w:fill="F5F5F5"/>
+        <w:spacing w:after="120"/>
+      </w:pPr>
+      <w:r>
+        <w:rPr>
+          <w:rFonts w:ascii="Consolas" w:cs="Consolas" w:eastAsia="Consolas" w:hAnsi="Consolas"/>
+          <w:sz w:val="20"/>
+          <w:szCs w:val="20"/>
+        </w:rPr>
+        <w:t xml:space="preserve">Chords:       Bbmaj7 | Gm7 | Cm7 | F7
+Voice:        thad_jones
+Flavor:       Lyrical
+Section Role: Lead
+Cohesion:     +0.6
+Harmonic Grip: +0.5
+Preset:       Orchestral</w:t>
+      </w:r>
+    </w:p>
+    <w:p>
+      <w:pPr>
+        <w:spacing w:after="160"/>
+      </w:pPr>
+      <w:r>
+        <w:t xml:space="preserve">*Expect:* Warm, swinging, full ensemble. Lead section carries the melody, inner sections fill with characteristic Thad Jones voicings.</w:t>
       </w:r>
     </w:p>
     <w:p>
@@ -6104,8 +7914,33 @@
         </w:rPr>
         <w:t xml:space="preserve">Recipe 2 — Maria Schneider impressionist</w:t>
       </w:r>
-      <w:r>
-        <w:t xml:space="preserve"> ``` Chords:       Emaj7#11 | F#m9 | Dmaj7 | Amaj7 Voice:        maria_schneider Flavor:       Patterned Section Role: Support Cohesion:     +0.3 Harmonic Grip: +0.7 Preset:       Orchestral ``` *Expect:* Spacious, layered, floating. Wide register spread. Sections that color rather than state. ECM-adjacent big band writing.</w:t>
+    </w:p>
+    <w:p>
+      <w:pPr>
+        <w:shd w:fill="F5F5F5"/>
+        <w:spacing w:after="120"/>
+      </w:pPr>
+      <w:r>
+        <w:rPr>
+          <w:rFonts w:ascii="Consolas" w:cs="Consolas" w:eastAsia="Consolas" w:hAnsi="Consolas"/>
+          <w:sz w:val="20"/>
+          <w:szCs w:val="20"/>
+        </w:rPr>
+        <w:t xml:space="preserve">Chords:       Emaj7#11 | F#m9 | Dmaj7 | Amaj7
+Voice:        maria_schneider
+Flavor:       Patterned
+Section Role: Support
+Cohesion:     +0.3
+Harmonic Grip: +0.7
+Preset:       Orchestral</w:t>
+      </w:r>
+    </w:p>
+    <w:p>
+      <w:pPr>
+        <w:spacing w:after="160"/>
+      </w:pPr>
+      <w:r>
+        <w:t xml:space="preserve">*Expect:* Spacious, layered, floating. Wide register spread. Sections that color rather than state. ECM-adjacent big band writing.</w:t>
       </w:r>
     </w:p>
     <w:p>
@@ -6119,8 +7954,32 @@
         </w:rPr>
         <w:t xml:space="preserve">Recipe 3 — Ferocious fusion BB</w:t>
       </w:r>
-      <w:r>
-        <w:t xml:space="preserve"> ``` Chords:       E7#9 | Bb7#11 | A7alt | D7#9 Flavor:       Angular Section Role: Counter Cohesion:     -0.2 Harmonic Grip: +0.8 Preset:       Fusion ``` *Expect:* Jagged, aggressive, dense. Counter-melodic lines fighting each other. High harmonic grip means the engine stays close to the altered chord tones even while pushing outside.</w:t>
+    </w:p>
+    <w:p>
+      <w:pPr>
+        <w:shd w:fill="F5F5F5"/>
+        <w:spacing w:after="120"/>
+      </w:pPr>
+      <w:r>
+        <w:rPr>
+          <w:rFonts w:ascii="Consolas" w:cs="Consolas" w:eastAsia="Consolas" w:hAnsi="Consolas"/>
+          <w:sz w:val="20"/>
+          <w:szCs w:val="20"/>
+        </w:rPr>
+        <w:t xml:space="preserve">Chords:       E7#9 | Bb7#11 | A7alt | D7#9
+Flavor:       Angular
+Section Role: Counter
+Cohesion:     -0.2
+Harmonic Grip: +0.8
+Preset:       Fusion</w:t>
+      </w:r>
+    </w:p>
+    <w:p>
+      <w:pPr>
+        <w:spacing w:after="160"/>
+      </w:pPr>
+      <w:r>
+        <w:t xml:space="preserve">*Expect:* Jagged, aggressive, dense. Counter-melodic lines fighting each other. High harmonic grip means the engine stays close to the altered chord tones even while pushing outside.</w:t>
       </w:r>
     </w:p>
     <w:p>
@@ -6134,8 +7993,33 @@
         </w:rPr>
         <w:t xml:space="preserve">Recipe 4 — Bebop head</w:t>
       </w:r>
-      <w:r>
-        <w:t xml:space="preserve"> ``` Chords:       Dm7 | G7alt | Cmaj7 | A7b9 | Dm7 | G7 | Cmaj7 | Cmaj7 Voice:        count_basie  (or oliver_nelson) Flavor:       Chromatic Section Role: Lead Cohesion:     +0.8 Harmonic Grip: +0.6 Preset:       Bebop ``` *Expect:* Fast, chromatic, bebop-flavored melody in the lead section with characteristic bebop inner voice movement underneath.</w:t>
+    </w:p>
+    <w:p>
+      <w:pPr>
+        <w:shd w:fill="F5F5F5"/>
+        <w:spacing w:after="120"/>
+      </w:pPr>
+      <w:r>
+        <w:rPr>
+          <w:rFonts w:ascii="Consolas" w:cs="Consolas" w:eastAsia="Consolas" w:hAnsi="Consolas"/>
+          <w:sz w:val="20"/>
+          <w:szCs w:val="20"/>
+        </w:rPr>
+        <w:t xml:space="preserve">Chords:       Dm7 | G7alt | Cmaj7 | A7b9 | Dm7 | G7 | Cmaj7 | Cmaj7
+Voice:        count_basie  (or oliver_nelson)
+Flavor:       Chromatic
+Section Role: Lead
+Cohesion:     +0.8
+Harmonic Grip: +0.6
+Preset:       Bebop</w:t>
+      </w:r>
+    </w:p>
+    <w:p>
+      <w:pPr>
+        <w:spacing w:after="160"/>
+      </w:pPr>
+      <w:r>
+        <w:t xml:space="preserve">*Expect:* Fast, chromatic, bebop-flavored melody in the lead section with characteristic bebop inner voice movement underneath.</w:t>
       </w:r>
     </w:p>
     <w:p>
@@ -6158,8 +8042,33 @@
         </w:rPr>
         <w:t xml:space="preserve">Recipe 1 — Bartok tension</w:t>
       </w:r>
-      <w:r>
-        <w:t xml:space="preserve"> ``` Chords:    Cm | F#m | Ebm | Am Voice:     bartok Flavor:    Angular Texture Role: Counterpoint Voice Independence: +0.8 Register Spread: +0.6 Preset:    Modern ``` *Expect:* Four independent voices, each moving against the others. Chromatic cluster harmony. Eastern European modal color. High rhythmic and melodic independence.</w:t>
+    </w:p>
+    <w:p>
+      <w:pPr>
+        <w:shd w:fill="F5F5F5"/>
+        <w:spacing w:after="120"/>
+      </w:pPr>
+      <w:r>
+        <w:rPr>
+          <w:rFonts w:ascii="Consolas" w:cs="Consolas" w:eastAsia="Consolas" w:hAnsi="Consolas"/>
+          <w:sz w:val="20"/>
+          <w:szCs w:val="20"/>
+        </w:rPr>
+        <w:t xml:space="preserve">Chords:    Cm | F#m | Ebm | Am
+Voice:     bartok
+Flavor:    Angular
+Texture Role: Counterpoint
+Voice Independence: +0.8
+Register Spread: +0.6
+Preset:    Modern</w:t>
+      </w:r>
+    </w:p>
+    <w:p>
+      <w:pPr>
+        <w:spacing w:after="160"/>
+      </w:pPr>
+      <w:r>
+        <w:t xml:space="preserve">*Expect:* Four independent voices, each moving against the others. Chromatic cluster harmony. Eastern European modal color. High rhythmic and melodic independence.</w:t>
       </w:r>
     </w:p>
     <w:p>
@@ -6173,8 +8082,33 @@
         </w:rPr>
         <w:t xml:space="preserve">Recipe 2 — Arvo Pärt stillness</w:t>
       </w:r>
-      <w:r>
-        <w:t xml:space="preserve"> ``` Chords:    Amaj | E | F#m | Amaj Voice:     part Flavor:    Lyrical Texture Role: Melody Voice Independence: -0.6 Register Spread: -0.3 Preset:    Minimal ``` *Expect:* Sparse, pure, tintinnabuli-adjacent. The melody voice sings a simple line while the other voices move in slow, consonant support. Silence is structural.</w:t>
+    </w:p>
+    <w:p>
+      <w:pPr>
+        <w:shd w:fill="F5F5F5"/>
+        <w:spacing w:after="120"/>
+      </w:pPr>
+      <w:r>
+        <w:rPr>
+          <w:rFonts w:ascii="Consolas" w:cs="Consolas" w:eastAsia="Consolas" w:hAnsi="Consolas"/>
+          <w:sz w:val="20"/>
+          <w:szCs w:val="20"/>
+        </w:rPr>
+        <w:t xml:space="preserve">Chords:    Amaj | E | F#m | Amaj
+Voice:     part
+Flavor:    Lyrical
+Texture Role: Melody
+Voice Independence: -0.6
+Register Spread: -0.3
+Preset:    Minimal</w:t>
+      </w:r>
+    </w:p>
+    <w:p>
+      <w:pPr>
+        <w:spacing w:after="160"/>
+      </w:pPr>
+      <w:r>
+        <w:t xml:space="preserve">*Expect:* Sparse, pure, tintinnabuli-adjacent. The melody voice sings a simple line while the other voices move in slow, consonant support. Silence is structural.</w:t>
       </w:r>
     </w:p>
     <w:p>
@@ -6188,8 +8122,33 @@
         </w:rPr>
         <w:t xml:space="preserve">Recipe 3 — Reich phasing feel</w:t>
       </w:r>
-      <w:r>
-        <w:t xml:space="preserve"> ``` Chords:    Dm | Am | Dm | C | Dm | Am | Bb | C Voice:     reich_glass Flavor:    Patterned Texture Role: Accompaniment Voice Independence: +0.4 Register Spread: -0.2 Preset:    Minimal ``` *Expect:* Cycling, hypnotic, pattern-driven. The patterned flavor suits Reich's additive process — phrases that shift by small increments. Low register spread keeps the voices close together.</w:t>
+    </w:p>
+    <w:p>
+      <w:pPr>
+        <w:shd w:fill="F5F5F5"/>
+        <w:spacing w:after="120"/>
+      </w:pPr>
+      <w:r>
+        <w:rPr>
+          <w:rFonts w:ascii="Consolas" w:cs="Consolas" w:eastAsia="Consolas" w:hAnsi="Consolas"/>
+          <w:sz w:val="20"/>
+          <w:szCs w:val="20"/>
+        </w:rPr>
+        <w:t xml:space="preserve">Chords:    Dm | Am | Dm | C | Dm | Am | Bb | C
+Voice:     reich_glass
+Flavor:    Patterned
+Texture Role: Accompaniment
+Voice Independence: +0.4
+Register Spread: -0.2
+Preset:    Minimal</w:t>
+      </w:r>
+    </w:p>
+    <w:p>
+      <w:pPr>
+        <w:spacing w:after="160"/>
+      </w:pPr>
+      <w:r>
+        <w:t xml:space="preserve">*Expect:* Cycling, hypnotic, pattern-driven. The patterned flavor suits Reich's additive process — phrases that shift by small increments. Low register spread keeps the voices close together.</w:t>
       </w:r>
     </w:p>
     <w:p>
@@ -6203,8 +8162,33 @@
         </w:rPr>
         <w:t xml:space="preserve">Recipe 4 — Romantic lush</w:t>
       </w:r>
-      <w:r>
-        <w:t xml:space="preserve"> ``` Chords:    Dbmaj7 | Bbm7 | Ebm7 | Ab7 | Dbmaj7 Voice:     ravel  (or dutilleux) Flavor:    Lyrical Texture Role: Melody Voice Independence: -0.4 Register Spread: -0.5 Preset:    Romantic ``` *Expect:* Rich, singing, expressive. Upper violin carries a long melodic line. Inner voices move in smooth, Ravel-style voice leading. Full register with close spacing.</w:t>
+    </w:p>
+    <w:p>
+      <w:pPr>
+        <w:shd w:fill="F5F5F5"/>
+        <w:spacing w:after="120"/>
+      </w:pPr>
+      <w:r>
+        <w:rPr>
+          <w:rFonts w:ascii="Consolas" w:cs="Consolas" w:eastAsia="Consolas" w:hAnsi="Consolas"/>
+          <w:sz w:val="20"/>
+          <w:szCs w:val="20"/>
+        </w:rPr>
+        <w:t xml:space="preserve">Chords:    Dbmaj7 | Bbm7 | Ebm7 | Ab7 | Dbmaj7
+Voice:     ravel  (or dutilleux)
+Flavor:    Lyrical
+Texture Role: Melody
+Voice Independence: -0.4
+Register Spread: -0.5
+Preset:    Romantic</w:t>
+      </w:r>
+    </w:p>
+    <w:p>
+      <w:pPr>
+        <w:spacing w:after="160"/>
+      </w:pPr>
+      <w:r>
+        <w:t xml:space="preserve">*Expect:* Rich, singing, expressive. Upper violin carries a long melodic line. Inner voices move in smooth, Ravel-style voice leading. Full register with close spacing.</w:t>
       </w:r>
     </w:p>
     <w:p>
@@ -6227,8 +8211,29 @@
         </w:rPr>
         <w:t xml:space="preserve">Recipe 1 — Metheny open</w:t>
       </w:r>
-      <w:r>
-        <w:t xml:space="preserve"> ``` Chords:        Gmaj9 | Em9 | Cmaj7 | D11 Voice:         pat_metheny Outside Level: Subtle ``` *Expect:* Warm, open, lyrical. Guitar carries a clean singing line. Bass provides mobile harmonic support. Outside cells appear occasionally — not intrusive, just colorful.</w:t>
+    </w:p>
+    <w:p>
+      <w:pPr>
+        <w:shd w:fill="F5F5F5"/>
+        <w:spacing w:after="120"/>
+      </w:pPr>
+      <w:r>
+        <w:rPr>
+          <w:rFonts w:ascii="Consolas" w:cs="Consolas" w:eastAsia="Consolas" w:hAnsi="Consolas"/>
+          <w:sz w:val="20"/>
+          <w:szCs w:val="20"/>
+        </w:rPr>
+        <w:t xml:space="preserve">Chords:        Gmaj9 | Em9 | Cmaj7 | D11
+Voice:         pat_metheny
+Outside Level: Subtle</w:t>
+      </w:r>
+    </w:p>
+    <w:p>
+      <w:pPr>
+        <w:spacing w:after="160"/>
+      </w:pPr>
+      <w:r>
+        <w:t xml:space="preserve">*Expect:* Warm, open, lyrical. Guitar carries a clean singing line. Bass provides mobile harmonic support. Outside cells appear occasionally — not intrusive, just colorful.</w:t>
       </w:r>
     </w:p>
     <w:p>
@@ -6242,8 +8247,29 @@
         </w:rPr>
         <w:t xml:space="preserve">Recipe 2 — Nile Rodgers groove</w:t>
       </w:r>
-      <w:r>
-        <w:t xml:space="preserve"> ``` Chords:        E9 | A9 | B9 | E9 Voice:         nile_rodgers Outside Level: Off ``` *Expect:* Hooky, groove-first, tight. Guitar stays close to the chord tones with strong rhythmic character. Bass locks in. No outside cells — this is about the groove, not the color.</w:t>
+    </w:p>
+    <w:p>
+      <w:pPr>
+        <w:shd w:fill="F5F5F5"/>
+        <w:spacing w:after="120"/>
+      </w:pPr>
+      <w:r>
+        <w:rPr>
+          <w:rFonts w:ascii="Consolas" w:cs="Consolas" w:eastAsia="Consolas" w:hAnsi="Consolas"/>
+          <w:sz w:val="20"/>
+          <w:szCs w:val="20"/>
+        </w:rPr>
+        <w:t xml:space="preserve">Chords:        E9 | A9 | B9 | E9
+Voice:         nile_rodgers
+Outside Level: Off</w:t>
+      </w:r>
+    </w:p>
+    <w:p>
+      <w:pPr>
+        <w:spacing w:after="160"/>
+      </w:pPr>
+      <w:r>
+        <w:t xml:space="preserve">*Expect:* Hooky, groove-first, tight. Guitar stays close to the chord tones with strong rhythmic character. Bass locks in. No outside cells — this is about the groove, not the color.</w:t>
       </w:r>
     </w:p>
     <w:p>
@@ -6257,8 +8283,29 @@
         </w:rPr>
         <w:t xml:space="preserve">Recipe 3 — Van Halen riff energy</w:t>
       </w:r>
-      <w:r>
-        <w:t xml:space="preserve"> ``` Chords:        E5 | D5 | A5 | B5 | E5 | D5 | A5 | A5 Voice:         eddie_van_halen Outside Level: Subtle ``` *Expect:* Driving, riff-based, angular. Power chord context pushes the engine toward strong rhythmic riff shapes. Subtle outside level adds occasional color without losing the energy.</w:t>
+    </w:p>
+    <w:p>
+      <w:pPr>
+        <w:shd w:fill="F5F5F5"/>
+        <w:spacing w:after="120"/>
+      </w:pPr>
+      <w:r>
+        <w:rPr>
+          <w:rFonts w:ascii="Consolas" w:cs="Consolas" w:eastAsia="Consolas" w:hAnsi="Consolas"/>
+          <w:sz w:val="20"/>
+          <w:szCs w:val="20"/>
+        </w:rPr>
+        <w:t xml:space="preserve">Chords:        E5 | D5 | A5 | B5 | E5 | D5 | A5 | A5
+Voice:         eddie_van_halen
+Outside Level: Subtle</w:t>
+      </w:r>
+    </w:p>
+    <w:p>
+      <w:pPr>
+        <w:spacing w:after="160"/>
+      </w:pPr>
+      <w:r>
+        <w:t xml:space="preserve">*Expect:* Driving, riff-based, angular. Power chord context pushes the engine toward strong rhythmic riff shapes. Subtle outside level adds occasional color without losing the energy.</w:t>
       </w:r>
     </w:p>
     <w:p>
@@ -6272,8 +8319,29 @@
         </w:rPr>
         <w:t xml:space="preserve">Recipe 4 — Fripp texture</w:t>
       </w:r>
-      <w:r>
-        <w:t xml:space="preserve"> ``` Chords:        Fmaj7#11 | Cmaj7 | Gmaj7 | Dmaj7 Voice:         fripp Outside Level: Prominent ``` *Expect:* Oblique, layered, textural. Prominent outside level means cells frequently step away from the chord tones. Fripp's voice profile pushes toward sound-as-texture rather than melody-as-hook.</w:t>
+    </w:p>
+    <w:p>
+      <w:pPr>
+        <w:shd w:fill="F5F5F5"/>
+        <w:spacing w:after="120"/>
+      </w:pPr>
+      <w:r>
+        <w:rPr>
+          <w:rFonts w:ascii="Consolas" w:cs="Consolas" w:eastAsia="Consolas" w:hAnsi="Consolas"/>
+          <w:sz w:val="20"/>
+          <w:szCs w:val="20"/>
+        </w:rPr>
+        <w:t xml:space="preserve">Chords:        Fmaj7#11 | Cmaj7 | Gmaj7 | Dmaj7
+Voice:         fripp
+Outside Level: Prominent</w:t>
+      </w:r>
+    </w:p>
+    <w:p>
+      <w:pPr>
+        <w:spacing w:after="160"/>
+      </w:pPr>
+      <w:r>
+        <w:t xml:space="preserve">*Expect:* Oblique, layered, textural. Prominent outside level means cells frequently step away from the chord tones. Fripp's voice profile pushes toward sound-as-texture rather than melody-as-hook.</w:t>
       </w:r>
     </w:p>
     <w:p>
@@ -6287,8 +8355,29 @@
         </w:rPr>
         <w:t xml:space="preserve">Recipe 5 — Larry Carlton jazz-pop</w:t>
       </w:r>
-      <w:r>
-        <w:t xml:space="preserve"> ``` Chords:        Cmaj7 | Am7 | Dm7 | G7 | Cmaj7 | Am7 | Fmaj7 | G7 Voice:         larry_carlton Outside Level: Subtle ``` *Expect:* Smooth, singing, polished. Carlton's voice profile produces clean jazz-pop lines — melodic, accessible, harmonically sophisticated without being aggressive.</w:t>
+    </w:p>
+    <w:p>
+      <w:pPr>
+        <w:shd w:fill="F5F5F5"/>
+        <w:spacing w:after="120"/>
+      </w:pPr>
+      <w:r>
+        <w:rPr>
+          <w:rFonts w:ascii="Consolas" w:cs="Consolas" w:eastAsia="Consolas" w:hAnsi="Consolas"/>
+          <w:sz w:val="20"/>
+          <w:szCs w:val="20"/>
+        </w:rPr>
+        <w:t xml:space="preserve">Chords:        Cmaj7 | Am7 | Dm7 | G7 | Cmaj7 | Am7 | Fmaj7 | G7
+Voice:         larry_carlton
+Outside Level: Subtle</w:t>
+      </w:r>
+    </w:p>
+    <w:p>
+      <w:pPr>
+        <w:spacing w:after="160"/>
+      </w:pPr>
+      <w:r>
+        <w:t xml:space="preserve">*Expect:* Smooth, singing, polished. Carlton's voice profile produces clean jazz-pop lines — melodic, accessible, harmonically sophisticated without being aggressive.</w:t>
       </w:r>
     </w:p>
     <w:p>
@@ -6311,8 +8400,31 @@
         </w:rPr>
         <w:t xml:space="preserve">Recipe 1 — Conversation</w:t>
       </w:r>
-      <w:r>
-        <w:t xml:space="preserve"> ``` Chords:               Cmaj7 | Am7 | Fmaj7 | G7 Ensemble Relationship: Conversation Foreground Owner:      Alternating Density Split:         0 Register Carve:        0 ``` *Expect:* SQ and BB trade phrases — one speaks, the other listens. Equal density, equal register. The most natural hybrid texture.</w:t>
+    </w:p>
+    <w:p>
+      <w:pPr>
+        <w:shd w:fill="F5F5F5"/>
+        <w:spacing w:after="120"/>
+      </w:pPr>
+      <w:r>
+        <w:rPr>
+          <w:rFonts w:ascii="Consolas" w:cs="Consolas" w:eastAsia="Consolas" w:hAnsi="Consolas"/>
+          <w:sz w:val="20"/>
+          <w:szCs w:val="20"/>
+        </w:rPr>
+        <w:t xml:space="preserve">Chords:               Cmaj7 | Am7 | Fmaj7 | G7
+Ensemble Relationship: Conversation
+Foreground Owner:      Alternating
+Density Split:         0
+Register Carve:        0</w:t>
+      </w:r>
+    </w:p>
+    <w:p>
+      <w:pPr>
+        <w:spacing w:after="160"/>
+      </w:pPr>
+      <w:r>
+        <w:t xml:space="preserve">*Expect:* SQ and BB trade phrases — one speaks, the other listens. Equal density, equal register. The most natural hybrid texture.</w:t>
       </w:r>
     </w:p>
     <w:p>
@@ -6326,8 +8438,31 @@
         </w:rPr>
         <w:t xml:space="preserve">Recipe 2 — Contrast</w:t>
       </w:r>
-      <w:r>
-        <w:t xml:space="preserve"> ``` Chords:               Dbmaj7 | Bbm7 | Ebm9 | Ab7 Ensemble Relationship: Contrast Foreground Owner:      BB Density Split:         +0.6 Register Carve:        -0.5 ``` *Expect:* BB dense and low, SQ sparse and high. Maximum contrast between the two ensembles. BB carries the weight, SQ provides high filigree.</w:t>
+    </w:p>
+    <w:p>
+      <w:pPr>
+        <w:shd w:fill="F5F5F5"/>
+        <w:spacing w:after="120"/>
+      </w:pPr>
+      <w:r>
+        <w:rPr>
+          <w:rFonts w:ascii="Consolas" w:cs="Consolas" w:eastAsia="Consolas" w:hAnsi="Consolas"/>
+          <w:sz w:val="20"/>
+          <w:szCs w:val="20"/>
+        </w:rPr>
+        <w:t xml:space="preserve">Chords:               Dbmaj7 | Bbm7 | Ebm9 | Ab7
+Ensemble Relationship: Contrast
+Foreground Owner:      BB
+Density Split:         +0.6
+Register Carve:        -0.5</w:t>
+      </w:r>
+    </w:p>
+    <w:p>
+      <w:pPr>
+        <w:spacing w:after="160"/>
+      </w:pPr>
+      <w:r>
+        <w:t xml:space="preserve">*Expect:* BB dense and low, SQ sparse and high. Maximum contrast between the two ensembles. BB carries the weight, SQ provides high filigree.</w:t>
       </w:r>
     </w:p>
     <w:p>
@@ -6341,8 +8476,31 @@
         </w:rPr>
         <w:t xml:space="preserve">Recipe 3 — Unison power</w:t>
       </w:r>
-      <w:r>
-        <w:t xml:space="preserve"> ``` Chords:               E7#9 | A7#9 | D7#9 | G7#9 Ensemble Relationship: Unison Foreground Owner:      BB Density Split:         +0.8 Register Carve:        +0.3 ``` *Expect:* Both ensembles locked together — one massive sound. High density split means BB dominates the texture, SQ reinforces rather than leads.</w:t>
+    </w:p>
+    <w:p>
+      <w:pPr>
+        <w:shd w:fill="F5F5F5"/>
+        <w:spacing w:after="120"/>
+      </w:pPr>
+      <w:r>
+        <w:rPr>
+          <w:rFonts w:ascii="Consolas" w:cs="Consolas" w:eastAsia="Consolas" w:hAnsi="Consolas"/>
+          <w:sz w:val="20"/>
+          <w:szCs w:val="20"/>
+        </w:rPr>
+        <w:t xml:space="preserve">Chords:               E7#9 | A7#9 | D7#9 | G7#9
+Ensemble Relationship: Unison
+Foreground Owner:      BB
+Density Split:         +0.8
+Register Carve:        +0.3</w:t>
+      </w:r>
+    </w:p>
+    <w:p>
+      <w:pPr>
+        <w:spacing w:after="160"/>
+      </w:pPr>
+      <w:r>
+        <w:t xml:space="preserve">*Expect:* Both ensembles locked together — one massive sound. High density split means BB dominates the texture, SQ reinforces rather than leads.</w:t>
       </w:r>
     </w:p>
     <w:p>
@@ -6356,8 +8514,31 @@
         </w:rPr>
         <w:t xml:space="preserve">Recipe 4 — Call and response</w:t>
       </w:r>
-      <w:r>
-        <w:t xml:space="preserve"> ``` Chords:               Bm9 | E13 | Amaj7 | F#m9 Ensemble Relationship: Call and response Foreground Owner:      SQ Density Split:         -0.3 Register Carve:        +0.6 ``` *Expect:* SQ calls high, BB responds low. The register carve separates them in space. SQ leads — delicate, high, melodic. BB answers — warm, low, full.</w:t>
+    </w:p>
+    <w:p>
+      <w:pPr>
+        <w:shd w:fill="F5F5F5"/>
+        <w:spacing w:after="120"/>
+      </w:pPr>
+      <w:r>
+        <w:rPr>
+          <w:rFonts w:ascii="Consolas" w:cs="Consolas" w:eastAsia="Consolas" w:hAnsi="Consolas"/>
+          <w:sz w:val="20"/>
+          <w:szCs w:val="20"/>
+        </w:rPr>
+        <w:t xml:space="preserve">Chords:               Bm9 | E13 | Amaj7 | F#m9
+Ensemble Relationship: Call and response
+Foreground Owner:      SQ
+Density Split:         -0.3
+Register Carve:        +0.6</w:t>
+      </w:r>
+    </w:p>
+    <w:p>
+      <w:pPr>
+        <w:spacing w:after="160"/>
+      </w:pPr>
+      <w:r>
+        <w:t xml:space="preserve">*Expect:* SQ calls high, BB responds low. The register carve separates them in space. SQ leads — delicate, high, melodic. BB answers — warm, low, full.</w:t>
       </w:r>
     </w:p>
     <w:p>
@@ -6420,7 +8601,7 @@
         <w:ind w:left="360" w:hanging="260"/>
       </w:pPr>
       <w:r>
-        <w:t xml:space="preserve">â€¢ </w:t>
+        <w:t xml:space="preserve">• </w:t>
       </w:r>
       <w:r>
         <w:t xml:space="preserve">Era preset: Blues-Rock Ferocious</w:t>
@@ -6432,7 +8613,7 @@
         <w:ind w:left="360" w:hanging="260"/>
       </w:pPr>
       <w:r>
-        <w:t xml:space="preserve">â€¢ </w:t>
+        <w:t xml:space="preserve">• </w:t>
       </w:r>
       <w:r>
         <w:t xml:space="preserve">Phrase character: Burst</w:t>
@@ -6444,7 +8625,7 @@
         <w:ind w:left="360" w:hanging="260"/>
       </w:pPr>
       <w:r>
-        <w:t xml:space="preserve">â€¢ </w:t>
+        <w:t xml:space="preserve">• </w:t>
       </w:r>
       <w:r>
         <w:t xml:space="preserve">Symmetry bias: High</w:t>
@@ -6456,7 +8637,7 @@
         <w:ind w:left="360" w:hanging="260"/>
       </w:pPr>
       <w:r>
-        <w:t xml:space="preserve">â€¢ </w:t>
+        <w:t xml:space="preserve">• </w:t>
       </w:r>
       <w:r>
         <w:t xml:space="preserve">Chain depth: Maximum</w:t>
@@ -6604,10 +8785,21 @@
     </w:p>
     <w:p>
       <w:pPr>
-        <w:spacing w:after="160"/>
-      </w:pPr>
-      <w:r>
-        <w:t xml:space="preserve">``` Intro:       Pin Lyrical, Avoid Chromatic Verse:       Pin Lyrical Pre-chorus:  No pin (allow any flavor) Chorus:      Pin Angular, Avoid Lyrical Bridge:      Pin Chromatic, Avoid Lyrical Outro:       Pin Lyrical, Avoid Chromatic ```</w:t>
+        <w:shd w:fill="F5F5F5"/>
+        <w:spacing w:after="120"/>
+      </w:pPr>
+      <w:r>
+        <w:rPr>
+          <w:rFonts w:ascii="Consolas" w:cs="Consolas" w:eastAsia="Consolas" w:hAnsi="Consolas"/>
+          <w:sz w:val="20"/>
+          <w:szCs w:val="20"/>
+        </w:rPr>
+        <w:t xml:space="preserve">Intro:       Pin Lyrical, Avoid Chromatic
+Verse:       Pin Lyrical
+Pre-chorus:  No pin (allow any flavor)
+Chorus:      Pin Angular, Avoid Lyrical
+Bridge:      Pin Chromatic, Avoid Lyrical
+Outro:       Pin Lyrical, Avoid Chromatic</w:t>
       </w:r>
     </w:p>
     <w:p>
@@ -6637,10 +8829,18 @@
     </w:p>
     <w:p>
       <w:pPr>
-        <w:spacing w:after="160"/>
-      </w:pPr>
-      <w:r>
-        <w:t xml:space="preserve">``` A / Verse sections:  Pin Lyrical B / Bridge section:  Pin Angular, Avoid Lyrical Return:              Pin Lyrical ```</w:t>
+        <w:shd w:fill="F5F5F5"/>
+        <w:spacing w:after="120"/>
+      </w:pPr>
+      <w:r>
+        <w:rPr>
+          <w:rFonts w:ascii="Consolas" w:cs="Consolas" w:eastAsia="Consolas" w:hAnsi="Consolas"/>
+          <w:sz w:val="20"/>
+          <w:szCs w:val="20"/>
+        </w:rPr>
+        <w:t xml:space="preserve">A / Verse sections:  Pin Lyrical
+B / Bridge section:  Pin Angular, Avoid Lyrical
+Return:              Pin Lyrical</w:t>
       </w:r>
     </w:p>
     <w:p>
@@ -6670,10 +8870,20 @@
     </w:p>
     <w:p>
       <w:pPr>
-        <w:spacing w:after="160"/>
-      </w:pPr>
-      <w:r>
-        <w:t xml:space="preserve">``` Opening:     Pin Lyrical (establish the world) Statement:   Pin Patterned (introduce the pattern) Development: Pin Angular (tension builds) Climax:      Pin Chromatic (maximum darkness) Coda:        Pin Lyrical (resolution, but changed) ```</w:t>
+        <w:shd w:fill="F5F5F5"/>
+        <w:spacing w:after="120"/>
+      </w:pPr>
+      <w:r>
+        <w:rPr>
+          <w:rFonts w:ascii="Consolas" w:cs="Consolas" w:eastAsia="Consolas" w:hAnsi="Consolas"/>
+          <w:sz w:val="20"/>
+          <w:szCs w:val="20"/>
+        </w:rPr>
+        <w:t xml:space="preserve">Opening:     Pin Lyrical (establish the world)
+Statement:   Pin Patterned (introduce the pattern)
+Development: Pin Angular (tension builds)
+Climax:      Pin Chromatic (maximum darkness)
+Coda:        Pin Lyrical (resolution, but changed)</w:t>
       </w:r>
     </w:p>
     <w:p>
@@ -6695,10 +8905,20 @@
     </w:p>
     <w:p>
       <w:pPr>
-        <w:spacing w:after="160"/>
-      </w:pPr>
-      <w:r>
-        <w:t xml:space="preserve">``` Intro:   Flavor Chromatic, Motion +0.4, Tension +0.3 Verse:   Flavor Riff, Motion +0.3, Tension +0.2 (hook-based) Chorus:  Flavor Angular, Motion +0.7, Tension +0.6 (push harder) Bridge:  Pin Chromatic, Motion +0.9, Tension +0.8 (ferocity peak) Outro:   Flavor Riff (return to the hook, but you've been through the bridge) ```</w:t>
+        <w:shd w:fill="F5F5F5"/>
+        <w:spacing w:after="120"/>
+      </w:pPr>
+      <w:r>
+        <w:rPr>
+          <w:rFonts w:ascii="Consolas" w:cs="Consolas" w:eastAsia="Consolas" w:hAnsi="Consolas"/>
+          <w:sz w:val="20"/>
+          <w:szCs w:val="20"/>
+        </w:rPr>
+        <w:t xml:space="preserve">Intro:   Flavor Chromatic, Motion +0.4, Tension +0.3
+Verse:   Flavor Riff, Motion +0.3, Tension +0.2 (hook-based)
+Chorus:  Flavor Angular, Motion +0.7, Tension +0.6 (push harder)
+Bridge:  Pin Chromatic, Motion +0.9, Tension +0.8 (ferocity peak)
+Outro:   Flavor Riff (return to the hook, but you've been through the bridge)</w:t>
       </w:r>
     </w:p>
     <w:p>
@@ -6751,10 +8971,16 @@
     </w:p>
     <w:p>
       <w:pPr>
-        <w:spacing w:after="160"/>
-      </w:pPr>
-      <w:r>
-        <w:t xml:space="preserve">``` Cmaj7 | Am7 | Fmaj7 | G7 ```</w:t>
+        <w:shd w:fill="F5F5F5"/>
+        <w:spacing w:after="120"/>
+      </w:pPr>
+      <w:r>
+        <w:rPr>
+          <w:rFonts w:ascii="Consolas" w:cs="Consolas" w:eastAsia="Consolas" w:hAnsi="Consolas"/>
+          <w:sz w:val="20"/>
+          <w:szCs w:val="20"/>
+        </w:rPr>
+        <w:t xml:space="preserve">Cmaj7 | Am7 | Fmaj7 | G7</w:t>
       </w:r>
     </w:p>
     <w:p>
@@ -6799,10 +9025,19 @@
     </w:p>
     <w:p>
       <w:pPr>
-        <w:spacing w:after="160"/>
-      </w:pPr>
-      <w:r>
-        <w:t xml:space="preserve">``` Jazz ballad:    Cmaj7 | Am7 | Dm7 | G7 Minor blues:    Am7 | Am7 | Dm7 | Dm7 | Am7 | Am7 | E7 | Am7 Modal (Dorian): Dm7 | Dm7 | G7 | G7 | Dm7 | Dm7 | Em7b5 | A7 Bossa nova:     Amaj7 | F#m7 | Bm7 | E7 | Amaj7 | F#m7 | D#m7b5 | G#7 ```</w:t>
+        <w:shd w:fill="F5F5F5"/>
+        <w:spacing w:after="120"/>
+      </w:pPr>
+      <w:r>
+        <w:rPr>
+          <w:rFonts w:ascii="Consolas" w:cs="Consolas" w:eastAsia="Consolas" w:hAnsi="Consolas"/>
+          <w:sz w:val="20"/>
+          <w:szCs w:val="20"/>
+        </w:rPr>
+        <w:t xml:space="preserve">Jazz ballad:    Cmaj7 | Am7 | Dm7 | G7
+Minor blues:    Am7 | Am7 | Dm7 | Dm7 | Am7 | Am7 | E7 | Am7
+Modal (Dorian): Dm7 | Dm7 | G7 | G7 | Dm7 | Dm7 | Em7b5 | A7
+Bossa nova:     Amaj7 | F#m7 | Bm7 | E7 | Amaj7 | F#m7 | D#m7b5 | G#7</w:t>
       </w:r>
     </w:p>
     <w:p>
@@ -6833,8 +9068,27 @@
         </w:rPr>
         <w:t xml:space="preserve">Pedal point slash chords:</w:t>
       </w:r>
-      <w:r>
-        <w:t xml:space="preserve"> ``` Cmaj7/E | Am7/G | Fmaj7/A | Gsus/D ``` The descending bass line (E → G → A → D) is preserved in the output.</w:t>
+    </w:p>
+    <w:p>
+      <w:pPr>
+        <w:shd w:fill="F5F5F5"/>
+        <w:spacing w:after="120"/>
+      </w:pPr>
+      <w:r>
+        <w:rPr>
+          <w:rFonts w:ascii="Consolas" w:cs="Consolas" w:eastAsia="Consolas" w:hAnsi="Consolas"/>
+          <w:sz w:val="20"/>
+          <w:szCs w:val="20"/>
+        </w:rPr>
+        <w:t xml:space="preserve">Cmaj7/E | Am7/G | Fmaj7/A | Gsus/D</w:t>
+      </w:r>
+    </w:p>
+    <w:p>
+      <w:pPr>
+        <w:spacing w:after="160"/>
+      </w:pPr>
+      <w:r>
+        <w:t xml:space="preserve">The descending bass line (E → G → A → D) is preserved in the output.</w:t>
       </w:r>
     </w:p>
     <w:p>
@@ -6848,8 +9102,27 @@
         </w:rPr>
         <w:t xml:space="preserve">Implied polychords via slash:</w:t>
       </w:r>
-      <w:r>
-        <w:t xml:space="preserve"> ``` Bb/C | Eb/F | Ab/Bb ``` These read as suspended dominant chords (C11, F11, Bb11) — the engine interprets the upper chord as an extension of the bass root.</w:t>
+    </w:p>
+    <w:p>
+      <w:pPr>
+        <w:shd w:fill="F5F5F5"/>
+        <w:spacing w:after="120"/>
+      </w:pPr>
+      <w:r>
+        <w:rPr>
+          <w:rFonts w:ascii="Consolas" w:cs="Consolas" w:eastAsia="Consolas" w:hAnsi="Consolas"/>
+          <w:sz w:val="20"/>
+          <w:szCs w:val="20"/>
+        </w:rPr>
+        <w:t xml:space="preserve">Bb/C | Eb/F | Ab/Bb</w:t>
+      </w:r>
+    </w:p>
+    <w:p>
+      <w:pPr>
+        <w:spacing w:after="160"/>
+      </w:pPr>
+      <w:r>
+        <w:t xml:space="preserve">These read as suspended dominant chords (C11, F11, Bb11) — the engine interprets the upper chord as an extension of the bass root.</w:t>
       </w:r>
     </w:p>
     <w:p>
@@ -6863,8 +9136,27 @@
         </w:rPr>
         <w:t xml:space="preserve">Tritone bass:</w:t>
       </w:r>
-      <w:r>
-        <w:t xml:space="preserve"> ``` F#/G | B/C | E/F ``` Highly dissonant — the bass note is a tritone below the chord root. Expect the engine to choose cells that lean into the tension rather than resolve it.</w:t>
+    </w:p>
+    <w:p>
+      <w:pPr>
+        <w:shd w:fill="F5F5F5"/>
+        <w:spacing w:after="120"/>
+      </w:pPr>
+      <w:r>
+        <w:rPr>
+          <w:rFonts w:ascii="Consolas" w:cs="Consolas" w:eastAsia="Consolas" w:hAnsi="Consolas"/>
+          <w:sz w:val="20"/>
+          <w:szCs w:val="20"/>
+        </w:rPr>
+        <w:t xml:space="preserve">F#/G | B/C | E/F</w:t>
+      </w:r>
+    </w:p>
+    <w:p>
+      <w:pPr>
+        <w:spacing w:after="160"/>
+      </w:pPr>
+      <w:r>
+        <w:t xml:space="preserve">Highly dissonant — the bass note is a tritone below the chord root. Expect the engine to choose cells that lean into the tension rather than resolve it.</w:t>
       </w:r>
     </w:p>
     <w:p>
@@ -6895,8 +9187,27 @@
         </w:rPr>
         <w:t xml:space="preserve">Bitonal (Petrushka-style):</w:t>
       </w:r>
-      <w:r>
-        <w:t xml:space="preserve"> ``` [Cmaj/F#maj] | [Gmaj/Dbmaj] | [Dmaj/Abmaj] ``` The engine works with the combined pitch field — expect dense chromatic output.</w:t>
+    </w:p>
+    <w:p>
+      <w:pPr>
+        <w:shd w:fill="F5F5F5"/>
+        <w:spacing w:after="120"/>
+      </w:pPr>
+      <w:r>
+        <w:rPr>
+          <w:rFonts w:ascii="Consolas" w:cs="Consolas" w:eastAsia="Consolas" w:hAnsi="Consolas"/>
+          <w:sz w:val="20"/>
+          <w:szCs w:val="20"/>
+        </w:rPr>
+        <w:t xml:space="preserve">[Cmaj/F#maj] | [Gmaj/Dbmaj] | [Dmaj/Abmaj]</w:t>
+      </w:r>
+    </w:p>
+    <w:p>
+      <w:pPr>
+        <w:spacing w:after="160"/>
+      </w:pPr>
+      <w:r>
+        <w:t xml:space="preserve">The engine works with the combined pitch field — expect dense chromatic output.</w:t>
       </w:r>
     </w:p>
     <w:p>
@@ -6910,8 +9221,27 @@
         </w:rPr>
         <w:t xml:space="preserve">Wayne Shorter upper structure triads:</w:t>
       </w:r>
-      <w:r>
-        <w:t xml:space="preserve"> ``` F#maj7/G13 | Bmaj7/C7alt | Emaj7/F7 ``` Upper structure above a dominant chord — produces the characteristic Shorter "wrong note that's right" quality.</w:t>
+    </w:p>
+    <w:p>
+      <w:pPr>
+        <w:shd w:fill="F5F5F5"/>
+        <w:spacing w:after="120"/>
+      </w:pPr>
+      <w:r>
+        <w:rPr>
+          <w:rFonts w:ascii="Consolas" w:cs="Consolas" w:eastAsia="Consolas" w:hAnsi="Consolas"/>
+          <w:sz w:val="20"/>
+          <w:szCs w:val="20"/>
+        </w:rPr>
+        <w:t xml:space="preserve">F#maj7/G13 | Bmaj7/C7alt | Emaj7/F7</w:t>
+      </w:r>
+    </w:p>
+    <w:p>
+      <w:pPr>
+        <w:spacing w:after="160"/>
+      </w:pPr>
+      <w:r>
+        <w:t xml:space="preserve">Upper structure above a dominant chord — produces the characteristic Shorter "wrong note that's right" quality.</w:t>
       </w:r>
     </w:p>
     <w:p>
@@ -6942,8 +9272,19 @@
         </w:rPr>
         <w:t xml:space="preserve">Short cycle (2 bars each):</w:t>
       </w:r>
-      <w:r>
-        <w:t xml:space="preserve"> ``` Emaj7 | Cmaj7 | Abmaj7 | Emaj7 ```</w:t>
+    </w:p>
+    <w:p>
+      <w:pPr>
+        <w:shd w:fill="F5F5F5"/>
+        <w:spacing w:after="120"/>
+      </w:pPr>
+      <w:r>
+        <w:rPr>
+          <w:rFonts w:ascii="Consolas" w:cs="Consolas" w:eastAsia="Consolas" w:hAnsi="Consolas"/>
+          <w:sz w:val="20"/>
+          <w:szCs w:val="20"/>
+        </w:rPr>
+        <w:t xml:space="preserve">Emaj7 | Cmaj7 | Abmaj7 | Emaj7</w:t>
       </w:r>
     </w:p>
     <w:p>
@@ -6957,8 +9298,19 @@
         </w:rPr>
         <w:t xml:space="preserve">Full Giant Steps:</w:t>
       </w:r>
-      <w:r>
-        <w:t xml:space="preserve"> ``` Bmaj7 | D7 | Gmaj7 | Bb7 | Ebmaj7 | F#7 | Bmaj7 | Bmaj7 ```</w:t>
+    </w:p>
+    <w:p>
+      <w:pPr>
+        <w:shd w:fill="F5F5F5"/>
+        <w:spacing w:after="120"/>
+      </w:pPr>
+      <w:r>
+        <w:rPr>
+          <w:rFonts w:ascii="Consolas" w:cs="Consolas" w:eastAsia="Consolas" w:hAnsi="Consolas"/>
+          <w:sz w:val="20"/>
+          <w:szCs w:val="20"/>
+        </w:rPr>
+        <w:t xml:space="preserve">Bmaj7 | D7 | Gmaj7 | Bb7 | Ebmaj7 | F#7 | Bmaj7 | Bmaj7</w:t>
       </w:r>
     </w:p>
     <w:p>
@@ -6995,10 +9347,17 @@
     </w:p>
     <w:p>
       <w:pPr>
-        <w:spacing w:after="160"/>
-      </w:pPr>
-      <w:r>
-        <w:t xml:space="preserve">``` Pure Dorian (8 bars):    Dm7 | Dm7 | Dm7 | Dm7 | Dm7 | Dm7 | Dm7 | Dm7 Pure Lydian (8 bars):    Cmaj7#11 | Cmaj7#11 | Cmaj7#11 | Cmaj7#11 | ... ```</w:t>
+        <w:shd w:fill="F5F5F5"/>
+        <w:spacing w:after="120"/>
+      </w:pPr>
+      <w:r>
+        <w:rPr>
+          <w:rFonts w:ascii="Consolas" w:cs="Consolas" w:eastAsia="Consolas" w:hAnsi="Consolas"/>
+          <w:sz w:val="20"/>
+          <w:szCs w:val="20"/>
+        </w:rPr>
+        <w:t xml:space="preserve">Pure Dorian (8 bars):    Dm7 | Dm7 | Dm7 | Dm7 | Dm7 | Dm7 | Dm7 | Dm7
+Pure Lydian (8 bars):    Cmaj7#11 | Cmaj7#11 | Cmaj7#11 | Cmaj7#11 | ...</w:t>
       </w:r>
     </w:p>
     <w:p>
@@ -7036,8 +9395,27 @@
         </w:rPr>
         <w:t xml:space="preserve">Chromatic mediant moves:</w:t>
       </w:r>
-      <w:r>
-        <w:t xml:space="preserve"> ``` Cmaj7 | Ebmaj7 | Gmaj7 | Bbmaj7 ``` Major chords moving by minor thirds. The engine tracks the voice leading — expect smooth chromatic movement despite the large key changes.</w:t>
+    </w:p>
+    <w:p>
+      <w:pPr>
+        <w:shd w:fill="F5F5F5"/>
+        <w:spacing w:after="120"/>
+      </w:pPr>
+      <w:r>
+        <w:rPr>
+          <w:rFonts w:ascii="Consolas" w:cs="Consolas" w:eastAsia="Consolas" w:hAnsi="Consolas"/>
+          <w:sz w:val="20"/>
+          <w:szCs w:val="20"/>
+        </w:rPr>
+        <w:t xml:space="preserve">Cmaj7 | Ebmaj7 | Gmaj7 | Bbmaj7</w:t>
+      </w:r>
+    </w:p>
+    <w:p>
+      <w:pPr>
+        <w:spacing w:after="160"/>
+      </w:pPr>
+      <w:r>
+        <w:t xml:space="preserve">Major chords moving by minor thirds. The engine tracks the voice leading — expect smooth chromatic movement despite the large key changes.</w:t>
       </w:r>
     </w:p>
     <w:p>
@@ -7051,8 +9429,27 @@
         </w:rPr>
         <w:t xml:space="preserve">Tritone substitutions:</w:t>
       </w:r>
-      <w:r>
-        <w:t xml:space="preserve"> ``` Cmaj7 | Db7 | Cmaj7 | Db7 ``` Db7 substituting for G7. Classic bebop movement — the engine handles this as a conventional dominant substitution.</w:t>
+    </w:p>
+    <w:p>
+      <w:pPr>
+        <w:shd w:fill="F5F5F5"/>
+        <w:spacing w:after="120"/>
+      </w:pPr>
+      <w:r>
+        <w:rPr>
+          <w:rFonts w:ascii="Consolas" w:cs="Consolas" w:eastAsia="Consolas" w:hAnsi="Consolas"/>
+          <w:sz w:val="20"/>
+          <w:szCs w:val="20"/>
+        </w:rPr>
+        <w:t xml:space="preserve">Cmaj7 | Db7 | Cmaj7 | Db7</w:t>
+      </w:r>
+    </w:p>
+    <w:p>
+      <w:pPr>
+        <w:spacing w:after="160"/>
+      </w:pPr>
+      <w:r>
+        <w:t xml:space="preserve">Db7 substituting for G7. Classic bebop movement — the engine handles this as a conventional dominant substitution.</w:t>
       </w:r>
     </w:p>
     <w:p>
@@ -7898,8 +10295,29 @@
         </w:rPr>
         <w:t xml:space="preserve">Sacred to chaotic:</w:t>
       </w:r>
-      <w:r>
-        <w:t xml:space="preserve"> ``` Opening:     arvo_part    (crystalline stillness) Development: ornette_coleman (harmolodic freedom) Reprise:     arvo_part    (return to stillness) ``` Hard cut at the development boundary — no transition. The contrast is structural.</w:t>
+    </w:p>
+    <w:p>
+      <w:pPr>
+        <w:shd w:fill="F5F5F5"/>
+        <w:spacing w:after="120"/>
+      </w:pPr>
+      <w:r>
+        <w:rPr>
+          <w:rFonts w:ascii="Consolas" w:cs="Consolas" w:eastAsia="Consolas" w:hAnsi="Consolas"/>
+          <w:sz w:val="20"/>
+          <w:szCs w:val="20"/>
+        </w:rPr>
+        <w:t xml:space="preserve">Opening:     arvo_part    (crystalline stillness)
+Development: ornette_coleman (harmolodic freedom)
+Reprise:     arvo_part    (return to stillness)</w:t>
+      </w:r>
+    </w:p>
+    <w:p>
+      <w:pPr>
+        <w:spacing w:after="160"/>
+      </w:pPr>
+      <w:r>
+        <w:t xml:space="preserve">Hard cut at the development boundary — no transition. The contrast is structural.</w:t>
       </w:r>
     </w:p>
     <w:p>
@@ -7913,8 +10331,21 @@
         </w:rPr>
         <w:t xml:space="preserve">French refinement vs Soviet brutalism:</w:t>
       </w:r>
-      <w:r>
-        <w:t xml:space="preserve"> ``` Opening:     ravel        (smooth impressionist) Development: shostakovich (displaced downbeats, dark modal) Coda:        ravel        (refined resolution) ```</w:t>
+    </w:p>
+    <w:p>
+      <w:pPr>
+        <w:shd w:fill="F5F5F5"/>
+        <w:spacing w:after="120"/>
+      </w:pPr>
+      <w:r>
+        <w:rPr>
+          <w:rFonts w:ascii="Consolas" w:cs="Consolas" w:eastAsia="Consolas" w:hAnsi="Consolas"/>
+          <w:sz w:val="20"/>
+          <w:szCs w:val="20"/>
+        </w:rPr>
+        <w:t xml:space="preserve">Opening:     ravel        (smooth impressionist)
+Development: shostakovich (displaced downbeats, dark modal)
+Coda:        ravel        (refined resolution)</w:t>
       </w:r>
     </w:p>
     <w:p>
@@ -7928,8 +10359,21 @@
         </w:rPr>
         <w:t xml:space="preserve">Hollywood sweep to serial fragmentation:</w:t>
       </w:r>
-      <w:r>
-        <w:t xml:space="preserve"> ``` Opening:     williams     (strong orchestral narrative) Contrast:    webern       (pointillist extremes) Reprise:     williams     (recovery) ```</w:t>
+    </w:p>
+    <w:p>
+      <w:pPr>
+        <w:shd w:fill="F5F5F5"/>
+        <w:spacing w:after="120"/>
+      </w:pPr>
+      <w:r>
+        <w:rPr>
+          <w:rFonts w:ascii="Consolas" w:cs="Consolas" w:eastAsia="Consolas" w:hAnsi="Consolas"/>
+          <w:sz w:val="20"/>
+          <w:szCs w:val="20"/>
+        </w:rPr>
+        <w:t xml:space="preserve">Opening:     williams     (strong orchestral narrative)
+Contrast:    webern       (pointillist extremes)
+Reprise:     williams     (recovery)</w:t>
       </w:r>
     </w:p>
     <w:p>
@@ -7952,8 +10396,27 @@
         </w:rPr>
         <w:t xml:space="preserve">Impressionist watercolour:</w:t>
       </w:r>
-      <w:r>
-        <w:t xml:space="preserve"> ``` Blend: debussy 0.5 + ravel 0.5 ``` Parallel planing softened by Ravel's voice-leading clarity. Smooth throughout.</w:t>
+    </w:p>
+    <w:p>
+      <w:pPr>
+        <w:shd w:fill="F5F5F5"/>
+        <w:spacing w:after="120"/>
+      </w:pPr>
+      <w:r>
+        <w:rPr>
+          <w:rFonts w:ascii="Consolas" w:cs="Consolas" w:eastAsia="Consolas" w:hAnsi="Consolas"/>
+          <w:sz w:val="20"/>
+          <w:szCs w:val="20"/>
+        </w:rPr>
+        <w:t xml:space="preserve">Blend: debussy 0.5 + ravel 0.5</w:t>
+      </w:r>
+    </w:p>
+    <w:p>
+      <w:pPr>
+        <w:spacing w:after="160"/>
+      </w:pPr>
+      <w:r>
+        <w:t xml:space="preserve">Parallel planing softened by Ravel's voice-leading clarity. Smooth throughout.</w:t>
       </w:r>
     </w:p>
     <w:p>
@@ -7967,8 +10430,21 @@
         </w:rPr>
         <w:t xml:space="preserve">Broadway gradient:</w:t>
       </w:r>
-      <w:r>
-        <w:t xml:space="preserve"> ``` Intro/Verse: cole_porter  (controlled cabaret, swing 0.52) Chorus:      gershwin     (broader jazz exuberance, swing 0.65) Outro:       cole_porter  (return to precision) ```</w:t>
+    </w:p>
+    <w:p>
+      <w:pPr>
+        <w:shd w:fill="F5F5F5"/>
+        <w:spacing w:after="120"/>
+      </w:pPr>
+      <w:r>
+        <w:rPr>
+          <w:rFonts w:ascii="Consolas" w:cs="Consolas" w:eastAsia="Consolas" w:hAnsi="Consolas"/>
+          <w:sz w:val="20"/>
+          <w:szCs w:val="20"/>
+        </w:rPr>
+        <w:t xml:space="preserve">Intro/Verse: cole_porter  (controlled cabaret, swing 0.52)
+Chorus:      gershwin     (broader jazz exuberance, swing 0.65)
+Outro:       cole_porter  (return to precision)</w:t>
       </w:r>
     </w:p>
     <w:p>
@@ -7982,8 +10458,27 @@
         </w:rPr>
         <w:t xml:space="preserve">Cinematic three-way:</w:t>
       </w:r>
-      <w:r>
-        <w:t xml:space="preserve"> ``` Blend: morricone 0.4 + herrmann 0.35 + badalamenti 0.25 ``` Epic modal drama shadowed by chromatic unease with noir space.</w:t>
+    </w:p>
+    <w:p>
+      <w:pPr>
+        <w:shd w:fill="F5F5F5"/>
+        <w:spacing w:after="120"/>
+      </w:pPr>
+      <w:r>
+        <w:rPr>
+          <w:rFonts w:ascii="Consolas" w:cs="Consolas" w:eastAsia="Consolas" w:hAnsi="Consolas"/>
+          <w:sz w:val="20"/>
+          <w:szCs w:val="20"/>
+        </w:rPr>
+        <w:t xml:space="preserve">Blend: morricone 0.4 + herrmann 0.35 + badalamenti 0.25</w:t>
+      </w:r>
+    </w:p>
+    <w:p>
+      <w:pPr>
+        <w:spacing w:after="160"/>
+      </w:pPr>
+      <w:r>
+        <w:t xml:space="preserve">Epic modal drama shadowed by chromatic unease with noir space.</w:t>
       </w:r>
     </w:p>
     <w:p>
@@ -8006,8 +10501,22 @@
         </w:rPr>
         <w:t xml:space="preserve">A century of jazz:</w:t>
       </w:r>
-      <w:r>
-        <w:t xml:space="preserve"> ``` Opening:     cole_porter     (Broadway cabaret) Verse:       gershwin        (jazz-classical) Chorus:      coltrane        (modal interval cells) Coda:        ornette_coleman (harmolodic freedom) ```</w:t>
+    </w:p>
+    <w:p>
+      <w:pPr>
+        <w:shd w:fill="F5F5F5"/>
+        <w:spacing w:after="120"/>
+      </w:pPr>
+      <w:r>
+        <w:rPr>
+          <w:rFonts w:ascii="Consolas" w:cs="Consolas" w:eastAsia="Consolas" w:hAnsi="Consolas"/>
+          <w:sz w:val="20"/>
+          <w:szCs w:val="20"/>
+        </w:rPr>
+        <w:t xml:space="preserve">Opening:     cole_porter     (Broadway cabaret)
+Verse:       gershwin        (jazz-classical)
+Chorus:      coltrane        (modal interval cells)
+Coda:        ornette_coleman (harmolodic freedom)</w:t>
       </w:r>
     </w:p>
     <w:p>
@@ -8021,8 +10530,29 @@
         </w:rPr>
         <w:t xml:space="preserve">Swing gradient:</w:t>
       </w:r>
-      <w:r>
-        <w:t xml:space="preserve"> ``` Intro:       cole_porter  (swing 0.52) Verse:       gershwin     (swing 0.65) Chorus:      turtle_island (swing 0.80) ``` Progressive swing intensification.</w:t>
+    </w:p>
+    <w:p>
+      <w:pPr>
+        <w:shd w:fill="F5F5F5"/>
+        <w:spacing w:after="120"/>
+      </w:pPr>
+      <w:r>
+        <w:rPr>
+          <w:rFonts w:ascii="Consolas" w:cs="Consolas" w:eastAsia="Consolas" w:hAnsi="Consolas"/>
+          <w:sz w:val="20"/>
+          <w:szCs w:val="20"/>
+        </w:rPr>
+        <w:t xml:space="preserve">Intro:       cole_porter  (swing 0.52)
+Verse:       gershwin     (swing 0.65)
+Chorus:      turtle_island (swing 0.80)</w:t>
+      </w:r>
+    </w:p>
+    <w:p>
+      <w:pPr>
+        <w:spacing w:after="160"/>
+      </w:pPr>
+      <w:r>
+        <w:t xml:space="preserve">Progressive swing intensification.</w:t>
       </w:r>
     </w:p>
     <w:p>
@@ -8036,8 +10566,21 @@
         </w:rPr>
         <w:t xml:space="preserve">Joni Mitchell bridge:</w:t>
       </w:r>
-      <w:r>
-        <w:t xml:space="preserve"> ``` Verse:  cole_porter   (Broadway sophistication) Bridge: joni_mitchell (open-tuning quartal) Chorus: gershwin      (jazz exuberance) ```</w:t>
+    </w:p>
+    <w:p>
+      <w:pPr>
+        <w:shd w:fill="F5F5F5"/>
+        <w:spacing w:after="120"/>
+      </w:pPr>
+      <w:r>
+        <w:rPr>
+          <w:rFonts w:ascii="Consolas" w:cs="Consolas" w:eastAsia="Consolas" w:hAnsi="Consolas"/>
+          <w:sz w:val="20"/>
+          <w:szCs w:val="20"/>
+        </w:rPr>
+        <w:t xml:space="preserve">Verse:  cole_porter   (Broadway sophistication)
+Bridge: joni_mitchell (open-tuning quartal)
+Chorus: gershwin      (jazz exuberance)</w:t>
       </w:r>
     </w:p>
     <w:p>
@@ -8060,8 +10603,31 @@
         </w:rPr>
         <w:t xml:space="preserve">The Hero's Journey:</w:t>
       </w:r>
-      <w:r>
-        <w:t xml:space="preserve"> ``` Opening:     badalamenti  (noir ambience) Statement:   morricone    (epic modal drama) Development: goldsmith    (Hollywood tension) Climax:      williams     (orchestral sweep) Coda:        badalamenti  (noir return) ``` 64+ bars. Boundary ramp active.</w:t>
+    </w:p>
+    <w:p>
+      <w:pPr>
+        <w:shd w:fill="F5F5F5"/>
+        <w:spacing w:after="120"/>
+      </w:pPr>
+      <w:r>
+        <w:rPr>
+          <w:rFonts w:ascii="Consolas" w:cs="Consolas" w:eastAsia="Consolas" w:hAnsi="Consolas"/>
+          <w:sz w:val="20"/>
+          <w:szCs w:val="20"/>
+        </w:rPr>
+        <w:t xml:space="preserve">Opening:     badalamenti  (noir ambience)
+Statement:   morricone    (epic modal drama)
+Development: goldsmith    (Hollywood tension)
+Climax:      williams     (orchestral sweep)
+Coda:        badalamenti  (noir return)</w:t>
+      </w:r>
+    </w:p>
+    <w:p>
+      <w:pPr>
+        <w:spacing w:after="160"/>
+      </w:pPr>
+      <w:r>
+        <w:t xml:space="preserve">64+ bars. Boundary ramp active.</w:t>
       </w:r>
     </w:p>
     <w:p>
@@ -8075,8 +10641,21 @@
         </w:rPr>
         <w:t xml:space="preserve">Suspense to resolution:</w:t>
       </w:r>
-      <w:r>
-        <w:t xml:space="preserve"> ``` Opening:     herrmann     (Hitchcock unease) Development: goldsmith    (Hollywood tension) Coda:        williams     (orchestral resolution) ```</w:t>
+    </w:p>
+    <w:p>
+      <w:pPr>
+        <w:shd w:fill="F5F5F5"/>
+        <w:spacing w:after="120"/>
+      </w:pPr>
+      <w:r>
+        <w:rPr>
+          <w:rFonts w:ascii="Consolas" w:cs="Consolas" w:eastAsia="Consolas" w:hAnsi="Consolas"/>
+          <w:sz w:val="20"/>
+          <w:szCs w:val="20"/>
+        </w:rPr>
+        <w:t xml:space="preserve">Opening:     herrmann     (Hitchcock unease)
+Development: goldsmith    (Hollywood tension)
+Coda:        williams     (orchestral resolution)</w:t>
       </w:r>
     </w:p>
     <w:p>
@@ -8099,8 +10678,30 @@
         </w:rPr>
         <w:t xml:space="preserve">The Modernist Arc:</w:t>
       </w:r>
-      <w:r>
-        <w:t xml:space="preserve"> ``` Opening:     shostakovich (displaced downbeats) Development: bartok       (chromatic clusters) Contrast:    ligeti       (micropolyphony) Coda:        webern       (serial pointillism) ``` 64+ bars.</w:t>
+    </w:p>
+    <w:p>
+      <w:pPr>
+        <w:shd w:fill="F5F5F5"/>
+        <w:spacing w:after="120"/>
+      </w:pPr>
+      <w:r>
+        <w:rPr>
+          <w:rFonts w:ascii="Consolas" w:cs="Consolas" w:eastAsia="Consolas" w:hAnsi="Consolas"/>
+          <w:sz w:val="20"/>
+          <w:szCs w:val="20"/>
+        </w:rPr>
+        <w:t xml:space="preserve">Opening:     shostakovich (displaced downbeats)
+Development: bartok       (chromatic clusters)
+Contrast:    ligeti       (micropolyphony)
+Coda:        webern       (serial pointillism)</w:t>
+      </w:r>
+    </w:p>
+    <w:p>
+      <w:pPr>
+        <w:spacing w:after="160"/>
+      </w:pPr>
+      <w:r>
+        <w:t xml:space="preserve">64+ bars.</w:t>
       </w:r>
     </w:p>
     <w:p>
@@ -8114,8 +10715,29 @@
         </w:rPr>
         <w:t xml:space="preserve">Soviet Sandwich:</w:t>
       </w:r>
-      <w:r>
-        <w:t xml:space="preserve"> ``` Opening:   shostakovich Contrast:  ligeti Reprise:   shostakovich ``` Same family — transitions smooth naturally.</w:t>
+    </w:p>
+    <w:p>
+      <w:pPr>
+        <w:shd w:fill="F5F5F5"/>
+        <w:spacing w:after="120"/>
+      </w:pPr>
+      <w:r>
+        <w:rPr>
+          <w:rFonts w:ascii="Consolas" w:cs="Consolas" w:eastAsia="Consolas" w:hAnsi="Consolas"/>
+          <w:sz w:val="20"/>
+          <w:szCs w:val="20"/>
+        </w:rPr>
+        <w:t xml:space="preserve">Opening:   shostakovich
+Contrast:  ligeti
+Reprise:   shostakovich</w:t>
+      </w:r>
+    </w:p>
+    <w:p>
+      <w:pPr>
+        <w:spacing w:after="160"/>
+      </w:pPr>
+      <w:r>
+        <w:t xml:space="preserve">Same family — transitions smooth naturally.</w:t>
       </w:r>
     </w:p>
     <w:p>
@@ -8423,8 +11045,30 @@
         </w:rPr>
         <w:t xml:space="preserve">The Sigma Journey (register arc):</w:t>
       </w:r>
-      <w:r>
-        <w:t xml:space="preserve"> ``` Opening:     arvo_part  (σ=16, narrowest) Development: ligeti     (σ=32, doubles) Climax:      webern     (σ=40, maximum) Coda:        arvo_part  (σ=16, collapses back) ``` Pure register drama. 64+ bars.</w:t>
+    </w:p>
+    <w:p>
+      <w:pPr>
+        <w:shd w:fill="F5F5F5"/>
+        <w:spacing w:after="120"/>
+      </w:pPr>
+      <w:r>
+        <w:rPr>
+          <w:rFonts w:ascii="Consolas" w:cs="Consolas" w:eastAsia="Consolas" w:hAnsi="Consolas"/>
+          <w:sz w:val="20"/>
+          <w:szCs w:val="20"/>
+        </w:rPr>
+        <w:t xml:space="preserve">Opening:     arvo_part  (σ=16, narrowest)
+Development: ligeti     (σ=32, doubles)
+Climax:      webern     (σ=40, maximum)
+Coda:        arvo_part  (σ=16, collapses back)</w:t>
+      </w:r>
+    </w:p>
+    <w:p>
+      <w:pPr>
+        <w:spacing w:after="160"/>
+      </w:pPr>
+      <w:r>
+        <w:t xml:space="preserve">Pure register drama. 64+ bars.</w:t>
       </w:r>
     </w:p>
     <w:p>
@@ -8438,8 +11082,21 @@
         </w:rPr>
         <w:t xml:space="preserve">Glass vs Herrmann:</w:t>
       </w:r>
-      <w:r>
-        <w:t xml:space="preserve"> ``` Opening:  glass    (σ=18, additive diatonic) Contrast: herrmann (σ=36, Hitchcock clusters) Coda:     glass    (σ=18, return) ```</w:t>
+    </w:p>
+    <w:p>
+      <w:pPr>
+        <w:shd w:fill="F5F5F5"/>
+        <w:spacing w:after="120"/>
+      </w:pPr>
+      <w:r>
+        <w:rPr>
+          <w:rFonts w:ascii="Consolas" w:cs="Consolas" w:eastAsia="Consolas" w:hAnsi="Consolas"/>
+          <w:sz w:val="20"/>
+          <w:szCs w:val="20"/>
+        </w:rPr>
+        <w:t xml:space="preserve">Opening:  glass    (σ=18, additive diatonic)
+Contrast: herrmann (σ=36, Hitchcock clusters)
+Coda:     glass    (σ=18, return)</w:t>
       </w:r>
     </w:p>
     <w:p>
@@ -8462,8 +11119,21 @@
         </w:rPr>
         <w:t xml:space="preserve">Coltrane Quartet:</w:t>
       </w:r>
-      <w:r>
-        <w:t xml:space="preserve"> ``` Mode:     String Quartet Voice:    coltrane Character: Melody cycles interval-cell patterns, inner voices share cell, bass holds modal pedal. ```</w:t>
+    </w:p>
+    <w:p>
+      <w:pPr>
+        <w:shd w:fill="F5F5F5"/>
+        <w:spacing w:after="120"/>
+      </w:pPr>
+      <w:r>
+        <w:rPr>
+          <w:rFonts w:ascii="Consolas" w:cs="Consolas" w:eastAsia="Consolas" w:hAnsi="Consolas"/>
+          <w:sz w:val="20"/>
+          <w:szCs w:val="20"/>
+        </w:rPr>
+        <w:t xml:space="preserve">Mode:     String Quartet
+Voice:    coltrane
+Character: Melody cycles interval-cell patterns, inner voices share cell, bass holds modal pedal.</w:t>
       </w:r>
     </w:p>
     <w:p>
@@ -8477,8 +11147,21 @@
         </w:rPr>
         <w:t xml:space="preserve">Sax and Bass Duo (Ornette style):</w:t>
       </w:r>
-      <w:r>
-        <w:t xml:space="preserve"> ``` Mode:     Guitar/Bass Duo Voice:    ornette_coleman Character: Guitar takes melody overlay, bass takes floating overlay. No chord roots. ```</w:t>
+    </w:p>
+    <w:p>
+      <w:pPr>
+        <w:shd w:fill="F5F5F5"/>
+        <w:spacing w:after="120"/>
+      </w:pPr>
+      <w:r>
+        <w:rPr>
+          <w:rFonts w:ascii="Consolas" w:cs="Consolas" w:eastAsia="Consolas" w:hAnsi="Consolas"/>
+          <w:sz w:val="20"/>
+          <w:szCs w:val="20"/>
+        </w:rPr>
+        <w:t xml:space="preserve">Mode:     Guitar/Bass Duo
+Voice:    ornette_coleman
+Character: Guitar takes melody overlay, bass takes floating overlay. No chord roots.</w:t>
       </w:r>
     </w:p>
     <w:p>
@@ -8535,7 +11218,7 @@
         <w:ind w:left="360" w:hanging="260"/>
       </w:pPr>
       <w:r>
-        <w:t xml:space="preserve">â€¢ </w:t>
+        <w:t xml:space="preserve">• </w:t>
       </w:r>
       <w:r>
         <w:t xml:space="preserve">Tempo is set correctly (Composer OS exports at the tempo you set)</w:t>
@@ -8547,7 +11230,7 @@
         <w:ind w:left="360" w:hanging="260"/>
       </w:pPr>
       <w:r>
-        <w:t xml:space="preserve">â€¢ </w:t>
+        <w:t xml:space="preserve">• </w:t>
       </w:r>
       <w:r>
         <w:t xml:space="preserve">Instrument sounds are assigned (default Sibelius sounds work well for initial review)</w:t>
@@ -8559,7 +11242,7 @@
         <w:ind w:left="360" w:hanging="260"/>
       </w:pPr>
       <w:r>
-        <w:t xml:space="preserve">â€¢ </w:t>
+        <w:t xml:space="preserve">• </w:t>
       </w:r>
       <w:r>
         <w:t xml:space="preserve">Mixer levels are balanced — the engine doesn't mix, it writes</w:t>
@@ -8583,7 +11266,7 @@
         <w:ind w:left="360" w:hanging="260"/>
       </w:pPr>
       <w:r>
-        <w:t xml:space="preserve">â€¢ </w:t>
+        <w:t xml:space="preserve">• </w:t>
       </w:r>
       <w:r>
         <w:t xml:space="preserve">Is the melodic line sitting at the right register for your instrument?</w:t>
@@ -8595,7 +11278,7 @@
         <w:ind w:left="360" w:hanging="260"/>
       </w:pPr>
       <w:r>
-        <w:t xml:space="preserve">â€¢ </w:t>
+        <w:t xml:space="preserve">• </w:t>
       </w:r>
       <w:r>
         <w:t xml:space="preserve">Are the inner voices creating harmony or clutter?</w:t>
@@ -8607,7 +11290,7 @@
         <w:ind w:left="360" w:hanging="260"/>
       </w:pPr>
       <w:r>
-        <w:t xml:space="preserve">â€¢ </w:t>
+        <w:t xml:space="preserve">• </w:t>
       </w:r>
       <w:r>
         <w:t xml:space="preserve">Is the rhythmic density right for your tempo?</w:t>
@@ -8619,7 +11302,7 @@
         <w:ind w:left="360" w:hanging="260"/>
       </w:pPr>
       <w:r>
-        <w:t xml:space="preserve">â€¢ </w:t>
+        <w:t xml:space="preserve">• </w:t>
       </w:r>
       <w:r>
         <w:t xml:space="preserve">Does the Slonimsky color appear where you expected it?</w:t>
@@ -8689,7 +11372,7 @@
         <w:ind w:left="360" w:hanging="260"/>
       </w:pPr>
       <w:r>
-        <w:t xml:space="preserve">â€¢ </w:t>
+        <w:t xml:space="preserve">• </w:t>
       </w:r>
       <w:r>
         <w:rPr>
@@ -8708,7 +11391,7 @@
         <w:ind w:left="360" w:hanging="260"/>
       </w:pPr>
       <w:r>
-        <w:t xml:space="preserve">â€¢ </w:t>
+        <w:t xml:space="preserve">• </w:t>
       </w:r>
       <w:r>
         <w:rPr>
@@ -8727,7 +11410,7 @@
         <w:ind w:left="360" w:hanging="260"/>
       </w:pPr>
       <w:r>
-        <w:t xml:space="preserve">â€¢ </w:t>
+        <w:t xml:space="preserve">• </w:t>
       </w:r>
       <w:r>
         <w:rPr>
@@ -8746,7 +11429,7 @@
         <w:ind w:left="360" w:hanging="260"/>
       </w:pPr>
       <w:r>
-        <w:t xml:space="preserve">â€¢ </w:t>
+        <w:t xml:space="preserve">• </w:t>
       </w:r>
       <w:r>
         <w:rPr>

</xml_diff>

<commit_message>
feat(section-arch): P5 Song schema types + behavioural contract
Add sectionArchitectureTypes.ts and contract signatures (resolveEffectiveContext, validateSong). Document precedence, validation, regeneration, and schema versioning. Musician guide section 2.9. Rename P4 template container to SectionTemplateBundle. Smoke 285/66/0 unchanged.

Co-authored-by: Cursor <cursoragent@cursor.com>
</commit_message>
<xml_diff>
--- a/docs/COMPOSER_OS_MUSICIAN_GUIDE.docx
+++ b/docs/COMPOSER_OS_MUSICIAN_GUIDE.docx
@@ -4985,6 +4985,768 @@
       </w:r>
       <w:r>
         <w:t xml:space="preserve">Ornette Coleman + Arvo Pärt — harmolodic freedom frames tintinnabuli stillness</w:t>
+      </w:r>
+    </w:p>
+    <w:p>
+      <w:pPr>
+        <w:pStyle w:val="Heading2"/>
+        <w:spacing w:after="100" w:before="160"/>
+      </w:pPr>
+      <w:r>
+        <w:t xml:space="preserve">2.9 Section architecture — Song, sections, and what changes when you edit (V64 P5)</w:t>
+      </w:r>
+    </w:p>
+    <w:p>
+      <w:pPr>
+        <w:spacing w:after="160"/>
+      </w:pPr>
+      <w:r>
+        <w:t xml:space="preserve">Composer OS is moving from “one global feel for the whole piece” to a </w:t>
+      </w:r>
+      <w:r>
+        <w:rPr>
+          <w:b/>
+          <w:bCs/>
+        </w:rPr>
+        <w:t xml:space="preserve">Song document</w:t>
+      </w:r>
+      <w:r>
+        <w:t xml:space="preserve">: defaults at the top, </w:t>
+      </w:r>
+      <w:r>
+        <w:rPr>
+          <w:b/>
+          <w:bCs/>
+        </w:rPr>
+        <w:t xml:space="preserve">sections</w:t>
+      </w:r>
+      <w:r>
+        <w:t xml:space="preserve"> with bar ranges, optional inheritance, and small </w:t>
+      </w:r>
+      <w:r>
+        <w:rPr>
+          <w:b/>
+          <w:bCs/>
+        </w:rPr>
+        <w:t xml:space="preserve">local overrides</w:t>
+      </w:r>
+      <w:r>
+        <w:t xml:space="preserve"> on specific bars. P5 ships the </w:t>
+      </w:r>
+      <w:r>
+        <w:rPr>
+          <w:b/>
+          <w:bCs/>
+        </w:rPr>
+        <w:t xml:space="preserve">TypeScript contract</w:t>
+      </w:r>
+      <w:r>
+        <w:t xml:space="preserve"> and the written rules; the engine </w:t>
+      </w:r>
+      <w:r>
+        <w:rPr>
+          <w:b/>
+          <w:bCs/>
+        </w:rPr>
+        <w:t xml:space="preserve">merges</w:t>
+      </w:r>
+      <w:r>
+        <w:t xml:space="preserve"> those fields per bar in P6 and applies </w:t>
+      </w:r>
+      <w:r>
+        <w:rPr>
+          <w:b/>
+          <w:bCs/>
+        </w:rPr>
+        <w:t xml:space="preserve">per-section meter</w:t>
+      </w:r>
+      <w:r>
+        <w:t xml:space="preserve"> in P7.</w:t>
+      </w:r>
+    </w:p>
+    <w:p>
+      <w:pPr>
+        <w:spacing w:after="160"/>
+      </w:pPr>
+      <w:r>
+        <w:rPr>
+          <w:b/>
+          <w:bCs/>
+        </w:rPr>
+        <w:t xml:space="preserve">Plain-English model</w:t>
+      </w:r>
+    </w:p>
+    <w:tbl>
+      <w:tblPr>
+        <w:tblW w:type="pct" w:w="100%"/>
+        <w:tblBorders>
+          <w:top w:val="single" w:color="auto" w:sz="4"/>
+          <w:left w:val="single" w:color="auto" w:sz="4"/>
+          <w:bottom w:val="single" w:color="auto" w:sz="4"/>
+          <w:right w:val="single" w:color="auto" w:sz="4"/>
+          <w:insideH w:val="single" w:color="auto" w:sz="4"/>
+          <w:insideV w:val="single" w:color="auto" w:sz="4"/>
+        </w:tblBorders>
+      </w:tblPr>
+      <w:tblGrid>
+        <w:gridCol w:w="4500"/>
+        <w:gridCol w:w="4500"/>
+      </w:tblGrid>
+      <w:tr>
+        <w:tc>
+          <w:tcPr>
+            <w:tcW w:type="pct" w:w="4500%"/>
+          </w:tcPr>
+          <w:p>
+            <w:pPr>
+              <w:spacing w:after="60"/>
+            </w:pPr>
+            <w:r>
+              <w:t xml:space="preserve">Piece</w:t>
+            </w:r>
+          </w:p>
+        </w:tc>
+        <w:tc>
+          <w:tcPr>
+            <w:tcW w:type="pct" w:w="4500%"/>
+          </w:tcPr>
+          <w:p>
+            <w:pPr>
+              <w:spacing w:after="60"/>
+            </w:pPr>
+            <w:r>
+              <w:t xml:space="preserve">What it is</w:t>
+            </w:r>
+          </w:p>
+        </w:tc>
+      </w:tr>
+      <w:tr>
+        <w:tc>
+          <w:tcPr>
+            <w:tcW w:type="pct" w:w="4500%"/>
+          </w:tcPr>
+          <w:p>
+            <w:pPr>
+              <w:spacing w:after="60"/>
+            </w:pPr>
+            <w:r>
+              <w:rPr>
+                <w:b/>
+                <w:bCs/>
+              </w:rPr>
+              <w:t xml:space="preserve">Song</w:t>
+            </w:r>
+          </w:p>
+        </w:tc>
+        <w:tc>
+          <w:tcPr>
+            <w:tcW w:type="pct" w:w="4500%"/>
+          </w:tcPr>
+          <w:p>
+            <w:pPr>
+              <w:spacing w:after="60"/>
+            </w:pPr>
+            <w:r>
+              <w:t xml:space="preserve">Title, `schemaVersion`, global defaults, named profile library, list of sections, local overrides</w:t>
+            </w:r>
+          </w:p>
+        </w:tc>
+      </w:tr>
+      <w:tr>
+        <w:tc>
+          <w:tcPr>
+            <w:tcW w:type="pct" w:w="4500%"/>
+          </w:tcPr>
+          <w:p>
+            <w:pPr>
+              <w:spacing w:after="60"/>
+            </w:pPr>
+            <w:r>
+              <w:rPr>
+                <w:b/>
+                <w:bCs/>
+              </w:rPr>
+              <w:t xml:space="preserve">SongDefaults</w:t>
+            </w:r>
+          </w:p>
+        </w:tc>
+        <w:tc>
+          <w:tcPr>
+            <w:tcW w:type="pct" w:w="4500%"/>
+          </w:tcPr>
+          <w:p>
+            <w:pPr>
+              <w:spacing w:after="60"/>
+            </w:pPr>
+            <w:r>
+              <w:t xml:space="preserve">Tempo, meter, default pitch/rhythm/voicing/density, tuning per instrument, humanize</w:t>
+            </w:r>
+          </w:p>
+        </w:tc>
+      </w:tr>
+      <w:tr>
+        <w:tc>
+          <w:tcPr>
+            <w:tcW w:type="pct" w:w="4500%"/>
+          </w:tcPr>
+          <w:p>
+            <w:pPr>
+              <w:spacing w:after="60"/>
+            </w:pPr>
+            <w:r>
+              <w:rPr>
+                <w:b/>
+                <w:bCs/>
+              </w:rPr>
+              <w:t xml:space="preserve">Section</w:t>
+            </w:r>
+          </w:p>
+        </w:tc>
+        <w:tc>
+          <w:tcPr>
+            <w:tcW w:type="pct" w:w="4500%"/>
+          </w:tcPr>
+          <w:p>
+            <w:pPr>
+              <w:spacing w:after="60"/>
+            </w:pPr>
+            <w:r>
+              <w:t xml:space="preserve">Bar range (e.g. 1–4), type (verse/chorus/solo…), optional parent via `inheritsFrom`, section profiles, transitions, per-instrument overrides</w:t>
+            </w:r>
+          </w:p>
+        </w:tc>
+      </w:tr>
+      <w:tr>
+        <w:tc>
+          <w:tcPr>
+            <w:tcW w:type="pct" w:w="4500%"/>
+          </w:tcPr>
+          <w:p>
+            <w:pPr>
+              <w:spacing w:after="60"/>
+            </w:pPr>
+            <w:r>
+              <w:rPr>
+                <w:b/>
+                <w:bCs/>
+              </w:rPr>
+              <w:t xml:space="preserve">LocalOverride</w:t>
+            </w:r>
+          </w:p>
+        </w:tc>
+        <w:tc>
+          <w:tcPr>
+            <w:tcW w:type="pct" w:w="4500%"/>
+          </w:tcPr>
+          <w:p>
+            <w:pPr>
+              <w:spacing w:after="60"/>
+            </w:pPr>
+            <w:r>
+              <w:t xml:space="preserve">“On bars 6–6 only, set metric displacement to 0.83”</w:t>
+            </w:r>
+          </w:p>
+        </w:tc>
+      </w:tr>
+      <w:tr>
+        <w:tc>
+          <w:tcPr>
+            <w:tcW w:type="pct" w:w="4500%"/>
+          </w:tcPr>
+          <w:p>
+            <w:pPr>
+              <w:spacing w:after="60"/>
+            </w:pPr>
+            <w:r>
+              <w:rPr>
+                <w:b/>
+                <w:bCs/>
+              </w:rPr>
+              <w:t xml:space="preserve">Effective context</w:t>
+            </w:r>
+          </w:p>
+        </w:tc>
+        <w:tc>
+          <w:tcPr>
+            <w:tcW w:type="pct" w:w="4500%"/>
+          </w:tcPr>
+          <w:p>
+            <w:pPr>
+              <w:spacing w:after="60"/>
+            </w:pPr>
+            <w:r>
+              <w:t xml:space="preserve">What the generator actually uses </w:t>
+            </w:r>
+            <w:r>
+              <w:rPr>
+                <w:b/>
+                <w:bCs/>
+              </w:rPr>
+              <w:t xml:space="preserve">on that bar</w:t>
+            </w:r>
+            <w:r>
+              <w:t xml:space="preserve"> after all layers are merged</w:t>
+            </w:r>
+          </w:p>
+        </w:tc>
+      </w:tr>
+    </w:tbl>
+    <w:p>
+      <w:pPr>
+        <w:spacing w:after="160"/>
+      </w:pPr>
+    </w:p>
+    <w:p>
+      <w:pPr>
+        <w:spacing w:after="160"/>
+      </w:pPr>
+      <w:r>
+        <w:rPr>
+          <w:b/>
+          <w:bCs/>
+        </w:rPr>
+        <w:t xml:space="preserve">Precedence (lowest wins first, last wins on conflicts)</w:t>
+      </w:r>
+    </w:p>
+    <w:p>
+      <w:pPr>
+        <w:spacing w:after="160"/>
+      </w:pPr>
+      <w:r>
+        <w:t xml:space="preserve">1. Song-wide defaults 2. Parent section if `inheritsFrom` is set 3. This section’s pitch / rhythm / voicing / energy 4. Instrument-specific overrides in that section 5. Local overrides on matching bars</w:t>
+      </w:r>
+    </w:p>
+    <w:p>
+      <w:pPr>
+        <w:spacing w:after="160"/>
+      </w:pPr>
+      <w:r>
+        <w:rPr>
+          <w:b/>
+          <w:bCs/>
+        </w:rPr>
+        <w:t xml:space="preserve">Sonic Youth example (already partly live via per-section VRB markers)</w:t>
+      </w:r>
+    </w:p>
+    <w:p>
+      <w:pPr>
+        <w:spacing w:after="80"/>
+        <w:ind w:left="360" w:hanging="260"/>
+      </w:pPr>
+      <w:r>
+        <w:t xml:space="preserve">• </w:t>
+      </w:r>
+      <w:r>
+        <w:rPr>
+          <w:b/>
+          <w:bCs/>
+        </w:rPr>
+        <w:t xml:space="preserve">Bars 1–4 (Section A):</w:t>
+      </w:r>
+      <w:r>
+        <w:t xml:space="preserve"> base Sonic Youth feel — grid, moderate outside level.</w:t>
+      </w:r>
+    </w:p>
+    <w:p>
+      <w:pPr>
+        <w:spacing w:after="80"/>
+        <w:ind w:left="360" w:hanging="260"/>
+      </w:pPr>
+      <w:r>
+        <w:t xml:space="preserve">• </w:t>
+      </w:r>
+      <w:r>
+        <w:rPr>
+          <w:b/>
+          <w:bCs/>
+        </w:rPr>
+        <w:t xml:space="preserve">Bars 5–8 (Section B):</w:t>
+      </w:r>
+      <w:r>
+        <w:t xml:space="preserve"> same chords/seed, but higher chromatic budget, stronger metric displacement, Slonimsky receipt </w:t>
+      </w:r>
+      <w:r>
+        <w:rPr>
+          <w:b/>
+          <w:bCs/>
+        </w:rPr>
+        <w:t xml:space="preserve">SY_SLON_01</w:t>
+      </w:r>
+      <w:r>
+        <w:t xml:space="preserve"> on the harmonic voice layer.</w:t>
+      </w:r>
+    </w:p>
+    <w:p>
+      <w:pPr>
+        <w:spacing w:after="160"/>
+      </w:pPr>
+      <w:r>
+        <w:t xml:space="preserve">You hear A as “normal noisy SY”; B as “same band, sabotaged metre and more chromatic grit” without re-importing a chart.</w:t>
+      </w:r>
+    </w:p>
+    <w:p>
+      <w:pPr>
+        <w:spacing w:after="160"/>
+      </w:pPr>
+      <w:r>
+        <w:rPr>
+          <w:b/>
+          <w:bCs/>
+        </w:rPr>
+        <w:t xml:space="preserve">What triggers regeneration when you edit architecture</w:t>
+      </w:r>
+    </w:p>
+    <w:tbl>
+      <w:tblPr>
+        <w:tblW w:type="pct" w:w="100%"/>
+        <w:tblBorders>
+          <w:top w:val="single" w:color="auto" w:sz="4"/>
+          <w:left w:val="single" w:color="auto" w:sz="4"/>
+          <w:bottom w:val="single" w:color="auto" w:sz="4"/>
+          <w:right w:val="single" w:color="auto" w:sz="4"/>
+          <w:insideH w:val="single" w:color="auto" w:sz="4"/>
+          <w:insideV w:val="single" w:color="auto" w:sz="4"/>
+        </w:tblBorders>
+      </w:tblPr>
+      <w:tblGrid>
+        <w:gridCol w:w="4500"/>
+        <w:gridCol w:w="4500"/>
+      </w:tblGrid>
+      <w:tr>
+        <w:tc>
+          <w:tcPr>
+            <w:tcW w:type="pct" w:w="4500%"/>
+          </w:tcPr>
+          <w:p>
+            <w:pPr>
+              <w:spacing w:after="60"/>
+            </w:pPr>
+            <w:r>
+              <w:t xml:space="preserve">You change…</w:t>
+            </w:r>
+          </w:p>
+        </w:tc>
+        <w:tc>
+          <w:tcPr>
+            <w:tcW w:type="pct" w:w="4500%"/>
+          </w:tcPr>
+          <w:p>
+            <w:pPr>
+              <w:spacing w:after="60"/>
+            </w:pPr>
+            <w:r>
+              <w:t xml:space="preserve">What re-generates</w:t>
+            </w:r>
+          </w:p>
+        </w:tc>
+      </w:tr>
+      <w:tr>
+        <w:tc>
+          <w:tcPr>
+            <w:tcW w:type="pct" w:w="4500%"/>
+          </w:tcPr>
+          <w:p>
+            <w:pPr>
+              <w:spacing w:after="60"/>
+            </w:pPr>
+            <w:r>
+              <w:t xml:space="preserve">A </w:t>
+            </w:r>
+            <w:r>
+              <w:rPr>
+                <w:b/>
+                <w:bCs/>
+              </w:rPr>
+              <w:t xml:space="preserve">named profile</w:t>
+            </w:r>
+            <w:r>
+              <w:t xml:space="preserve"> used in several sections</w:t>
+            </w:r>
+          </w:p>
+        </w:tc>
+        <w:tc>
+          <w:tcPr>
+            <w:tcW w:type="pct" w:w="4500%"/>
+          </w:tcPr>
+          <w:p>
+            <w:pPr>
+              <w:spacing w:after="60"/>
+            </w:pPr>
+            <w:r>
+              <w:t xml:space="preserve">Every section that references it</w:t>
+            </w:r>
+          </w:p>
+        </w:tc>
+      </w:tr>
+      <w:tr>
+        <w:tc>
+          <w:tcPr>
+            <w:tcW w:type="pct" w:w="4500%"/>
+          </w:tcPr>
+          <w:p>
+            <w:pPr>
+              <w:spacing w:after="60"/>
+            </w:pPr>
+            <w:r>
+              <w:t xml:space="preserve">A section’s </w:t>
+            </w:r>
+            <w:r>
+              <w:rPr>
+                <w:b/>
+                <w:bCs/>
+              </w:rPr>
+              <w:t xml:space="preserve">bar range</w:t>
+            </w:r>
+          </w:p>
+        </w:tc>
+        <w:tc>
+          <w:tcPr>
+            <w:tcW w:type="pct" w:w="4500%"/>
+          </w:tcPr>
+          <w:p>
+            <w:pPr>
+              <w:spacing w:after="60"/>
+            </w:pPr>
+            <w:r>
+              <w:t xml:space="preserve">That section + transition bars at both seams</w:t>
+            </w:r>
+          </w:p>
+        </w:tc>
+      </w:tr>
+      <w:tr>
+        <w:tc>
+          <w:tcPr>
+            <w:tcW w:type="pct" w:w="4500%"/>
+          </w:tcPr>
+          <w:p>
+            <w:pPr>
+              <w:spacing w:after="60"/>
+            </w:pPr>
+            <w:r>
+              <w:rPr>
+                <w:b/>
+                <w:bCs/>
+              </w:rPr>
+              <w:t xml:space="preserve">Instrument overrides</w:t>
+            </w:r>
+            <w:r>
+              <w:t xml:space="preserve"> in one section</w:t>
+            </w:r>
+          </w:p>
+        </w:tc>
+        <w:tc>
+          <w:tcPr>
+            <w:tcW w:type="pct" w:w="4500%"/>
+          </w:tcPr>
+          <w:p>
+            <w:pPr>
+              <w:spacing w:after="60"/>
+            </w:pPr>
+            <w:r>
+              <w:t xml:space="preserve">That section only</w:t>
+            </w:r>
+          </w:p>
+        </w:tc>
+      </w:tr>
+      <w:tr>
+        <w:tc>
+          <w:tcPr>
+            <w:tcW w:type="pct" w:w="4500%"/>
+          </w:tcPr>
+          <w:p>
+            <w:pPr>
+              <w:spacing w:after="60"/>
+            </w:pPr>
+            <w:r>
+              <w:t xml:space="preserve">A </w:t>
+            </w:r>
+            <w:r>
+              <w:rPr>
+                <w:b/>
+                <w:bCs/>
+              </w:rPr>
+              <w:t xml:space="preserve">local override</w:t>
+            </w:r>
+          </w:p>
+        </w:tc>
+        <w:tc>
+          <w:tcPr>
+            <w:tcW w:type="pct" w:w="4500%"/>
+          </w:tcPr>
+          <w:p>
+            <w:pPr>
+              <w:spacing w:after="60"/>
+            </w:pPr>
+            <w:r>
+              <w:t xml:space="preserve">Only the bars in its range</w:t>
+            </w:r>
+          </w:p>
+        </w:tc>
+      </w:tr>
+      <w:tr>
+        <w:tc>
+          <w:tcPr>
+            <w:tcW w:type="pct" w:w="4500%"/>
+          </w:tcPr>
+          <w:p>
+            <w:pPr>
+              <w:spacing w:after="60"/>
+            </w:pPr>
+            <w:r>
+              <w:rPr>
+                <w:b/>
+                <w:bCs/>
+              </w:rPr>
+              <w:t xml:space="preserve">`inheritsFrom`</w:t>
+            </w:r>
+          </w:p>
+        </w:tc>
+        <w:tc>
+          <w:tcPr>
+            <w:tcW w:type="pct" w:w="4500%"/>
+          </w:tcPr>
+          <w:p>
+            <w:pPr>
+              <w:spacing w:after="60"/>
+            </w:pPr>
+            <w:r>
+              <w:t xml:space="preserve">That section and all sections that inherit from it (directly or indirectly)</w:t>
+            </w:r>
+          </w:p>
+        </w:tc>
+      </w:tr>
+      <w:tr>
+        <w:tc>
+          <w:tcPr>
+            <w:tcW w:type="pct" w:w="4500%"/>
+          </w:tcPr>
+          <w:p>
+            <w:pPr>
+              <w:spacing w:after="60"/>
+            </w:pPr>
+            <w:r>
+              <w:rPr>
+                <w:b/>
+                <w:bCs/>
+              </w:rPr>
+              <w:t xml:space="preserve">Global Song defaults</w:t>
+            </w:r>
+          </w:p>
+        </w:tc>
+        <w:tc>
+          <w:tcPr>
+            <w:tcW w:type="pct" w:w="4500%"/>
+          </w:tcPr>
+          <w:p>
+            <w:pPr>
+              <w:spacing w:after="60"/>
+            </w:pPr>
+            <w:r>
+              <w:t xml:space="preserve">Whole piece</w:t>
+            </w:r>
+          </w:p>
+        </w:tc>
+      </w:tr>
+    </w:tbl>
+    <w:p>
+      <w:pPr>
+        <w:spacing w:after="160"/>
+      </w:pPr>
+    </w:p>
+    <w:p>
+      <w:pPr>
+        <w:spacing w:after="160"/>
+      </w:pPr>
+      <w:r>
+        <w:t xml:space="preserve">Edits that do </w:t>
+      </w:r>
+      <w:r>
+        <w:rPr>
+          <w:b/>
+          <w:bCs/>
+        </w:rPr>
+        <w:t xml:space="preserve">not</w:t>
+      </w:r>
+      <w:r>
+        <w:t xml:space="preserve"> force new notes: title/labels only, or documentation-only schema bumps with identical resolved values.</w:t>
+      </w:r>
+    </w:p>
+    <w:p>
+      <w:pPr>
+        <w:spacing w:after="160"/>
+      </w:pPr>
+      <w:r>
+        <w:rPr>
+          <w:b/>
+          <w:bCs/>
+        </w:rPr>
+        <w:t xml:space="preserve">Hard vs soft rules</w:t>
+      </w:r>
+    </w:p>
+    <w:p>
+      <w:pPr>
+        <w:spacing w:after="80"/>
+        <w:ind w:left="360" w:hanging="260"/>
+      </w:pPr>
+      <w:r>
+        <w:t xml:space="preserve">• </w:t>
+      </w:r>
+      <w:r>
+        <w:rPr>
+          <w:b/>
+          <w:bCs/>
+        </w:rPr>
+        <w:t xml:space="preserve">Hard (block save/load):</w:t>
+      </w:r>
+      <w:r>
+        <w:t xml:space="preserve"> overlapping sections, gaps in bar coverage, circular inheritance, tuning profile on wrong instrument, missing profile id after delete.</w:t>
+      </w:r>
+    </w:p>
+    <w:p>
+      <w:pPr>
+        <w:spacing w:after="80"/>
+        <w:ind w:left="360" w:hanging="260"/>
+      </w:pPr>
+      <w:r>
+        <w:t xml:space="preserve">• </w:t>
+      </w:r>
+      <w:r>
+        <w:rPr>
+          <w:b/>
+          <w:bCs/>
+        </w:rPr>
+        <w:t xml:space="preserve">Soft (warn, still generate):</w:t>
+      </w:r>
+      <w:r>
+        <w:t xml:space="preserve"> empty cell sets with sequence ops present, local override path the engine does not recognise yet, `meterMap` present before P7 (stored but not applied at render).</w:t>
+      </w:r>
+    </w:p>
+    <w:p>
+      <w:pPr>
+        <w:spacing w:after="160"/>
+      </w:pPr>
+      <w:r>
+        <w:t xml:space="preserve">Full spec: </w:t>
+      </w:r>
+      <w:r>
+        <w:rPr>
+          <w:b/>
+          <w:bCs/>
+        </w:rPr>
+        <w:t xml:space="preserve">`docs/COMPOSER_OS_SECTION_ARCHITECTURE.md`</w:t>
+      </w:r>
+      <w:r>
+        <w:t xml:space="preserve">. Types: </w:t>
+      </w:r>
+      <w:r>
+        <w:rPr>
+          <w:b/>
+          <w:bCs/>
+        </w:rPr>
+        <w:t xml:space="preserve">`engines/composer-os-v2/core/section-architecture/sectionArchitectureTypes.ts`</w:t>
+      </w:r>
+      <w:r>
+        <w:t xml:space="preserve">.</w:t>
       </w:r>
     </w:p>
     <w:p>

</xml_diff>

<commit_message>
feat(section-arch): P6 per-section meter resolution + Zappa GCE meter modes
Wire shared bar-meter precedence (song defaults -> section meterMap -> Zappa auto -> request override) through golden path and app API; keep Zappa phrase relax on main path for full smoke parity.

Co-authored-by: Cursor <cursoragent@cursor.com>
</commit_message>
<xml_diff>
--- a/docs/COMPOSER_OS_MUSICIAN_GUIDE.docx
+++ b/docs/COMPOSER_OS_MUSICIAN_GUIDE.docx
@@ -4993,15 +4993,15 @@
         <w:spacing w:after="100" w:before="160"/>
       </w:pPr>
       <w:r>
-        <w:t xml:space="preserve">2.9 Section architecture — Song, sections, and what changes when you edit (V64 P5)</w:t>
-      </w:r>
-    </w:p>
-    <w:p>
-      <w:pPr>
-        <w:spacing w:after="160"/>
-      </w:pPr>
-      <w:r>
-        <w:t xml:space="preserve">Composer OS is moving from “one global feel for the whole piece” to a </w:t>
+        <w:t xml:space="preserve">2.9 Section architecture — Song, sections, and per-section meter (V64 P6)</w:t>
+      </w:r>
+    </w:p>
+    <w:p>
+      <w:pPr>
+        <w:spacing w:after="160"/>
+      </w:pPr>
+      <w:r>
+        <w:t xml:space="preserve">Composer OS uses a </w:t>
       </w:r>
       <w:r>
         <w:rPr>
@@ -5031,27 +5031,7 @@
         <w:t xml:space="preserve">local overrides</w:t>
       </w:r>
       <w:r>
-        <w:t xml:space="preserve"> on specific bars. P5 ships the </w:t>
-      </w:r>
-      <w:r>
-        <w:rPr>
-          <w:b/>
-          <w:bCs/>
-        </w:rPr>
-        <w:t xml:space="preserve">TypeScript contract</w:t>
-      </w:r>
-      <w:r>
-        <w:t xml:space="preserve"> and the written rules; the engine </w:t>
-      </w:r>
-      <w:r>
-        <w:rPr>
-          <w:b/>
-          <w:bCs/>
-        </w:rPr>
-        <w:t xml:space="preserve">merges</w:t>
-      </w:r>
-      <w:r>
-        <w:t xml:space="preserve"> those fields per bar in P6 and applies </w:t>
+        <w:t xml:space="preserve"> on specific bars. P6 merges those fields per bar and applies </w:t>
       </w:r>
       <w:r>
         <w:rPr>
@@ -5061,7 +5041,7 @@
         <w:t xml:space="preserve">per-section meter</w:t>
       </w:r>
       <w:r>
-        <w:t xml:space="preserve"> in P7.</w:t>
+        <w:t xml:space="preserve"> at generate time (Song Mode, Guitar–Bass Duo, ECM, Big Band, String Quartet).</w:t>
       </w:r>
     </w:p>
     <w:p>
@@ -5211,7 +5191,17 @@
               <w:spacing w:after="60"/>
             </w:pPr>
             <w:r>
-              <w:t xml:space="preserve">Bar range (e.g. 1–4), type (verse/chorus/solo…), optional parent via `inheritsFrom`, section profiles, transitions, per-instrument overrides</w:t>
+              <w:t xml:space="preserve">Bar range (e.g. 1–4), type (verse/chorus/solo…), optional parent via `inheritsFrom`, section profiles, </w:t>
+            </w:r>
+            <w:r>
+              <w:rPr>
+                <w:b/>
+                <w:bCs/>
+              </w:rPr>
+              <w:t xml:space="preserve">`meterMap`</w:t>
+            </w:r>
+            <w:r>
+              <w:t xml:space="preserve">, transitions, per-instrument overrides</w:t>
             </w:r>
           </w:p>
         </w:tc>
@@ -5313,87 +5303,39 @@
         <w:spacing w:after="160"/>
       </w:pPr>
       <w:r>
-        <w:t xml:space="preserve">1. Song-wide defaults 2. Parent section if `inheritsFrom` is set 3. This section’s pitch / rhythm / voicing / energy 4. Instrument-specific overrides in that section 5. Local overrides on matching bars</w:t>
-      </w:r>
-    </w:p>
-    <w:p>
-      <w:pPr>
-        <w:spacing w:after="160"/>
-      </w:pPr>
-      <w:r>
-        <w:rPr>
-          <w:b/>
-          <w:bCs/>
-        </w:rPr>
-        <w:t xml:space="preserve">Sonic Youth example (already partly live via per-section VRB markers)</w:t>
-      </w:r>
-    </w:p>
-    <w:p>
-      <w:pPr>
-        <w:spacing w:after="80"/>
-        <w:ind w:left="360" w:hanging="260"/>
-      </w:pPr>
-      <w:r>
-        <w:t xml:space="preserve">• </w:t>
-      </w:r>
-      <w:r>
-        <w:rPr>
-          <w:b/>
-          <w:bCs/>
-        </w:rPr>
-        <w:t xml:space="preserve">Bars 1–4 (Section A):</w:t>
-      </w:r>
-      <w:r>
-        <w:t xml:space="preserve"> base Sonic Youth feel — grid, moderate outside level.</w:t>
-      </w:r>
-    </w:p>
-    <w:p>
-      <w:pPr>
-        <w:spacing w:after="80"/>
-        <w:ind w:left="360" w:hanging="260"/>
-      </w:pPr>
-      <w:r>
-        <w:t xml:space="preserve">• </w:t>
-      </w:r>
-      <w:r>
-        <w:rPr>
-          <w:b/>
-          <w:bCs/>
-        </w:rPr>
-        <w:t xml:space="preserve">Bars 5–8 (Section B):</w:t>
-      </w:r>
-      <w:r>
-        <w:t xml:space="preserve"> same chords/seed, but higher chromatic budget, stronger metric displacement, Slonimsky receipt </w:t>
-      </w:r>
-      <w:r>
-        <w:rPr>
-          <w:b/>
-          <w:bCs/>
-        </w:rPr>
-        <w:t xml:space="preserve">SY_SLON_01</w:t>
-      </w:r>
-      <w:r>
-        <w:t xml:space="preserve"> on the harmonic voice layer.</w:t>
-      </w:r>
-    </w:p>
-    <w:p>
-      <w:pPr>
-        <w:spacing w:after="160"/>
-      </w:pPr>
-      <w:r>
-        <w:t xml:space="preserve">You hear A as “normal noisy SY”; B as “same band, sabotaged metre and more chromatic grit” without re-importing a chart.</w:t>
-      </w:r>
-    </w:p>
-    <w:p>
-      <w:pPr>
-        <w:spacing w:after="160"/>
-      </w:pPr>
-      <w:r>
-        <w:rPr>
-          <w:b/>
-          <w:bCs/>
-        </w:rPr>
-        <w:t xml:space="preserve">What triggers regeneration when you edit architecture</w:t>
+        <w:t xml:space="preserve">1. Song-wide defaults (`SongDefaults.meter`, profiles, tempo…) 2. Parent section if `inheritsFrom` is set 3. This section’s pitch / rhythm / voicing / energy / </w:t>
+      </w:r>
+      <w:r>
+        <w:rPr>
+          <w:b/>
+          <w:bCs/>
+        </w:rPr>
+        <w:t xml:space="preserve">`meterMap`</w:t>
+      </w:r>
+      <w:r>
+        <w:t xml:space="preserve"> 4. Instrument-specific overrides in that section 5. Local overrides on matching bars 6. </w:t>
+      </w:r>
+      <w:r>
+        <w:rPr>
+          <w:b/>
+          <w:bCs/>
+        </w:rPr>
+        <w:t xml:space="preserve">Manual API `barMeterMap`</w:t>
+      </w:r>
+      <w:r>
+        <w:t xml:space="preserve"> — always wins per bar when you set it explicitly</w:t>
+      </w:r>
+    </w:p>
+    <w:p>
+      <w:pPr>
+        <w:spacing w:after="160"/>
+      </w:pPr>
+      <w:r>
+        <w:rPr>
+          <w:b/>
+          <w:bCs/>
+        </w:rPr>
+        <w:t xml:space="preserve">Meter stack (when Zappa GCE structural mode is active)</w:t>
       </w:r>
     </w:p>
     <w:tbl>
@@ -5422,6 +5364,584 @@
               <w:spacing w:after="60"/>
             </w:pPr>
             <w:r>
+              <w:t xml:space="preserve">Priority</w:t>
+            </w:r>
+          </w:p>
+        </w:tc>
+        <w:tc>
+          <w:tcPr>
+            <w:tcW w:type="pct" w:w="4500%"/>
+          </w:tcPr>
+          <w:p>
+            <w:pPr>
+              <w:spacing w:after="60"/>
+            </w:pPr>
+            <w:r>
+              <w:t xml:space="preserve">Source</w:t>
+            </w:r>
+          </w:p>
+        </w:tc>
+      </w:tr>
+      <w:tr>
+        <w:tc>
+          <w:tcPr>
+            <w:tcW w:type="pct" w:w="4500%"/>
+          </w:tcPr>
+          <w:p>
+            <w:pPr>
+              <w:spacing w:after="60"/>
+            </w:pPr>
+            <w:r>
+              <w:t xml:space="preserve">Highest</w:t>
+            </w:r>
+          </w:p>
+        </w:tc>
+        <w:tc>
+          <w:tcPr>
+            <w:tcW w:type="pct" w:w="4500%"/>
+          </w:tcPr>
+          <w:p>
+            <w:pPr>
+              <w:spacing w:after="60"/>
+            </w:pPr>
+            <w:r>
+              <w:t xml:space="preserve">Request `barMeterMap` (manual API)</w:t>
+            </w:r>
+          </w:p>
+        </w:tc>
+      </w:tr>
+      <w:tr>
+        <w:tc>
+          <w:tcPr>
+            <w:tcW w:type="pct" w:w="4500%"/>
+          </w:tcPr>
+          <w:p>
+            <w:pPr>
+              <w:spacing w:after="60"/>
+            </w:pPr>
+            <w:r>
+              <w:t xml:space="preserve">↑</w:t>
+            </w:r>
+          </w:p>
+        </w:tc>
+        <w:tc>
+          <w:tcPr>
+            <w:tcW w:type="pct" w:w="4500%"/>
+          </w:tcPr>
+          <w:p>
+            <w:pPr>
+              <w:spacing w:after="60"/>
+            </w:pPr>
+            <w:r>
+              <w:t xml:space="preserve">Section `meterMap` (Song schema)</w:t>
+            </w:r>
+          </w:p>
+        </w:tc>
+      </w:tr>
+      <w:tr>
+        <w:tc>
+          <w:tcPr>
+            <w:tcW w:type="pct" w:w="4500%"/>
+          </w:tcPr>
+          <w:p>
+            <w:pPr>
+              <w:spacing w:after="60"/>
+            </w:pPr>
+            <w:r>
+              <w:t xml:space="preserve">↑</w:t>
+            </w:r>
+          </w:p>
+        </w:tc>
+        <w:tc>
+          <w:tcPr>
+            <w:tcW w:type="pct" w:w="4500%"/>
+          </w:tcPr>
+          <w:p>
+            <w:pPr>
+              <w:spacing w:after="60"/>
+            </w:pPr>
+            <w:r>
+              <w:t xml:space="preserve">Zappa GCE auto meter (mode-dependent — see below)</w:t>
+            </w:r>
+          </w:p>
+        </w:tc>
+      </w:tr>
+      <w:tr>
+        <w:tc>
+          <w:tcPr>
+            <w:tcW w:type="pct" w:w="4500%"/>
+          </w:tcPr>
+          <w:p>
+            <w:pPr>
+              <w:spacing w:after="60"/>
+            </w:pPr>
+            <w:r>
+              <w:t xml:space="preserve">Lowest</w:t>
+            </w:r>
+          </w:p>
+        </w:tc>
+        <w:tc>
+          <w:tcPr>
+            <w:tcW w:type="pct" w:w="4500%"/>
+          </w:tcPr>
+          <w:p>
+            <w:pPr>
+              <w:spacing w:after="60"/>
+            </w:pPr>
+            <w:r>
+              <w:t xml:space="preserve">`SongDefaults.meter` (global fallback; compositions without a Song document unchanged)</w:t>
+            </w:r>
+          </w:p>
+        </w:tc>
+      </w:tr>
+    </w:tbl>
+    <w:p>
+      <w:pPr>
+        <w:spacing w:after="160"/>
+      </w:pPr>
+    </w:p>
+    <w:p>
+      <w:pPr>
+        <w:spacing w:after="160"/>
+      </w:pPr>
+      <w:r>
+        <w:rPr>
+          <w:b/>
+          <w:bCs/>
+        </w:rPr>
+        <w:t xml:space="preserve">Per-section meter — plain English</w:t>
+      </w:r>
+    </w:p>
+    <w:p>
+      <w:pPr>
+        <w:spacing w:after="160"/>
+      </w:pPr>
+      <w:r>
+        <w:t xml:space="preserve">Set a different time signature per section without re-pasting chords. Example </w:t>
+      </w:r>
+      <w:r>
+        <w:rPr>
+          <w:b/>
+          <w:bCs/>
+        </w:rPr>
+        <w:t xml:space="preserve">String Quartet</w:t>
+      </w:r>
+      <w:r>
+        <w:t xml:space="preserve">: </w:t>
+      </w:r>
+      <w:r>
+        <w:rPr>
+          <w:b/>
+          <w:bCs/>
+        </w:rPr>
+        <w:t xml:space="preserve">4/4</w:t>
+      </w:r>
+      <w:r>
+        <w:t xml:space="preserve"> verse (bars 1–4) → </w:t>
+      </w:r>
+      <w:r>
+        <w:rPr>
+          <w:b/>
+          <w:bCs/>
+        </w:rPr>
+        <w:t xml:space="preserve">7/8</w:t>
+      </w:r>
+      <w:r>
+        <w:t xml:space="preserve"> bridge (bars 5–8) → </w:t>
+      </w:r>
+      <w:r>
+        <w:rPr>
+          <w:b/>
+          <w:bCs/>
+        </w:rPr>
+        <w:t xml:space="preserve">3/4</w:t>
+      </w:r>
+      <w:r>
+        <w:t xml:space="preserve"> outro (bars 9–12). Example </w:t>
+      </w:r>
+      <w:r>
+        <w:rPr>
+          <w:b/>
+          <w:bCs/>
+        </w:rPr>
+        <w:t xml:space="preserve">Big Band</w:t>
+      </w:r>
+      <w:r>
+        <w:t xml:space="preserve">: </w:t>
+      </w:r>
+      <w:r>
+        <w:rPr>
+          <w:b/>
+          <w:bCs/>
+        </w:rPr>
+        <w:t xml:space="preserve">4/4</w:t>
+      </w:r>
+      <w:r>
+        <w:t xml:space="preserve"> head → </w:t>
+      </w:r>
+      <w:r>
+        <w:rPr>
+          <w:b/>
+          <w:bCs/>
+        </w:rPr>
+        <w:t xml:space="preserve">5/4</w:t>
+      </w:r>
+      <w:r>
+        <w:t xml:space="preserve"> solo section. Each section’s `meterMap` carries forward inside that section until the next span.</w:t>
+      </w:r>
+    </w:p>
+    <w:p>
+      <w:pPr>
+        <w:spacing w:after="160"/>
+      </w:pPr>
+      <w:r>
+        <w:rPr>
+          <w:b/>
+          <w:bCs/>
+        </w:rPr>
+        <w:t xml:space="preserve">Frank Zappa GCE — `zappaGceMeterMode`</w:t>
+      </w:r>
+    </w:p>
+    <w:p>
+      <w:pPr>
+        <w:spacing w:after="160"/>
+      </w:pPr>
+      <w:r>
+        <w:t xml:space="preserve">When Zappa GCE auto meter is enabled (`zappaGceAutoBarMeterMapEnabled`), choose how it interacts with section meter:</w:t>
+      </w:r>
+    </w:p>
+    <w:tbl>
+      <w:tblPr>
+        <w:tblW w:type="pct" w:w="100%"/>
+        <w:tblBorders>
+          <w:top w:val="single" w:color="auto" w:sz="4"/>
+          <w:left w:val="single" w:color="auto" w:sz="4"/>
+          <w:bottom w:val="single" w:color="auto" w:sz="4"/>
+          <w:right w:val="single" w:color="auto" w:sz="4"/>
+          <w:insideH w:val="single" w:color="auto" w:sz="4"/>
+          <w:insideV w:val="single" w:color="auto" w:sz="4"/>
+        </w:tblBorders>
+      </w:tblPr>
+      <w:tblGrid>
+        <w:gridCol w:w="3000"/>
+        <w:gridCol w:w="3000"/>
+        <w:gridCol w:w="3000"/>
+      </w:tblGrid>
+      <w:tr>
+        <w:tc>
+          <w:tcPr>
+            <w:tcW w:type="pct" w:w="3000%"/>
+          </w:tcPr>
+          <w:p>
+            <w:pPr>
+              <w:spacing w:after="60"/>
+            </w:pPr>
+            <w:r>
+              <w:t xml:space="preserve">Mode</w:t>
+            </w:r>
+          </w:p>
+        </w:tc>
+        <w:tc>
+          <w:tcPr>
+            <w:tcW w:type="pct" w:w="3000%"/>
+          </w:tcPr>
+          <w:p>
+            <w:pPr>
+              <w:spacing w:after="60"/>
+            </w:pPr>
+            <w:r>
+              <w:t xml:space="preserve">What it does</w:t>
+            </w:r>
+          </w:p>
+        </w:tc>
+        <w:tc>
+          <w:tcPr>
+            <w:tcW w:type="pct" w:w="3000%"/>
+          </w:tcPr>
+          <w:p>
+            <w:pPr>
+              <w:spacing w:after="60"/>
+            </w:pPr>
+            <w:r>
+              <w:t xml:space="preserve">When to use</w:t>
+            </w:r>
+          </w:p>
+        </w:tc>
+      </w:tr>
+      <w:tr>
+        <w:tc>
+          <w:tcPr>
+            <w:tcW w:type="pct" w:w="3000%"/>
+          </w:tcPr>
+          <w:p>
+            <w:pPr>
+              <w:spacing w:after="60"/>
+            </w:pPr>
+            <w:r>
+              <w:rPr>
+                <w:b/>
+                <w:bCs/>
+              </w:rPr>
+              <w:t xml:space="preserve">`disrupt`</w:t>
+            </w:r>
+            <w:r>
+              <w:t xml:space="preserve"> (default)</w:t>
+            </w:r>
+          </w:p>
+        </w:tc>
+        <w:tc>
+          <w:tcPr>
+            <w:tcW w:type="pct" w:w="3000%"/>
+          </w:tcPr>
+          <w:p>
+            <w:pPr>
+              <w:spacing w:after="60"/>
+            </w:pPr>
+            <w:r>
+              <w:t xml:space="preserve">Zappa 7/8 + 5/4 + 4/4 splice </w:t>
+            </w:r>
+            <w:r>
+              <w:rPr>
+                <w:b/>
+                <w:bCs/>
+              </w:rPr>
+              <w:t xml:space="preserve">overlays</w:t>
+            </w:r>
+            <w:r>
+              <w:t xml:space="preserve"> section meter</w:t>
+            </w:r>
+          </w:p>
+        </w:tc>
+        <w:tc>
+          <w:tcPr>
+            <w:tcW w:type="pct" w:w="3000%"/>
+          </w:tcPr>
+          <w:p>
+            <w:pPr>
+              <w:spacing w:after="60"/>
+            </w:pPr>
+            <w:r>
+              <w:t xml:space="preserve">Classic Zappa chaos on top of your form</w:t>
+            </w:r>
+          </w:p>
+        </w:tc>
+      </w:tr>
+      <w:tr>
+        <w:tc>
+          <w:tcPr>
+            <w:tcW w:type="pct" w:w="3000%"/>
+          </w:tcPr>
+          <w:p>
+            <w:pPr>
+              <w:spacing w:after="60"/>
+            </w:pPr>
+            <w:r>
+              <w:rPr>
+                <w:b/>
+                <w:bCs/>
+              </w:rPr>
+              <w:t xml:space="preserve">`respect`</w:t>
+            </w:r>
+          </w:p>
+        </w:tc>
+        <w:tc>
+          <w:tcPr>
+            <w:tcW w:type="pct" w:w="3000%"/>
+          </w:tcPr>
+          <w:p>
+            <w:pPr>
+              <w:spacing w:after="60"/>
+            </w:pPr>
+            <w:r>
+              <w:t xml:space="preserve">Zappa structural behaviours fire; </w:t>
+            </w:r>
+            <w:r>
+              <w:rPr>
+                <w:b/>
+                <w:bCs/>
+              </w:rPr>
+              <w:t xml:space="preserve">section meter untouched</w:t>
+            </w:r>
+          </w:p>
+        </w:tc>
+        <w:tc>
+          <w:tcPr>
+            <w:tcW w:type="pct" w:w="3000%"/>
+          </w:tcPr>
+          <w:p>
+            <w:pPr>
+              <w:spacing w:after="60"/>
+            </w:pPr>
+            <w:r>
+              <w:rPr>
+                <w:b/>
+                <w:bCs/>
+              </w:rPr>
+              <w:t xml:space="preserve">String Quartet + Zappa</w:t>
+            </w:r>
+            <w:r>
+              <w:t xml:space="preserve"> — harmony/texture without wrecking your 7/8 bridge</w:t>
+            </w:r>
+          </w:p>
+        </w:tc>
+      </w:tr>
+      <w:tr>
+        <w:tc>
+          <w:tcPr>
+            <w:tcW w:type="pct" w:w="3000%"/>
+          </w:tcPr>
+          <w:p>
+            <w:pPr>
+              <w:spacing w:after="60"/>
+            </w:pPr>
+            <w:r>
+              <w:rPr>
+                <w:b/>
+                <w:bCs/>
+              </w:rPr>
+              <w:t xml:space="preserve">`own`</w:t>
+            </w:r>
+          </w:p>
+        </w:tc>
+        <w:tc>
+          <w:tcPr>
+            <w:tcW w:type="pct" w:w="3000%"/>
+          </w:tcPr>
+          <w:p>
+            <w:pPr>
+              <w:spacing w:after="60"/>
+            </w:pPr>
+            <w:r>
+              <w:t xml:space="preserve">Zappa owns meter; section meter ignored (`req.barMeterMap` still wins)</w:t>
+            </w:r>
+          </w:p>
+        </w:tc>
+        <w:tc>
+          <w:tcPr>
+            <w:tcW w:type="pct" w:w="3000%"/>
+          </w:tcPr>
+          <w:p>
+            <w:pPr>
+              <w:spacing w:after="60"/>
+            </w:pPr>
+            <w:r>
+              <w:t xml:space="preserve">Full Zappa metric takeover</w:t>
+            </w:r>
+          </w:p>
+        </w:tc>
+      </w:tr>
+    </w:tbl>
+    <w:p>
+      <w:pPr>
+        <w:spacing w:after="160"/>
+      </w:pPr>
+    </w:p>
+    <w:p>
+      <w:pPr>
+        <w:spacing w:after="160"/>
+      </w:pPr>
+      <w:r>
+        <w:rPr>
+          <w:b/>
+          <w:bCs/>
+        </w:rPr>
+        <w:t xml:space="preserve">Sonic Youth example (partly live via per-section VRB markers)</w:t>
+      </w:r>
+    </w:p>
+    <w:p>
+      <w:pPr>
+        <w:spacing w:after="80"/>
+        <w:ind w:left="360" w:hanging="260"/>
+      </w:pPr>
+      <w:r>
+        <w:t xml:space="preserve">• </w:t>
+      </w:r>
+      <w:r>
+        <w:rPr>
+          <w:b/>
+          <w:bCs/>
+        </w:rPr>
+        <w:t xml:space="preserve">Bars 1–4 (Section A):</w:t>
+      </w:r>
+      <w:r>
+        <w:t xml:space="preserve"> base Sonic Youth feel — grid, moderate outside level.</w:t>
+      </w:r>
+    </w:p>
+    <w:p>
+      <w:pPr>
+        <w:spacing w:after="80"/>
+        <w:ind w:left="360" w:hanging="260"/>
+      </w:pPr>
+      <w:r>
+        <w:t xml:space="preserve">• </w:t>
+      </w:r>
+      <w:r>
+        <w:rPr>
+          <w:b/>
+          <w:bCs/>
+        </w:rPr>
+        <w:t xml:space="preserve">Bars 5–8 (Section B):</w:t>
+      </w:r>
+      <w:r>
+        <w:t xml:space="preserve"> same chords/seed, but higher chromatic budget, stronger metric displacement, Slonimsky receipt </w:t>
+      </w:r>
+      <w:r>
+        <w:rPr>
+          <w:b/>
+          <w:bCs/>
+        </w:rPr>
+        <w:t xml:space="preserve">SY_SLON_01</w:t>
+      </w:r>
+      <w:r>
+        <w:t xml:space="preserve"> on the harmonic voice layer.</w:t>
+      </w:r>
+    </w:p>
+    <w:p>
+      <w:pPr>
+        <w:spacing w:after="160"/>
+      </w:pPr>
+      <w:r>
+        <w:t xml:space="preserve">You hear A as “normal noisy SY”; B as “same band, sabotaged metre and more chromatic grit” without re-importing a chart.</w:t>
+      </w:r>
+    </w:p>
+    <w:p>
+      <w:pPr>
+        <w:spacing w:after="160"/>
+      </w:pPr>
+      <w:r>
+        <w:rPr>
+          <w:b/>
+          <w:bCs/>
+        </w:rPr>
+        <w:t xml:space="preserve">What triggers regeneration when you edit architecture</w:t>
+      </w:r>
+    </w:p>
+    <w:tbl>
+      <w:tblPr>
+        <w:tblW w:type="pct" w:w="100%"/>
+        <w:tblBorders>
+          <w:top w:val="single" w:color="auto" w:sz="4"/>
+          <w:left w:val="single" w:color="auto" w:sz="4"/>
+          <w:bottom w:val="single" w:color="auto" w:sz="4"/>
+          <w:right w:val="single" w:color="auto" w:sz="4"/>
+          <w:insideH w:val="single" w:color="auto" w:sz="4"/>
+          <w:insideV w:val="single" w:color="auto" w:sz="4"/>
+        </w:tblBorders>
+      </w:tblPr>
+      <w:tblGrid>
+        <w:gridCol w:w="4500"/>
+        <w:gridCol w:w="4500"/>
+      </w:tblGrid>
+      <w:tr>
+        <w:tc>
+          <w:tcPr>
+            <w:tcW w:type="pct" w:w="4500%"/>
+          </w:tcPr>
+          <w:p>
+            <w:pPr>
+              <w:spacing w:after="60"/>
+            </w:pPr>
+            <w:r>
               <w:t xml:space="preserve">You change…</w:t>
             </w:r>
           </w:p>
@@ -5527,6 +6047,41 @@
                 <w:b/>
                 <w:bCs/>
               </w:rPr>
+              <w:t xml:space="preserve">`meterMap`</w:t>
+            </w:r>
+            <w:r>
+              <w:t xml:space="preserve"> on a section</w:t>
+            </w:r>
+          </w:p>
+        </w:tc>
+        <w:tc>
+          <w:tcPr>
+            <w:tcW w:type="pct" w:w="4500%"/>
+          </w:tcPr>
+          <w:p>
+            <w:pPr>
+              <w:spacing w:after="60"/>
+            </w:pPr>
+            <w:r>
+              <w:t xml:space="preserve">That section’s bars</w:t>
+            </w:r>
+          </w:p>
+        </w:tc>
+      </w:tr>
+      <w:tr>
+        <w:tc>
+          <w:tcPr>
+            <w:tcW w:type="pct" w:w="4500%"/>
+          </w:tcPr>
+          <w:p>
+            <w:pPr>
+              <w:spacing w:after="60"/>
+            </w:pPr>
+            <w:r>
+              <w:rPr>
+                <w:b/>
+                <w:bCs/>
+              </w:rPr>
               <w:t xml:space="preserve">Instrument overrides</w:t>
             </w:r>
             <w:r>
@@ -5718,7 +6273,7 @@
         <w:t xml:space="preserve">Soft (warn, still generate):</w:t>
       </w:r>
       <w:r>
-        <w:t xml:space="preserve"> empty cell sets with sequence ops present, local override path the engine does not recognise yet, `meterMap` present before P7 (stored but not applied at render).</w:t>
+        <w:t xml:space="preserve"> empty cell sets with sequence ops present, local override path the engine does not recognise yet.</w:t>
       </w:r>
     </w:p>
     <w:p>
@@ -5736,14 +6291,14 @@
         <w:t xml:space="preserve">`docs/COMPOSER_OS_SECTION_ARCHITECTURE.md`</w:t>
       </w:r>
       <w:r>
-        <w:t xml:space="preserve">. Types: </w:t>
-      </w:r>
-      <w:r>
-        <w:rPr>
-          <w:b/>
-          <w:bCs/>
-        </w:rPr>
-        <w:t xml:space="preserve">`engines/composer-os-v2/core/section-architecture/sectionArchitectureTypes.ts`</w:t>
+        <w:t xml:space="preserve">. Types + resolution: </w:t>
+      </w:r>
+      <w:r>
+        <w:rPr>
+          <w:b/>
+          <w:bCs/>
+        </w:rPr>
+        <w:t xml:space="preserve">`engines/composer-os-v2/core/section-architecture/`</w:t>
       </w:r>
       <w:r>
         <w:t xml:space="preserve">.</w:t>

</xml_diff>

<commit_message>
feat(section-architecture): V65 P1 wire Song schema at generate time
Bridge Song.sections to FormMap at pipeline entry, cache resolveEffectiveContext per bar, and fan pitch/rhythm/voicing/density/riffMode into golden-path consumers. Goldens 80001/80002 off smoke; musician guide Part 10 + docx.
</commit_message>
<xml_diff>
--- a/docs/COMPOSER_OS_MUSICIAN_GUIDE.docx
+++ b/docs/COMPOSER_OS_MUSICIAN_GUIDE.docx
@@ -15100,6 +15100,983 @@
     </w:p>
     <w:p>
       <w:pPr>
+        <w:pStyle w:val="Heading1"/>
+        <w:spacing w:after="120" w:before="200"/>
+      </w:pPr>
+      <w:r>
+        <w:t xml:space="preserve">Part 10 — Section architecture (Song object)</w:t>
+      </w:r>
+    </w:p>
+    <w:p>
+      <w:pPr>
+        <w:spacing w:after="160"/>
+      </w:pPr>
+      <w:r>
+        <w:t xml:space="preserve">*What changes when you attach a multi-section </w:t>
+      </w:r>
+      <w:r>
+        <w:rPr>
+          <w:b/>
+          <w:bCs/>
+        </w:rPr>
+        <w:t xml:space="preserve">Song</w:t>
+      </w:r>
+      <w:r>
+        <w:t xml:space="preserve"> document to Generate.*</w:t>
+      </w:r>
+    </w:p>
+    <w:p>
+      <w:pPr>
+        <w:pStyle w:val="Heading2"/>
+        <w:spacing w:after="100" w:before="160"/>
+      </w:pPr>
+      <w:r>
+        <w:t xml:space="preserve">10.1 What it means in practice</w:t>
+      </w:r>
+    </w:p>
+    <w:p>
+      <w:pPr>
+        <w:spacing w:after="160"/>
+      </w:pPr>
+      <w:r>
+        <w:t xml:space="preserve">Composer OS can accept a </w:t>
+      </w:r>
+      <w:r>
+        <w:rPr>
+          <w:b/>
+          <w:bCs/>
+        </w:rPr>
+        <w:t xml:space="preserve">Song</w:t>
+      </w:r>
+      <w:r>
+        <w:t xml:space="preserve"> object alongside your chord progression. Each </w:t>
+      </w:r>
+      <w:r>
+        <w:rPr>
+          <w:b/>
+          <w:bCs/>
+        </w:rPr>
+        <w:t xml:space="preserve">section</w:t>
+      </w:r>
+      <w:r>
+        <w:t xml:space="preserve"> (Intro, Verse, Chorus, Bridge, Outro, etc.) carries its own:</w:t>
+      </w:r>
+    </w:p>
+    <w:p>
+      <w:pPr>
+        <w:spacing w:after="80"/>
+        <w:ind w:left="360" w:hanging="260"/>
+      </w:pPr>
+      <w:r>
+        <w:t xml:space="preserve">• </w:t>
+      </w:r>
+      <w:r>
+        <w:rPr>
+          <w:b/>
+          <w:bCs/>
+        </w:rPr>
+        <w:t xml:space="preserve">Pitch profile</w:t>
+      </w:r>
+      <w:r>
+        <w:t xml:space="preserve"> — register floor/ceiling, chromatic budget</w:t>
+      </w:r>
+    </w:p>
+    <w:p>
+      <w:pPr>
+        <w:spacing w:after="80"/>
+        <w:ind w:left="360" w:hanging="260"/>
+      </w:pPr>
+      <w:r>
+        <w:t xml:space="preserve">• </w:t>
+      </w:r>
+      <w:r>
+        <w:rPr>
+          <w:b/>
+          <w:bCs/>
+        </w:rPr>
+        <w:t xml:space="preserve">Rhythm profile</w:t>
+      </w:r>
+      <w:r>
+        <w:t xml:space="preserve"> — anti-metric feel, metric displacement</w:t>
+      </w:r>
+    </w:p>
+    <w:p>
+      <w:pPr>
+        <w:spacing w:after="80"/>
+        <w:ind w:left="360" w:hanging="260"/>
+      </w:pPr>
+      <w:r>
+        <w:t xml:space="preserve">• </w:t>
+      </w:r>
+      <w:r>
+        <w:rPr>
+          <w:b/>
+          <w:bCs/>
+        </w:rPr>
+        <w:t xml:space="preserve">Voicing profile</w:t>
+      </w:r>
+      <w:r>
+        <w:t xml:space="preserve"> — spread and harmonic-rhythm hold windows</w:t>
+      </w:r>
+    </w:p>
+    <w:p>
+      <w:pPr>
+        <w:spacing w:after="80"/>
+        <w:ind w:left="360" w:hanging="260"/>
+      </w:pPr>
+      <w:r>
+        <w:t xml:space="preserve">• </w:t>
+      </w:r>
+      <w:r>
+        <w:rPr>
+          <w:b/>
+          <w:bCs/>
+        </w:rPr>
+        <w:t xml:space="preserve">Energy</w:t>
+      </w:r>
+      <w:r>
+        <w:t xml:space="preserve"> — maps to an overall density arc for that section</w:t>
+      </w:r>
+    </w:p>
+    <w:p>
+      <w:pPr>
+        <w:spacing w:after="80"/>
+        <w:ind w:left="360" w:hanging="260"/>
+      </w:pPr>
+      <w:r>
+        <w:t xml:space="preserve">• </w:t>
+      </w:r>
+      <w:r>
+        <w:rPr>
+          <w:b/>
+          <w:bCs/>
+        </w:rPr>
+        <w:t xml:space="preserve">Instrument overrides</w:t>
+      </w:r>
+      <w:r>
+        <w:t xml:space="preserve"> — per-part </w:t>
+      </w:r>
+      <w:r>
+        <w:rPr>
+          <w:b/>
+          <w:bCs/>
+        </w:rPr>
+        <w:t xml:space="preserve">density</w:t>
+      </w:r>
+      <w:r>
+        <w:t xml:space="preserve"> and </w:t>
+      </w:r>
+      <w:r>
+        <w:rPr>
+          <w:b/>
+          <w:bCs/>
+        </w:rPr>
+        <w:t xml:space="preserve">riffMode</w:t>
+      </w:r>
+      <w:r>
+        <w:t xml:space="preserve"> (guitar and bass independently)</w:t>
+      </w:r>
+    </w:p>
+    <w:p>
+      <w:pPr>
+        <w:spacing w:after="160"/>
+      </w:pPr>
+      <w:r>
+        <w:t xml:space="preserve">At generate time the engine:</w:t>
+      </w:r>
+    </w:p>
+    <w:p>
+      <w:pPr>
+        <w:spacing w:after="160"/>
+      </w:pPr>
+      <w:r>
+        <w:t xml:space="preserve">1. Validates the Song (`validateSong`) — overlapping sections or bad bar ranges halt with a clear error 2. Bridges section labels into the form map (Intro / Verse / Chorus appear as rehearsal marks) 3. Resolves </w:t>
+      </w:r>
+      <w:r>
+        <w:rPr>
+          <w:b/>
+          <w:bCs/>
+        </w:rPr>
+        <w:t xml:space="preserve">`resolveEffectiveContext(bar, song)`</w:t>
+      </w:r>
+      <w:r>
+        <w:t xml:space="preserve"> per bar — cached for the run 4. Fans resolved profiles into harmony rhythm, voicing spread, pitch fields, and duo density</w:t>
+      </w:r>
+    </w:p>
+    <w:p>
+      <w:pPr>
+        <w:spacing w:after="160"/>
+      </w:pPr>
+      <w:r>
+        <w:rPr>
+          <w:b/>
+          <w:bCs/>
+        </w:rPr>
+        <w:t xml:space="preserve">No Song object?</w:t>
+      </w:r>
+      <w:r>
+        <w:t xml:space="preserve"> Nothing changes — global defaults only, same as before V65.</w:t>
+      </w:r>
+    </w:p>
+    <w:p>
+      <w:pPr>
+        <w:pStyle w:val="Heading2"/>
+        <w:spacing w:after="100" w:before="160"/>
+      </w:pPr>
+      <w:r>
+        <w:t xml:space="preserve">10.2 Sonic Youth five-section example (seed 80001)</w:t>
+      </w:r>
+    </w:p>
+    <w:p>
+      <w:pPr>
+        <w:spacing w:after="160"/>
+      </w:pPr>
+      <w:r>
+        <w:t xml:space="preserve">A 16-bar Song Mode piece with five sections:</w:t>
+      </w:r>
+    </w:p>
+    <w:tbl>
+      <w:tblPr>
+        <w:tblW w:type="pct" w:w="100%"/>
+        <w:tblBorders>
+          <w:top w:val="single" w:color="auto" w:sz="4"/>
+          <w:left w:val="single" w:color="auto" w:sz="4"/>
+          <w:bottom w:val="single" w:color="auto" w:sz="4"/>
+          <w:right w:val="single" w:color="auto" w:sz="4"/>
+          <w:insideH w:val="single" w:color="auto" w:sz="4"/>
+          <w:insideV w:val="single" w:color="auto" w:sz="4"/>
+        </w:tblBorders>
+      </w:tblPr>
+      <w:tblGrid>
+        <w:gridCol w:w="1800"/>
+        <w:gridCol w:w="1800"/>
+        <w:gridCol w:w="1800"/>
+        <w:gridCol w:w="1800"/>
+        <w:gridCol w:w="1800"/>
+      </w:tblGrid>
+      <w:tr>
+        <w:tc>
+          <w:tcPr>
+            <w:tcW w:type="pct" w:w="1800%"/>
+          </w:tcPr>
+          <w:p>
+            <w:pPr>
+              <w:spacing w:after="60"/>
+            </w:pPr>
+            <w:r>
+              <w:t xml:space="preserve">Section</w:t>
+            </w:r>
+          </w:p>
+        </w:tc>
+        <w:tc>
+          <w:tcPr>
+            <w:tcW w:type="pct" w:w="1800%"/>
+          </w:tcPr>
+          <w:p>
+            <w:pPr>
+              <w:spacing w:after="60"/>
+            </w:pPr>
+            <w:r>
+              <w:t xml:space="preserve">Bars</w:t>
+            </w:r>
+          </w:p>
+        </w:tc>
+        <w:tc>
+          <w:tcPr>
+            <w:tcW w:type="pct" w:w="1800%"/>
+          </w:tcPr>
+          <w:p>
+            <w:pPr>
+              <w:spacing w:after="60"/>
+            </w:pPr>
+            <w:r>
+              <w:t xml:space="preserve">Character</w:t>
+            </w:r>
+          </w:p>
+        </w:tc>
+        <w:tc>
+          <w:tcPr>
+            <w:tcW w:type="pct" w:w="1800%"/>
+          </w:tcPr>
+          <w:p>
+            <w:pPr>
+              <w:spacing w:after="60"/>
+            </w:pPr>
+            <w:r>
+              <w:t xml:space="preserve">density</w:t>
+            </w:r>
+          </w:p>
+        </w:tc>
+        <w:tc>
+          <w:tcPr>
+            <w:tcW w:type="pct" w:w="1800%"/>
+          </w:tcPr>
+          <w:p>
+            <w:pPr>
+              <w:spacing w:after="60"/>
+            </w:pPr>
+            <w:r>
+              <w:t xml:space="preserve">riffMode</w:t>
+            </w:r>
+          </w:p>
+        </w:tc>
+      </w:tr>
+      <w:tr>
+        <w:tc>
+          <w:tcPr>
+            <w:tcW w:type="pct" w:w="1800%"/>
+          </w:tcPr>
+          <w:p>
+            <w:pPr>
+              <w:spacing w:after="60"/>
+            </w:pPr>
+            <w:r>
+              <w:t xml:space="preserve">Intro</w:t>
+            </w:r>
+          </w:p>
+        </w:tc>
+        <w:tc>
+          <w:tcPr>
+            <w:tcW w:type="pct" w:w="1800%"/>
+          </w:tcPr>
+          <w:p>
+            <w:pPr>
+              <w:spacing w:after="60"/>
+            </w:pPr>
+            <w:r>
+              <w:t xml:space="preserve">1–3</w:t>
+            </w:r>
+          </w:p>
+        </w:tc>
+        <w:tc>
+          <w:tcPr>
+            <w:tcW w:type="pct" w:w="1800%"/>
+          </w:tcPr>
+          <w:p>
+            <w:pPr>
+              <w:spacing w:after="60"/>
+            </w:pPr>
+            <w:r>
+              <w:t xml:space="preserve">Noise drone</w:t>
+            </w:r>
+          </w:p>
+        </w:tc>
+        <w:tc>
+          <w:tcPr>
+            <w:tcW w:type="pct" w:w="1800%"/>
+          </w:tcPr>
+          <w:p>
+            <w:pPr>
+              <w:spacing w:after="60"/>
+            </w:pPr>
+            <w:r>
+              <w:t xml:space="preserve">sparse</w:t>
+            </w:r>
+          </w:p>
+        </w:tc>
+        <w:tc>
+          <w:tcPr>
+            <w:tcW w:type="pct" w:w="1800%"/>
+          </w:tcPr>
+          <w:p>
+            <w:pPr>
+              <w:spacing w:after="60"/>
+            </w:pPr>
+            <w:r>
+              <w:t xml:space="preserve">`noise_drone`</w:t>
+            </w:r>
+          </w:p>
+        </w:tc>
+      </w:tr>
+      <w:tr>
+        <w:tc>
+          <w:tcPr>
+            <w:tcW w:type="pct" w:w="1800%"/>
+          </w:tcPr>
+          <w:p>
+            <w:pPr>
+              <w:spacing w:after="60"/>
+            </w:pPr>
+            <w:r>
+              <w:t xml:space="preserve">Verse</w:t>
+            </w:r>
+          </w:p>
+        </w:tc>
+        <w:tc>
+          <w:tcPr>
+            <w:tcW w:type="pct" w:w="1800%"/>
+          </w:tcPr>
+          <w:p>
+            <w:pPr>
+              <w:spacing w:after="60"/>
+            </w:pPr>
+            <w:r>
+              <w:t xml:space="preserve">4–6</w:t>
+            </w:r>
+          </w:p>
+        </w:tc>
+        <w:tc>
+          <w:tcPr>
+            <w:tcW w:type="pct" w:w="1800%"/>
+          </w:tcPr>
+          <w:p>
+            <w:pPr>
+              <w:spacing w:after="60"/>
+            </w:pPr>
+            <w:r>
+              <w:t xml:space="preserve">Motorik grid</w:t>
+            </w:r>
+          </w:p>
+        </w:tc>
+        <w:tc>
+          <w:tcPr>
+            <w:tcW w:type="pct" w:w="1800%"/>
+          </w:tcPr>
+          <w:p>
+            <w:pPr>
+              <w:spacing w:after="60"/>
+            </w:pPr>
+            <w:r>
+              <w:t xml:space="preserve">moderate</w:t>
+            </w:r>
+          </w:p>
+        </w:tc>
+        <w:tc>
+          <w:tcPr>
+            <w:tcW w:type="pct" w:w="1800%"/>
+          </w:tcPr>
+          <w:p>
+            <w:pPr>
+              <w:spacing w:after="60"/>
+            </w:pPr>
+            <w:r>
+              <w:t xml:space="preserve">`motorik`</w:t>
+            </w:r>
+          </w:p>
+        </w:tc>
+      </w:tr>
+      <w:tr>
+        <w:tc>
+          <w:tcPr>
+            <w:tcW w:type="pct" w:w="1800%"/>
+          </w:tcPr>
+          <w:p>
+            <w:pPr>
+              <w:spacing w:after="60"/>
+            </w:pPr>
+            <w:r>
+              <w:t xml:space="preserve">Chorus</w:t>
+            </w:r>
+          </w:p>
+        </w:tc>
+        <w:tc>
+          <w:tcPr>
+            <w:tcW w:type="pct" w:w="1800%"/>
+          </w:tcPr>
+          <w:p>
+            <w:pPr>
+              <w:spacing w:after="60"/>
+            </w:pPr>
+            <w:r>
+              <w:t xml:space="preserve">7–10</w:t>
+            </w:r>
+          </w:p>
+        </w:tc>
+        <w:tc>
+          <w:tcPr>
+            <w:tcW w:type="pct" w:w="1800%"/>
+          </w:tcPr>
+          <w:p>
+            <w:pPr>
+              <w:spacing w:after="60"/>
+            </w:pPr>
+            <w:r>
+              <w:t xml:space="preserve">Wall of sound</w:t>
+            </w:r>
+          </w:p>
+        </w:tc>
+        <w:tc>
+          <w:tcPr>
+            <w:tcW w:type="pct" w:w="1800%"/>
+          </w:tcPr>
+          <w:p>
+            <w:pPr>
+              <w:spacing w:after="60"/>
+            </w:pPr>
+            <w:r>
+              <w:t xml:space="preserve">dense</w:t>
+            </w:r>
+          </w:p>
+        </w:tc>
+        <w:tc>
+          <w:tcPr>
+            <w:tcW w:type="pct" w:w="1800%"/>
+          </w:tcPr>
+          <w:p>
+            <w:pPr>
+              <w:spacing w:after="60"/>
+            </w:pPr>
+            <w:r>
+              <w:t xml:space="preserve">`wall_of_sound`</w:t>
+            </w:r>
+          </w:p>
+        </w:tc>
+      </w:tr>
+      <w:tr>
+        <w:tc>
+          <w:tcPr>
+            <w:tcW w:type="pct" w:w="1800%"/>
+          </w:tcPr>
+          <w:p>
+            <w:pPr>
+              <w:spacing w:after="60"/>
+            </w:pPr>
+            <w:r>
+              <w:t xml:space="preserve">Bridge</w:t>
+            </w:r>
+          </w:p>
+        </w:tc>
+        <w:tc>
+          <w:tcPr>
+            <w:tcW w:type="pct" w:w="1800%"/>
+          </w:tcPr>
+          <w:p>
+            <w:pPr>
+              <w:spacing w:after="60"/>
+            </w:pPr>
+            <w:r>
+              <w:t xml:space="preserve">11–13</w:t>
+            </w:r>
+          </w:p>
+        </w:tc>
+        <w:tc>
+          <w:tcPr>
+            <w:tcW w:type="pct" w:w="1800%"/>
+          </w:tcPr>
+          <w:p>
+            <w:pPr>
+              <w:spacing w:after="60"/>
+            </w:pPr>
+            <w:r>
+              <w:t xml:space="preserve">Slonimsky cells</w:t>
+            </w:r>
+          </w:p>
+        </w:tc>
+        <w:tc>
+          <w:tcPr>
+            <w:tcW w:type="pct" w:w="1800%"/>
+          </w:tcPr>
+          <w:p>
+            <w:pPr>
+              <w:spacing w:after="60"/>
+            </w:pPr>
+            <w:r>
+              <w:t xml:space="preserve">(energy-driven)</w:t>
+            </w:r>
+          </w:p>
+        </w:tc>
+        <w:tc>
+          <w:tcPr>
+            <w:tcW w:type="pct" w:w="1800%"/>
+          </w:tcPr>
+          <w:p>
+            <w:pPr>
+              <w:spacing w:after="60"/>
+            </w:pPr>
+            <w:r>
+              <w:t xml:space="preserve">`slonimsky_cells`</w:t>
+            </w:r>
+          </w:p>
+        </w:tc>
+      </w:tr>
+      <w:tr>
+        <w:tc>
+          <w:tcPr>
+            <w:tcW w:type="pct" w:w="1800%"/>
+          </w:tcPr>
+          <w:p>
+            <w:pPr>
+              <w:spacing w:after="60"/>
+            </w:pPr>
+            <w:r>
+              <w:t xml:space="preserve">Outro</w:t>
+            </w:r>
+          </w:p>
+        </w:tc>
+        <w:tc>
+          <w:tcPr>
+            <w:tcW w:type="pct" w:w="1800%"/>
+          </w:tcPr>
+          <w:p>
+            <w:pPr>
+              <w:spacing w:after="60"/>
+            </w:pPr>
+            <w:r>
+              <w:t xml:space="preserve">14–16</w:t>
+            </w:r>
+          </w:p>
+        </w:tc>
+        <w:tc>
+          <w:tcPr>
+            <w:tcW w:type="pct" w:w="1800%"/>
+          </w:tcPr>
+          <w:p>
+            <w:pPr>
+              <w:spacing w:after="60"/>
+            </w:pPr>
+            <w:r>
+              <w:t xml:space="preserve">Sparse drone</w:t>
+            </w:r>
+          </w:p>
+        </w:tc>
+        <w:tc>
+          <w:tcPr>
+            <w:tcW w:type="pct" w:w="1800%"/>
+          </w:tcPr>
+          <w:p>
+            <w:pPr>
+              <w:spacing w:after="60"/>
+            </w:pPr>
+            <w:r>
+              <w:t xml:space="preserve">sparse</w:t>
+            </w:r>
+          </w:p>
+        </w:tc>
+        <w:tc>
+          <w:tcPr>
+            <w:tcW w:type="pct" w:w="1800%"/>
+          </w:tcPr>
+          <w:p>
+            <w:pPr>
+              <w:spacing w:after="60"/>
+            </w:pPr>
+            <w:r>
+              <w:t xml:space="preserve">`sparse_drone`</w:t>
+            </w:r>
+          </w:p>
+        </w:tc>
+      </w:tr>
+    </w:tbl>
+    <w:p>
+      <w:pPr>
+        <w:spacing w:after="160"/>
+      </w:pPr>
+    </w:p>
+    <w:p>
+      <w:pPr>
+        <w:spacing w:after="160"/>
+      </w:pPr>
+      <w:r>
+        <w:rPr>
+          <w:b/>
+          <w:bCs/>
+        </w:rPr>
+        <w:t xml:space="preserve">What you hear:</w:t>
+      </w:r>
+      <w:r>
+        <w:t xml:space="preserve"> Intro sits low and thin; chorus pushes register ceiling and energy; bridge climbs higher than intro; outro thins again. Same pasted `Dm7` progression — different section behaviour from architecture, not from re-seeding.</w:t>
+      </w:r>
+    </w:p>
+    <w:p>
+      <w:pPr>
+        <w:spacing w:after="160"/>
+      </w:pPr>
+      <w:r>
+        <w:t xml:space="preserve">Bridge and outro use </w:t>
+      </w:r>
+      <w:r>
+        <w:rPr>
+          <w:b/>
+          <w:bCs/>
+        </w:rPr>
+        <w:t xml:space="preserve">`interpolateDensity`</w:t>
+      </w:r>
+      <w:r>
+        <w:t xml:space="preserve"> at section seams so density ramps rather than hard-jumps.</w:t>
+      </w:r>
+    </w:p>
+    <w:p>
+      <w:pPr>
+        <w:pStyle w:val="Heading2"/>
+        <w:spacing w:after="100" w:before="160"/>
+      </w:pPr>
+      <w:r>
+        <w:t xml:space="preserve">10.3 Density and riffMode per section (GBD example, seed 80002)</w:t>
+      </w:r>
+    </w:p>
+    <w:p>
+      <w:pPr>
+        <w:spacing w:after="160"/>
+      </w:pPr>
+      <w:r>
+        <w:t xml:space="preserve">A 16-bar Guitar–Bass Duo with three sections:</w:t>
+      </w:r>
+    </w:p>
+    <w:tbl>
+      <w:tblPr>
+        <w:tblW w:type="pct" w:w="100%"/>
+        <w:tblBorders>
+          <w:top w:val="single" w:color="auto" w:sz="4"/>
+          <w:left w:val="single" w:color="auto" w:sz="4"/>
+          <w:bottom w:val="single" w:color="auto" w:sz="4"/>
+          <w:right w:val="single" w:color="auto" w:sz="4"/>
+          <w:insideH w:val="single" w:color="auto" w:sz="4"/>
+          <w:insideV w:val="single" w:color="auto" w:sz="4"/>
+        </w:tblBorders>
+      </w:tblPr>
+      <w:tblGrid>
+        <w:gridCol w:w="2250"/>
+        <w:gridCol w:w="2250"/>
+        <w:gridCol w:w="2250"/>
+        <w:gridCol w:w="2250"/>
+      </w:tblGrid>
+      <w:tr>
+        <w:tc>
+          <w:tcPr>
+            <w:tcW w:type="pct" w:w="2250%"/>
+          </w:tcPr>
+          <w:p>
+            <w:pPr>
+              <w:spacing w:after="60"/>
+            </w:pPr>
+            <w:r>
+              <w:t xml:space="preserve">Section</w:t>
+            </w:r>
+          </w:p>
+        </w:tc>
+        <w:tc>
+          <w:tcPr>
+            <w:tcW w:type="pct" w:w="2250%"/>
+          </w:tcPr>
+          <w:p>
+            <w:pPr>
+              <w:spacing w:after="60"/>
+            </w:pPr>
+            <w:r>
+              <w:t xml:space="preserve">Bars</w:t>
+            </w:r>
+          </w:p>
+        </w:tc>
+        <w:tc>
+          <w:tcPr>
+            <w:tcW w:type="pct" w:w="2250%"/>
+          </w:tcPr>
+          <w:p>
+            <w:pPr>
+              <w:spacing w:after="60"/>
+            </w:pPr>
+            <w:r>
+              <w:t xml:space="preserve">Guitar / bass density</w:t>
+            </w:r>
+          </w:p>
+        </w:tc>
+        <w:tc>
+          <w:tcPr>
+            <w:tcW w:type="pct" w:w="2250%"/>
+          </w:tcPr>
+          <w:p>
+            <w:pPr>
+              <w:spacing w:after="60"/>
+            </w:pPr>
+            <w:r>
+              <w:t xml:space="preserve">riffMode</w:t>
+            </w:r>
+          </w:p>
+        </w:tc>
+      </w:tr>
+      <w:tr>
+        <w:tc>
+          <w:tcPr>
+            <w:tcW w:type="pct" w:w="2250%"/>
+          </w:tcPr>
+          <w:p>
+            <w:pPr>
+              <w:spacing w:after="60"/>
+            </w:pPr>
+            <w:r>
+              <w:t xml:space="preserve">A</w:t>
+            </w:r>
+          </w:p>
+        </w:tc>
+        <w:tc>
+          <w:tcPr>
+            <w:tcW w:type="pct" w:w="2250%"/>
+          </w:tcPr>
+          <w:p>
+            <w:pPr>
+              <w:spacing w:after="60"/>
+            </w:pPr>
+            <w:r>
+              <w:t xml:space="preserve">1–5</w:t>
+            </w:r>
+          </w:p>
+        </w:tc>
+        <w:tc>
+          <w:tcPr>
+            <w:tcW w:type="pct" w:w="2250%"/>
+          </w:tcPr>
+          <w:p>
+            <w:pPr>
+              <w:spacing w:after="60"/>
+            </w:pPr>
+            <w:r>
+              <w:t xml:space="preserve">sparse</w:t>
+            </w:r>
+          </w:p>
+        </w:tc>
+        <w:tc>
+          <w:tcPr>
+            <w:tcW w:type="pct" w:w="2250%"/>
+          </w:tcPr>
+          <w:p>
+            <w:pPr>
+              <w:spacing w:after="60"/>
+            </w:pPr>
+            <w:r>
+              <w:t xml:space="preserve">`groove_sparse`</w:t>
+            </w:r>
+          </w:p>
+        </w:tc>
+      </w:tr>
+      <w:tr>
+        <w:tc>
+          <w:tcPr>
+            <w:tcW w:type="pct" w:w="2250%"/>
+          </w:tcPr>
+          <w:p>
+            <w:pPr>
+              <w:spacing w:after="60"/>
+            </w:pPr>
+            <w:r>
+              <w:t xml:space="preserve">B</w:t>
+            </w:r>
+          </w:p>
+        </w:tc>
+        <w:tc>
+          <w:tcPr>
+            <w:tcW w:type="pct" w:w="2250%"/>
+          </w:tcPr>
+          <w:p>
+            <w:pPr>
+              <w:spacing w:after="60"/>
+            </w:pPr>
+            <w:r>
+              <w:t xml:space="preserve">6–10</w:t>
+            </w:r>
+          </w:p>
+        </w:tc>
+        <w:tc>
+          <w:tcPr>
+            <w:tcW w:type="pct" w:w="2250%"/>
+          </w:tcPr>
+          <w:p>
+            <w:pPr>
+              <w:spacing w:after="60"/>
+            </w:pPr>
+            <w:r>
+              <w:t xml:space="preserve">dense</w:t>
+            </w:r>
+          </w:p>
+        </w:tc>
+        <w:tc>
+          <w:tcPr>
+            <w:tcW w:type="pct" w:w="2250%"/>
+          </w:tcPr>
+          <w:p>
+            <w:pPr>
+              <w:spacing w:after="60"/>
+            </w:pPr>
+            <w:r>
+              <w:t xml:space="preserve">`groove_dense`</w:t>
+            </w:r>
+          </w:p>
+        </w:tc>
+      </w:tr>
+      <w:tr>
+        <w:tc>
+          <w:tcPr>
+            <w:tcW w:type="pct" w:w="2250%"/>
+          </w:tcPr>
+          <w:p>
+            <w:pPr>
+              <w:spacing w:after="60"/>
+            </w:pPr>
+            <w:r>
+              <w:t xml:space="preserve">C</w:t>
+            </w:r>
+          </w:p>
+        </w:tc>
+        <w:tc>
+          <w:tcPr>
+            <w:tcW w:type="pct" w:w="2250%"/>
+          </w:tcPr>
+          <w:p>
+            <w:pPr>
+              <w:spacing w:after="60"/>
+            </w:pPr>
+            <w:r>
+              <w:t xml:space="preserve">11–16</w:t>
+            </w:r>
+          </w:p>
+        </w:tc>
+        <w:tc>
+          <w:tcPr>
+            <w:tcW w:type="pct" w:w="2250%"/>
+          </w:tcPr>
+          <w:p>
+            <w:pPr>
+              <w:spacing w:after="60"/>
+            </w:pPr>
+            <w:r>
+              <w:t xml:space="preserve">moderate</w:t>
+            </w:r>
+          </w:p>
+        </w:tc>
+        <w:tc>
+          <w:tcPr>
+            <w:tcW w:type="pct" w:w="2250%"/>
+          </w:tcPr>
+          <w:p>
+            <w:pPr>
+              <w:spacing w:after="60"/>
+            </w:pPr>
+            <w:r>
+              <w:t xml:space="preserve">`motorik`</w:t>
+            </w:r>
+          </w:p>
+        </w:tc>
+      </w:tr>
+    </w:tbl>
+    <w:p>
+      <w:pPr>
+        <w:spacing w:after="160"/>
+      </w:pPr>
+    </w:p>
+    <w:p>
+      <w:pPr>
+        <w:spacing w:after="160"/>
+      </w:pPr>
+      <w:r>
+        <w:t xml:space="preserve">Instrument overrides are scoped by part (`guitar` vs `bass`). Resolved density scalars differ measurably between A and B even on identical harmony.</w:t>
+      </w:r>
+    </w:p>
+    <w:p>
+      <w:pPr>
+        <w:spacing w:after="160"/>
+      </w:pPr>
+      <w:r>
+        <w:rPr>
+          <w:b/>
+          <w:bCs/>
+        </w:rPr>
+        <w:t xml:space="preserve">Golden verification (off smoke until V65 closeout):</w:t>
+      </w:r>
+      <w:r>
+        <w:t xml:space="preserve"> `engines/composer-os-v2/scripts/runSectionArchitectureP1Golden.ts`</w:t>
+      </w:r>
+    </w:p>
+    <w:p>
+      <w:pPr>
         <w:spacing w:after="160"/>
       </w:pPr>
       <w:r>
@@ -15109,7 +16086,7 @@
           <w:sz w:val="20"/>
           <w:szCs w:val="20"/>
         </w:rPr>
-        <w:t xml:space="preserve">End of Composer OS Musician Guide* *Version: V61 — 2026-05-23* *For engine detail: COMPOSER_HANDBOOK.md* *For roadmap: COMPOSER_OS_ROADMAP.md</w:t>
+        <w:t xml:space="preserve">End of Composer OS Musician Guide* *Version: V65 — 2026-05-24* *For engine detail: COMPOSER_HANDBOOK.md* *For roadmap: COMPOSER_OS_ROADMAP.md</w:t>
       </w:r>
     </w:p>
     <w:sectPr>

</xml_diff>

<commit_message>
feat(section-architecture): V65 P2 wire tuning and ensemble profiles
Wire per-section tuning, Slonimsky cell sets, register/root-follow helpers, and Big Band/String Quartet section profile fan-out with off-smoke goldens.
</commit_message>
<xml_diff>
--- a/docs/COMPOSER_OS_MUSICIAN_GUIDE.docx
+++ b/docs/COMPOSER_OS_MUSICIAN_GUIDE.docx
@@ -16077,6 +16077,802 @@
     </w:p>
     <w:p>
       <w:pPr>
+        <w:pStyle w:val="Heading2"/>
+        <w:spacing w:after="100" w:before="160"/>
+      </w:pPr>
+      <w:r>
+        <w:t xml:space="preserve">10.4 Per-instrument tuning per section</w:t>
+      </w:r>
+    </w:p>
+    <w:p>
+      <w:pPr>
+        <w:spacing w:after="160"/>
+      </w:pPr>
+      <w:r>
+        <w:t xml:space="preserve">Sections can now change guitar tuning as part of the form. That means the same song can keep one tuning for the intro and verse, then switch tuning at a bridge without changing the global preset.</w:t>
+      </w:r>
+    </w:p>
+    <w:p>
+      <w:pPr>
+        <w:spacing w:after="160"/>
+      </w:pPr>
+      <w:r>
+        <w:t xml:space="preserve">Plain English:</w:t>
+      </w:r>
+    </w:p>
+    <w:p>
+      <w:pPr>
+        <w:spacing w:after="80"/>
+        <w:ind w:left="360" w:hanging="260"/>
+      </w:pPr>
+      <w:r>
+        <w:t xml:space="preserve">• </w:t>
+      </w:r>
+      <w:r>
+        <w:t xml:space="preserve">`guitarA` targets the main guitar part (`guitar`)</w:t>
+      </w:r>
+    </w:p>
+    <w:p>
+      <w:pPr>
+        <w:spacing w:after="80"/>
+        <w:ind w:left="360" w:hanging="260"/>
+      </w:pPr>
+      <w:r>
+        <w:t xml:space="preserve">• </w:t>
+      </w:r>
+      <w:r>
+        <w:t xml:space="preserve">`guitarB` targets the second guitar part (`guitar_2`)</w:t>
+      </w:r>
+    </w:p>
+    <w:p>
+      <w:pPr>
+        <w:spacing w:after="80"/>
+        <w:ind w:left="360" w:hanging="260"/>
+      </w:pPr>
+      <w:r>
+        <w:t xml:space="preserve">• </w:t>
+      </w:r>
+      <w:r>
+        <w:t xml:space="preserve">Each section can name a tuning preset such as `sy_aaddgg` or `sy_eebddg`</w:t>
+      </w:r>
+    </w:p>
+    <w:p>
+      <w:pPr>
+        <w:spacing w:after="80"/>
+        <w:ind w:left="360" w:hanging="260"/>
+      </w:pPr>
+      <w:r>
+        <w:t xml:space="preserve">• </w:t>
+      </w:r>
+      <w:r>
+        <w:t xml:space="preserve">No Song object means no tuning change; legacy behaviour is unchanged</w:t>
+      </w:r>
+    </w:p>
+    <w:p>
+      <w:pPr>
+        <w:spacing w:after="160"/>
+      </w:pPr>
+      <w:r>
+        <w:t xml:space="preserve">Sonic Youth example:</w:t>
+      </w:r>
+    </w:p>
+    <w:tbl>
+      <w:tblPr>
+        <w:tblW w:type="pct" w:w="100%"/>
+        <w:tblBorders>
+          <w:top w:val="single" w:color="auto" w:sz="4"/>
+          <w:left w:val="single" w:color="auto" w:sz="4"/>
+          <w:bottom w:val="single" w:color="auto" w:sz="4"/>
+          <w:right w:val="single" w:color="auto" w:sz="4"/>
+          <w:insideH w:val="single" w:color="auto" w:sz="4"/>
+          <w:insideV w:val="single" w:color="auto" w:sz="4"/>
+        </w:tblBorders>
+      </w:tblPr>
+      <w:tblGrid>
+        <w:gridCol w:w="2250"/>
+        <w:gridCol w:w="2250"/>
+        <w:gridCol w:w="2250"/>
+        <w:gridCol w:w="2250"/>
+      </w:tblGrid>
+      <w:tr>
+        <w:tc>
+          <w:tcPr>
+            <w:tcW w:type="pct" w:w="2250%"/>
+          </w:tcPr>
+          <w:p>
+            <w:pPr>
+              <w:spacing w:after="60"/>
+            </w:pPr>
+            <w:r>
+              <w:t xml:space="preserve">Section</w:t>
+            </w:r>
+          </w:p>
+        </w:tc>
+        <w:tc>
+          <w:tcPr>
+            <w:tcW w:type="pct" w:w="2250%"/>
+          </w:tcPr>
+          <w:p>
+            <w:pPr>
+              <w:spacing w:after="60"/>
+            </w:pPr>
+            <w:r>
+              <w:t xml:space="preserve">Bars</w:t>
+            </w:r>
+          </w:p>
+        </w:tc>
+        <w:tc>
+          <w:tcPr>
+            <w:tcW w:type="pct" w:w="2250%"/>
+          </w:tcPr>
+          <w:p>
+            <w:pPr>
+              <w:spacing w:after="60"/>
+            </w:pPr>
+            <w:r>
+              <w:t xml:space="preserve">Main guitar tuning</w:t>
+            </w:r>
+          </w:p>
+        </w:tc>
+        <w:tc>
+          <w:tcPr>
+            <w:tcW w:type="pct" w:w="2250%"/>
+          </w:tcPr>
+          <w:p>
+            <w:pPr>
+              <w:spacing w:after="60"/>
+            </w:pPr>
+            <w:r>
+              <w:t xml:space="preserve">Musical effect</w:t>
+            </w:r>
+          </w:p>
+        </w:tc>
+      </w:tr>
+      <w:tr>
+        <w:tc>
+          <w:tcPr>
+            <w:tcW w:type="pct" w:w="2250%"/>
+          </w:tcPr>
+          <w:p>
+            <w:pPr>
+              <w:spacing w:after="60"/>
+            </w:pPr>
+            <w:r>
+              <w:t xml:space="preserve">Intro</w:t>
+            </w:r>
+          </w:p>
+        </w:tc>
+        <w:tc>
+          <w:tcPr>
+            <w:tcW w:type="pct" w:w="2250%"/>
+          </w:tcPr>
+          <w:p>
+            <w:pPr>
+              <w:spacing w:after="60"/>
+            </w:pPr>
+            <w:r>
+              <w:t xml:space="preserve">1–4</w:t>
+            </w:r>
+          </w:p>
+        </w:tc>
+        <w:tc>
+          <w:tcPr>
+            <w:tcW w:type="pct" w:w="2250%"/>
+          </w:tcPr>
+          <w:p>
+            <w:pPr>
+              <w:spacing w:after="60"/>
+            </w:pPr>
+            <w:r>
+              <w:t xml:space="preserve">`sy_aaddgg`</w:t>
+            </w:r>
+          </w:p>
+        </w:tc>
+        <w:tc>
+          <w:tcPr>
+            <w:tcW w:type="pct" w:w="2250%"/>
+          </w:tcPr>
+          <w:p>
+            <w:pPr>
+              <w:spacing w:after="60"/>
+            </w:pPr>
+            <w:r>
+              <w:t xml:space="preserve">Paired A/D/G drone bed</w:t>
+            </w:r>
+          </w:p>
+        </w:tc>
+      </w:tr>
+      <w:tr>
+        <w:tc>
+          <w:tcPr>
+            <w:tcW w:type="pct" w:w="2250%"/>
+          </w:tcPr>
+          <w:p>
+            <w:pPr>
+              <w:spacing w:after="60"/>
+            </w:pPr>
+            <w:r>
+              <w:t xml:space="preserve">Verse</w:t>
+            </w:r>
+          </w:p>
+        </w:tc>
+        <w:tc>
+          <w:tcPr>
+            <w:tcW w:type="pct" w:w="2250%"/>
+          </w:tcPr>
+          <w:p>
+            <w:pPr>
+              <w:spacing w:after="60"/>
+            </w:pPr>
+            <w:r>
+              <w:t xml:space="preserve">5–10</w:t>
+            </w:r>
+          </w:p>
+        </w:tc>
+        <w:tc>
+          <w:tcPr>
+            <w:tcW w:type="pct" w:w="2250%"/>
+          </w:tcPr>
+          <w:p>
+            <w:pPr>
+              <w:spacing w:after="60"/>
+            </w:pPr>
+            <w:r>
+              <w:t xml:space="preserve">`sy_aaddgg`</w:t>
+            </w:r>
+          </w:p>
+        </w:tc>
+        <w:tc>
+          <w:tcPr>
+            <w:tcW w:type="pct" w:w="2250%"/>
+          </w:tcPr>
+          <w:p>
+            <w:pPr>
+              <w:spacing w:after="60"/>
+            </w:pPr>
+            <w:r>
+              <w:t xml:space="preserve">Keeps motorik continuity</w:t>
+            </w:r>
+          </w:p>
+        </w:tc>
+      </w:tr>
+      <w:tr>
+        <w:tc>
+          <w:tcPr>
+            <w:tcW w:type="pct" w:w="2250%"/>
+          </w:tcPr>
+          <w:p>
+            <w:pPr>
+              <w:spacing w:after="60"/>
+            </w:pPr>
+            <w:r>
+              <w:t xml:space="preserve">Bridge</w:t>
+            </w:r>
+          </w:p>
+        </w:tc>
+        <w:tc>
+          <w:tcPr>
+            <w:tcW w:type="pct" w:w="2250%"/>
+          </w:tcPr>
+          <w:p>
+            <w:pPr>
+              <w:spacing w:after="60"/>
+            </w:pPr>
+            <w:r>
+              <w:t xml:space="preserve">11–16</w:t>
+            </w:r>
+          </w:p>
+        </w:tc>
+        <w:tc>
+          <w:tcPr>
+            <w:tcW w:type="pct" w:w="2250%"/>
+          </w:tcPr>
+          <w:p>
+            <w:pPr>
+              <w:spacing w:after="60"/>
+            </w:pPr>
+            <w:r>
+              <w:t xml:space="preserve">`sy_eebddg`</w:t>
+            </w:r>
+          </w:p>
+        </w:tc>
+        <w:tc>
+          <w:tcPr>
+            <w:tcW w:type="pct" w:w="2250%"/>
+          </w:tcPr>
+          <w:p>
+            <w:pPr>
+              <w:spacing w:after="60"/>
+            </w:pPr>
+            <w:r>
+              <w:t xml:space="preserve">Darker E/B grind with doubled D/G pressure</w:t>
+            </w:r>
+          </w:p>
+        </w:tc>
+      </w:tr>
+    </w:tbl>
+    <w:p>
+      <w:pPr>
+        <w:spacing w:after="160"/>
+      </w:pPr>
+    </w:p>
+    <w:p>
+      <w:pPr>
+        <w:spacing w:after="160"/>
+      </w:pPr>
+      <w:r>
+        <w:t xml:space="preserve">Composer OS resolves the active tuning per bar. The score also carries per-section tuning diagnostics so exported XML can show section tuning changes.</w:t>
+      </w:r>
+    </w:p>
+    <w:p>
+      <w:pPr>
+        <w:pStyle w:val="Heading2"/>
+        <w:spacing w:after="100" w:before="160"/>
+      </w:pPr>
+      <w:r>
+        <w:t xml:space="preserve">10.5 Per-section Slonimsky cell families</w:t>
+      </w:r>
+    </w:p>
+    <w:p>
+      <w:pPr>
+        <w:spacing w:after="160"/>
+      </w:pPr>
+      <w:r>
+        <w:t xml:space="preserve">Sections can choose their Slonimsky catalogue family through `pitchProfile.cellSets`. This changes the chromatic cell vocabulary by section instead of using one global chromatic language.</w:t>
+      </w:r>
+    </w:p>
+    <w:p>
+      <w:pPr>
+        <w:spacing w:after="160"/>
+      </w:pPr>
+      <w:r>
+        <w:t xml:space="preserve">Example:</w:t>
+      </w:r>
+    </w:p>
+    <w:tbl>
+      <w:tblPr>
+        <w:tblW w:type="pct" w:w="100%"/>
+        <w:tblBorders>
+          <w:top w:val="single" w:color="auto" w:sz="4"/>
+          <w:left w:val="single" w:color="auto" w:sz="4"/>
+          <w:bottom w:val="single" w:color="auto" w:sz="4"/>
+          <w:right w:val="single" w:color="auto" w:sz="4"/>
+          <w:insideH w:val="single" w:color="auto" w:sz="4"/>
+          <w:insideV w:val="single" w:color="auto" w:sz="4"/>
+        </w:tblBorders>
+      </w:tblPr>
+      <w:tblGrid>
+        <w:gridCol w:w="3000"/>
+        <w:gridCol w:w="3000"/>
+        <w:gridCol w:w="3000"/>
+      </w:tblGrid>
+      <w:tr>
+        <w:tc>
+          <w:tcPr>
+            <w:tcW w:type="pct" w:w="3000%"/>
+          </w:tcPr>
+          <w:p>
+            <w:pPr>
+              <w:spacing w:after="60"/>
+            </w:pPr>
+            <w:r>
+              <w:t xml:space="preserve">Section</w:t>
+            </w:r>
+          </w:p>
+        </w:tc>
+        <w:tc>
+          <w:tcPr>
+            <w:tcW w:type="pct" w:w="3000%"/>
+          </w:tcPr>
+          <w:p>
+            <w:pPr>
+              <w:spacing w:after="60"/>
+            </w:pPr>
+            <w:r>
+              <w:t xml:space="preserve">`pitchProfile.cellSets`</w:t>
+            </w:r>
+          </w:p>
+        </w:tc>
+        <w:tc>
+          <w:tcPr>
+            <w:tcW w:type="pct" w:w="3000%"/>
+          </w:tcPr>
+          <w:p>
+            <w:pPr>
+              <w:spacing w:after="60"/>
+            </w:pPr>
+            <w:r>
+              <w:t xml:space="preserve">What changes</w:t>
+            </w:r>
+          </w:p>
+        </w:tc>
+      </w:tr>
+      <w:tr>
+        <w:tc>
+          <w:tcPr>
+            <w:tcW w:type="pct" w:w="3000%"/>
+          </w:tcPr>
+          <w:p>
+            <w:pPr>
+              <w:spacing w:after="60"/>
+            </w:pPr>
+            <w:r>
+              <w:t xml:space="preserve">Verse</w:t>
+            </w:r>
+          </w:p>
+        </w:tc>
+        <w:tc>
+          <w:tcPr>
+            <w:tcW w:type="pct" w:w="3000%"/>
+          </w:tcPr>
+          <w:p>
+            <w:pPr>
+              <w:spacing w:after="60"/>
+            </w:pPr>
+            <w:r>
+              <w:t xml:space="preserve">`ditone_progression`</w:t>
+            </w:r>
+          </w:p>
+        </w:tc>
+        <w:tc>
+          <w:tcPr>
+            <w:tcW w:type="pct" w:w="3000%"/>
+          </w:tcPr>
+          <w:p>
+            <w:pPr>
+              <w:spacing w:after="60"/>
+            </w:pPr>
+            <w:r>
+              <w:t xml:space="preserve">Wider equal-division cells, more angular</w:t>
+            </w:r>
+          </w:p>
+        </w:tc>
+      </w:tr>
+      <w:tr>
+        <w:tc>
+          <w:tcPr>
+            <w:tcW w:type="pct" w:w="3000%"/>
+          </w:tcPr>
+          <w:p>
+            <w:pPr>
+              <w:spacing w:after="60"/>
+            </w:pPr>
+            <w:r>
+              <w:t xml:space="preserve">Bridge</w:t>
+            </w:r>
+          </w:p>
+        </w:tc>
+        <w:tc>
+          <w:tcPr>
+            <w:tcW w:type="pct" w:w="3000%"/>
+          </w:tcPr>
+          <w:p>
+            <w:pPr>
+              <w:spacing w:after="60"/>
+            </w:pPr>
+            <w:r>
+              <w:t xml:space="preserve">`semitone_progression`</w:t>
+            </w:r>
+          </w:p>
+        </w:tc>
+        <w:tc>
+          <w:tcPr>
+            <w:tcW w:type="pct" w:w="3000%"/>
+          </w:tcPr>
+          <w:p>
+            <w:pPr>
+              <w:spacing w:after="60"/>
+            </w:pPr>
+            <w:r>
+              <w:t xml:space="preserve">Tighter chromatic pressure and half-step motion</w:t>
+            </w:r>
+          </w:p>
+        </w:tc>
+      </w:tr>
+    </w:tbl>
+    <w:p>
+      <w:pPr>
+        <w:spacing w:after="160"/>
+      </w:pPr>
+    </w:p>
+    <w:p>
+      <w:pPr>
+        <w:spacing w:after="160"/>
+      </w:pPr>
+      <w:r>
+        <w:t xml:space="preserve">The Song Mode Slonimsky layer now reads the active section at generation time. Goldens check that the verse and bridge resolve different cell families and produce different melodic interval signatures.</w:t>
+      </w:r>
+    </w:p>
+    <w:p>
+      <w:pPr>
+        <w:pStyle w:val="Heading2"/>
+        <w:spacing w:after="100" w:before="160"/>
+      </w:pPr>
+      <w:r>
+        <w:t xml:space="preserve">10.6 Big Band section profiles</w:t>
+      </w:r>
+    </w:p>
+    <w:p>
+      <w:pPr>
+        <w:spacing w:after="160"/>
+      </w:pPr>
+      <w:r>
+        <w:t xml:space="preserve">Big Band and String Quartet ensemble paths now receive the same section architecture context as Song Mode. For Big Band, section energy and voicing profile can shape density and spread per section.</w:t>
+      </w:r>
+    </w:p>
+    <w:p>
+      <w:pPr>
+        <w:spacing w:after="160"/>
+      </w:pPr>
+      <w:r>
+        <w:t xml:space="preserve">Example:</w:t>
+      </w:r>
+    </w:p>
+    <w:tbl>
+      <w:tblPr>
+        <w:tblW w:type="pct" w:w="100%"/>
+        <w:tblBorders>
+          <w:top w:val="single" w:color="auto" w:sz="4"/>
+          <w:left w:val="single" w:color="auto" w:sz="4"/>
+          <w:bottom w:val="single" w:color="auto" w:sz="4"/>
+          <w:right w:val="single" w:color="auto" w:sz="4"/>
+          <w:insideH w:val="single" w:color="auto" w:sz="4"/>
+          <w:insideV w:val="single" w:color="auto" w:sz="4"/>
+        </w:tblBorders>
+      </w:tblPr>
+      <w:tblGrid>
+        <w:gridCol w:w="2250"/>
+        <w:gridCol w:w="2250"/>
+        <w:gridCol w:w="2250"/>
+        <w:gridCol w:w="2250"/>
+      </w:tblGrid>
+      <w:tr>
+        <w:tc>
+          <w:tcPr>
+            <w:tcW w:type="pct" w:w="2250%"/>
+          </w:tcPr>
+          <w:p>
+            <w:pPr>
+              <w:spacing w:after="60"/>
+            </w:pPr>
+            <w:r>
+              <w:t xml:space="preserve">Section</w:t>
+            </w:r>
+          </w:p>
+        </w:tc>
+        <w:tc>
+          <w:tcPr>
+            <w:tcW w:type="pct" w:w="2250%"/>
+          </w:tcPr>
+          <w:p>
+            <w:pPr>
+              <w:spacing w:after="60"/>
+            </w:pPr>
+            <w:r>
+              <w:t xml:space="preserve">Bars</w:t>
+            </w:r>
+          </w:p>
+        </w:tc>
+        <w:tc>
+          <w:tcPr>
+            <w:tcW w:type="pct" w:w="2250%"/>
+          </w:tcPr>
+          <w:p>
+            <w:pPr>
+              <w:spacing w:after="60"/>
+            </w:pPr>
+            <w:r>
+              <w:t xml:space="preserve">Energy / density</w:t>
+            </w:r>
+          </w:p>
+        </w:tc>
+        <w:tc>
+          <w:tcPr>
+            <w:tcW w:type="pct" w:w="2250%"/>
+          </w:tcPr>
+          <w:p>
+            <w:pPr>
+              <w:spacing w:after="60"/>
+            </w:pPr>
+            <w:r>
+              <w:t xml:space="preserve">Voicing profile</w:t>
+            </w:r>
+          </w:p>
+        </w:tc>
+      </w:tr>
+      <w:tr>
+        <w:tc>
+          <w:tcPr>
+            <w:tcW w:type="pct" w:w="2250%"/>
+          </w:tcPr>
+          <w:p>
+            <w:pPr>
+              <w:spacing w:after="60"/>
+            </w:pPr>
+            <w:r>
+              <w:t xml:space="preserve">A</w:t>
+            </w:r>
+          </w:p>
+        </w:tc>
+        <w:tc>
+          <w:tcPr>
+            <w:tcW w:type="pct" w:w="2250%"/>
+          </w:tcPr>
+          <w:p>
+            <w:pPr>
+              <w:spacing w:after="60"/>
+            </w:pPr>
+            <w:r>
+              <w:t xml:space="preserve">1–5</w:t>
+            </w:r>
+          </w:p>
+        </w:tc>
+        <w:tc>
+          <w:tcPr>
+            <w:tcW w:type="pct" w:w="2250%"/>
+          </w:tcPr>
+          <w:p>
+            <w:pPr>
+              <w:spacing w:after="60"/>
+            </w:pPr>
+            <w:r>
+              <w:t xml:space="preserve">sparse</w:t>
+            </w:r>
+          </w:p>
+        </w:tc>
+        <w:tc>
+          <w:tcPr>
+            <w:tcW w:type="pct" w:w="2250%"/>
+          </w:tcPr>
+          <w:p>
+            <w:pPr>
+              <w:spacing w:after="60"/>
+            </w:pPr>
+            <w:r>
+              <w:t xml:space="preserve">max spread 18 semitones</w:t>
+            </w:r>
+          </w:p>
+        </w:tc>
+      </w:tr>
+      <w:tr>
+        <w:tc>
+          <w:tcPr>
+            <w:tcW w:type="pct" w:w="2250%"/>
+          </w:tcPr>
+          <w:p>
+            <w:pPr>
+              <w:spacing w:after="60"/>
+            </w:pPr>
+            <w:r>
+              <w:t xml:space="preserve">B</w:t>
+            </w:r>
+          </w:p>
+        </w:tc>
+        <w:tc>
+          <w:tcPr>
+            <w:tcW w:type="pct" w:w="2250%"/>
+          </w:tcPr>
+          <w:p>
+            <w:pPr>
+              <w:spacing w:after="60"/>
+            </w:pPr>
+            <w:r>
+              <w:t xml:space="preserve">6–10</w:t>
+            </w:r>
+          </w:p>
+        </w:tc>
+        <w:tc>
+          <w:tcPr>
+            <w:tcW w:type="pct" w:w="2250%"/>
+          </w:tcPr>
+          <w:p>
+            <w:pPr>
+              <w:spacing w:after="60"/>
+            </w:pPr>
+            <w:r>
+              <w:t xml:space="preserve">dense</w:t>
+            </w:r>
+          </w:p>
+        </w:tc>
+        <w:tc>
+          <w:tcPr>
+            <w:tcW w:type="pct" w:w="2250%"/>
+          </w:tcPr>
+          <w:p>
+            <w:pPr>
+              <w:spacing w:after="60"/>
+            </w:pPr>
+            <w:r>
+              <w:t xml:space="preserve">min spread 36 semitones</w:t>
+            </w:r>
+          </w:p>
+        </w:tc>
+      </w:tr>
+      <w:tr>
+        <w:tc>
+          <w:tcPr>
+            <w:tcW w:type="pct" w:w="2250%"/>
+          </w:tcPr>
+          <w:p>
+            <w:pPr>
+              <w:spacing w:after="60"/>
+            </w:pPr>
+            <w:r>
+              <w:t xml:space="preserve">C</w:t>
+            </w:r>
+          </w:p>
+        </w:tc>
+        <w:tc>
+          <w:tcPr>
+            <w:tcW w:type="pct" w:w="2250%"/>
+          </w:tcPr>
+          <w:p>
+            <w:pPr>
+              <w:spacing w:after="60"/>
+            </w:pPr>
+            <w:r>
+              <w:t xml:space="preserve">11–16</w:t>
+            </w:r>
+          </w:p>
+        </w:tc>
+        <w:tc>
+          <w:tcPr>
+            <w:tcW w:type="pct" w:w="2250%"/>
+          </w:tcPr>
+          <w:p>
+            <w:pPr>
+              <w:spacing w:after="60"/>
+            </w:pPr>
+            <w:r>
+              <w:t xml:space="preserve">moderate</w:t>
+            </w:r>
+          </w:p>
+        </w:tc>
+        <w:tc>
+          <w:tcPr>
+            <w:tcW w:type="pct" w:w="2250%"/>
+          </w:tcPr>
+          <w:p>
+            <w:pPr>
+              <w:spacing w:after="60"/>
+            </w:pPr>
+            <w:r>
+              <w:t xml:space="preserve">max spread 24 semitones</w:t>
+            </w:r>
+          </w:p>
+        </w:tc>
+      </w:tr>
+    </w:tbl>
+    <w:p>
+      <w:pPr>
+        <w:spacing w:after="160"/>
+      </w:pPr>
+    </w:p>
+    <w:p>
+      <w:pPr>
+        <w:spacing w:after="160"/>
+      </w:pPr>
+      <w:r>
+        <w:t xml:space="preserve">This lets an arranger sketch read like a chart: lean opening, wide shout section, controlled ending. Drum-module behaviour is unchanged and deferred to P4.</w:t>
+      </w:r>
+    </w:p>
+    <w:p>
+      <w:pPr>
+        <w:spacing w:after="160"/>
+      </w:pPr>
+      <w:r>
+        <w:rPr>
+          <w:b/>
+          <w:bCs/>
+        </w:rPr>
+        <w:t xml:space="preserve">Golden verification (off smoke until V65 closeout):</w:t>
+      </w:r>
+      <w:r>
+        <w:t xml:space="preserve"> `engines/composer-os-v2/scripts/runSectionArchitectureP2Golden.ts`</w:t>
+      </w:r>
+    </w:p>
+    <w:p>
+      <w:pPr>
         <w:spacing w:after="160"/>
       </w:pPr>
       <w:r>
@@ -16086,7 +16882,7 @@
           <w:sz w:val="20"/>
           <w:szCs w:val="20"/>
         </w:rPr>
-        <w:t xml:space="preserve">End of Composer OS Musician Guide* *Version: V65 — 2026-05-24* *For engine detail: COMPOSER_HANDBOOK.md* *For roadmap: COMPOSER_OS_ROADMAP.md</w:t>
+        <w:t xml:space="preserve">End of Composer OS Musician Guide* *Version: V65 — 2026-05-25* *For engine detail: COMPOSER_HANDBOOK.md* *For roadmap: COMPOSER_OS_ROADMAP.md</w:t>
       </w:r>
     </w:p>
     <w:sectPr>

</xml_diff>

<commit_message>
feat(import): V65 P3 add MusicXML deep import and QA
</commit_message>
<xml_diff>
--- a/docs/COMPOSER_OS_MUSICIAN_GUIDE.docx
+++ b/docs/COMPOSER_OS_MUSICIAN_GUIDE.docx
@@ -16869,6 +16869,890 @@
       </w:r>
       <w:r>
         <w:t xml:space="preserve"> `engines/composer-os-v2/scripts/runSectionArchitectureP2Golden.ts`</w:t>
+      </w:r>
+    </w:p>
+    <w:p>
+      <w:pPr>
+        <w:pStyle w:val="Heading1"/>
+        <w:spacing w:after="120" w:before="200"/>
+      </w:pPr>
+      <w:r>
+        <w:t xml:space="preserve">Part 11 — MusicXML Import and Sibelius QA</w:t>
+      </w:r>
+    </w:p>
+    <w:p>
+      <w:pPr>
+        <w:spacing w:after="160"/>
+      </w:pPr>
+      <w:r>
+        <w:rPr>
+          <w:i/>
+          <w:iCs/>
+          <w:sz w:val="20"/>
+          <w:szCs w:val="20"/>
+        </w:rPr>
+        <w:t xml:space="preserve">How imported MusicXML can seed Composer OS generation, and what export QA means today.</w:t>
+      </w:r>
+    </w:p>
+    <w:p>
+      <w:pPr>
+        <w:pStyle w:val="Heading2"/>
+        <w:spacing w:after="100" w:before="160"/>
+      </w:pPr>
+      <w:r>
+        <w:t xml:space="preserve">11.1 Importing a MusicXML score</w:t>
+      </w:r>
+    </w:p>
+    <w:p>
+      <w:pPr>
+        <w:spacing w:after="160"/>
+      </w:pPr>
+      <w:r>
+        <w:t xml:space="preserve">Use the MusicXML import field in the Generate screen, or send a `musicXmlSource`, `songModeLeadSheetMusicXml`, or `ensembleLeadSheetMusicXml` payload through the API. Composer OS now has an additive </w:t>
+      </w:r>
+      <w:r>
+        <w:rPr>
+          <w:b/>
+          <w:bCs/>
+        </w:rPr>
+        <w:t xml:space="preserve">deep import</w:t>
+      </w:r>
+      <w:r>
+        <w:t xml:space="preserve"> path: it reads the score, builds an imported </w:t>
+      </w:r>
+      <w:r>
+        <w:rPr>
+          <w:b/>
+          <w:bCs/>
+        </w:rPr>
+        <w:t xml:space="preserve">Song</w:t>
+      </w:r>
+      <w:r>
+        <w:t xml:space="preserve"> object, and uses that Song alongside locked harmony when you generate.</w:t>
+      </w:r>
+    </w:p>
+    <w:p>
+      <w:pPr>
+        <w:spacing w:after="160"/>
+      </w:pPr>
+      <w:r>
+        <w:t xml:space="preserve">Plain English:</w:t>
+      </w:r>
+    </w:p>
+    <w:p>
+      <w:pPr>
+        <w:spacing w:after="80"/>
+        <w:ind w:left="360" w:hanging="260"/>
+      </w:pPr>
+      <w:r>
+        <w:t xml:space="preserve">• </w:t>
+      </w:r>
+      <w:r>
+        <w:t xml:space="preserve">Chord symbols become the locked harmony rail</w:t>
+      </w:r>
+    </w:p>
+    <w:p>
+      <w:pPr>
+        <w:spacing w:after="80"/>
+        <w:ind w:left="360" w:hanging="260"/>
+      </w:pPr>
+      <w:r>
+        <w:t xml:space="preserve">• </w:t>
+      </w:r>
+      <w:r>
+        <w:t xml:space="preserve">Rehearsal marks become Song sections</w:t>
+      </w:r>
+    </w:p>
+    <w:p>
+      <w:pPr>
+        <w:spacing w:after="80"/>
+        <w:ind w:left="360" w:hanging="260"/>
+      </w:pPr>
+      <w:r>
+        <w:t xml:space="preserve">• </w:t>
+      </w:r>
+      <w:r>
+        <w:t xml:space="preserve">Meter changes become per-section meter maps</w:t>
+      </w:r>
+    </w:p>
+    <w:p>
+      <w:pPr>
+        <w:spacing w:after="80"/>
+        <w:ind w:left="360" w:hanging="260"/>
+      </w:pPr>
+      <w:r>
+        <w:t xml:space="preserve">• </w:t>
+      </w:r>
+      <w:r>
+        <w:t xml:space="preserve">Tempo markings become the Song default tempo</w:t>
+      </w:r>
+    </w:p>
+    <w:p>
+      <w:pPr>
+        <w:spacing w:after="80"/>
+        <w:ind w:left="360" w:hanging="260"/>
+      </w:pPr>
+      <w:r>
+        <w:t xml:space="preserve">• </w:t>
+      </w:r>
+      <w:r>
+        <w:t xml:space="preserve">Part names become instrument-role hints such as guitar, bass, strings, brass, woodwinds, drums, or keys</w:t>
+      </w:r>
+    </w:p>
+    <w:p>
+      <w:pPr>
+        <w:spacing w:after="160"/>
+      </w:pPr>
+      <w:r>
+        <w:t xml:space="preserve">This works without replacing the older `parseMusicXml` and LeadSheet import paths. Existing imports keep their behaviour; the new path adds section-aware Song data on top.</w:t>
+      </w:r>
+    </w:p>
+    <w:p>
+      <w:pPr>
+        <w:pStyle w:val="Heading2"/>
+        <w:spacing w:after="100" w:before="160"/>
+      </w:pPr>
+      <w:r>
+        <w:t xml:space="preserve">11.2 What gets extracted</w:t>
+      </w:r>
+    </w:p>
+    <w:tbl>
+      <w:tblPr>
+        <w:tblW w:type="pct" w:w="100%"/>
+        <w:tblBorders>
+          <w:top w:val="single" w:color="auto" w:sz="4"/>
+          <w:left w:val="single" w:color="auto" w:sz="4"/>
+          <w:bottom w:val="single" w:color="auto" w:sz="4"/>
+          <w:right w:val="single" w:color="auto" w:sz="4"/>
+          <w:insideH w:val="single" w:color="auto" w:sz="4"/>
+          <w:insideV w:val="single" w:color="auto" w:sz="4"/>
+        </w:tblBorders>
+      </w:tblPr>
+      <w:tblGrid>
+        <w:gridCol w:w="4500"/>
+        <w:gridCol w:w="4500"/>
+      </w:tblGrid>
+      <w:tr>
+        <w:tc>
+          <w:tcPr>
+            <w:tcW w:type="pct" w:w="4500%"/>
+          </w:tcPr>
+          <w:p>
+            <w:pPr>
+              <w:spacing w:after="60"/>
+            </w:pPr>
+            <w:r>
+              <w:t xml:space="preserve">MusicXML content</w:t>
+            </w:r>
+          </w:p>
+        </w:tc>
+        <w:tc>
+          <w:tcPr>
+            <w:tcW w:type="pct" w:w="4500%"/>
+          </w:tcPr>
+          <w:p>
+            <w:pPr>
+              <w:spacing w:after="60"/>
+            </w:pPr>
+            <w:r>
+              <w:t xml:space="preserve">Composer OS use</w:t>
+            </w:r>
+          </w:p>
+        </w:tc>
+      </w:tr>
+      <w:tr>
+        <w:tc>
+          <w:tcPr>
+            <w:tcW w:type="pct" w:w="4500%"/>
+          </w:tcPr>
+          <w:p>
+            <w:pPr>
+              <w:spacing w:after="60"/>
+            </w:pPr>
+            <w:r>
+              <w:t xml:space="preserve">`&lt;harmony&gt;` chord roots, quality, alterations, slash bass</w:t>
+            </w:r>
+          </w:p>
+        </w:tc>
+        <w:tc>
+          <w:tcPr>
+            <w:tcW w:type="pct" w:w="4500%"/>
+          </w:tcPr>
+          <w:p>
+            <w:pPr>
+              <w:spacing w:after="60"/>
+            </w:pPr>
+            <w:r>
+              <w:t xml:space="preserve">`lockedHarmonyBars`</w:t>
+            </w:r>
+          </w:p>
+        </w:tc>
+      </w:tr>
+      <w:tr>
+        <w:tc>
+          <w:tcPr>
+            <w:tcW w:type="pct" w:w="4500%"/>
+          </w:tcPr>
+          <w:p>
+            <w:pPr>
+              <w:spacing w:after="60"/>
+            </w:pPr>
+            <w:r>
+              <w:t xml:space="preserve">Rehearsal marks</w:t>
+            </w:r>
+          </w:p>
+        </w:tc>
+        <w:tc>
+          <w:tcPr>
+            <w:tcW w:type="pct" w:w="4500%"/>
+          </w:tcPr>
+          <w:p>
+            <w:pPr>
+              <w:spacing w:after="60"/>
+            </w:pPr>
+            <w:r>
+              <w:t xml:space="preserve">`Song.sections`</w:t>
+            </w:r>
+          </w:p>
+        </w:tc>
+      </w:tr>
+      <w:tr>
+        <w:tc>
+          <w:tcPr>
+            <w:tcW w:type="pct" w:w="4500%"/>
+          </w:tcPr>
+          <w:p>
+            <w:pPr>
+              <w:spacing w:after="60"/>
+            </w:pPr>
+            <w:r>
+              <w:t xml:space="preserve">Per-bar time signatures</w:t>
+            </w:r>
+          </w:p>
+        </w:tc>
+        <w:tc>
+          <w:tcPr>
+            <w:tcW w:type="pct" w:w="4500%"/>
+          </w:tcPr>
+          <w:p>
+            <w:pPr>
+              <w:spacing w:after="60"/>
+            </w:pPr>
+            <w:r>
+              <w:t xml:space="preserve">`SectionPreset.meterMap`</w:t>
+            </w:r>
+          </w:p>
+        </w:tc>
+      </w:tr>
+      <w:tr>
+        <w:tc>
+          <w:tcPr>
+            <w:tcW w:type="pct" w:w="4500%"/>
+          </w:tcPr>
+          <w:p>
+            <w:pPr>
+              <w:spacing w:after="60"/>
+            </w:pPr>
+            <w:r>
+              <w:t xml:space="preserve">Tempo directions / `&lt;sound tempo&gt;`</w:t>
+            </w:r>
+          </w:p>
+        </w:tc>
+        <w:tc>
+          <w:tcPr>
+            <w:tcW w:type="pct" w:w="4500%"/>
+          </w:tcPr>
+          <w:p>
+            <w:pPr>
+              <w:spacing w:after="60"/>
+            </w:pPr>
+            <w:r>
+              <w:t xml:space="preserve">`Song.globalDefaults.tempo`</w:t>
+            </w:r>
+          </w:p>
+        </w:tc>
+      </w:tr>
+      <w:tr>
+        <w:tc>
+          <w:tcPr>
+            <w:tcW w:type="pct" w:w="4500%"/>
+          </w:tcPr>
+          <w:p>
+            <w:pPr>
+              <w:spacing w:after="60"/>
+            </w:pPr>
+            <w:r>
+              <w:t xml:space="preserve">Part names</w:t>
+            </w:r>
+          </w:p>
+        </w:tc>
+        <w:tc>
+          <w:tcPr>
+            <w:tcW w:type="pct" w:w="4500%"/>
+          </w:tcPr>
+          <w:p>
+            <w:pPr>
+              <w:spacing w:after="60"/>
+            </w:pPr>
+            <w:r>
+              <w:t xml:space="preserve">Instrument role hints</w:t>
+            </w:r>
+          </w:p>
+        </w:tc>
+      </w:tr>
+      <w:tr>
+        <w:tc>
+          <w:tcPr>
+            <w:tcW w:type="pct" w:w="4500%"/>
+          </w:tcPr>
+          <w:p>
+            <w:pPr>
+              <w:spacing w:after="60"/>
+            </w:pPr>
+            <w:r>
+              <w:t xml:space="preserve">Existing lead-sheet content</w:t>
+            </w:r>
+          </w:p>
+        </w:tc>
+        <w:tc>
+          <w:tcPr>
+            <w:tcW w:type="pct" w:w="4500%"/>
+          </w:tcPr>
+          <w:p>
+            <w:pPr>
+              <w:spacing w:after="60"/>
+            </w:pPr>
+            <w:r>
+              <w:t xml:space="preserve">Optional LeadSheet handoff for Song Mode / BB / SQ</w:t>
+            </w:r>
+          </w:p>
+        </w:tc>
+      </w:tr>
+    </w:tbl>
+    <w:p>
+      <w:pPr>
+        <w:spacing w:after="160"/>
+      </w:pPr>
+    </w:p>
+    <w:p>
+      <w:pPr>
+        <w:pStyle w:val="Heading2"/>
+        <w:spacing w:after="100" w:before="160"/>
+      </w:pPr>
+      <w:r>
+        <w:t xml:space="preserve">11.3 What does not get extracted yet</w:t>
+      </w:r>
+    </w:p>
+    <w:p>
+      <w:pPr>
+        <w:spacing w:after="80"/>
+        <w:ind w:left="360" w:hanging="260"/>
+      </w:pPr>
+      <w:r>
+        <w:t xml:space="preserve">• </w:t>
+      </w:r>
+      <w:r>
+        <w:t xml:space="preserve">Lyrics</w:t>
+      </w:r>
+    </w:p>
+    <w:p>
+      <w:pPr>
+        <w:spacing w:after="80"/>
+        <w:ind w:left="360" w:hanging="260"/>
+      </w:pPr>
+      <w:r>
+        <w:t xml:space="preserve">• </w:t>
+      </w:r>
+      <w:r>
+        <w:t xml:space="preserve">Non-voice-1 melody as full musical material</w:t>
+      </w:r>
+    </w:p>
+    <w:p>
+      <w:pPr>
+        <w:spacing w:after="80"/>
+        <w:ind w:left="360" w:hanging="260"/>
+      </w:pPr>
+      <w:r>
+        <w:t xml:space="preserve">• </w:t>
+      </w:r>
+      <w:r>
+        <w:t xml:space="preserve">Stacked notes as full arranged voicings</w:t>
+      </w:r>
+    </w:p>
+    <w:p>
+      <w:pPr>
+        <w:spacing w:after="80"/>
+        <w:ind w:left="360" w:hanging="260"/>
+      </w:pPr>
+      <w:r>
+        <w:t xml:space="preserve">• </w:t>
+      </w:r>
+      <w:r>
+        <w:t xml:space="preserve">Detailed articulations as generation constraints</w:t>
+      </w:r>
+    </w:p>
+    <w:p>
+      <w:pPr>
+        <w:spacing w:after="80"/>
+        <w:ind w:left="360" w:hanging="260"/>
+      </w:pPr>
+      <w:r>
+        <w:t xml:space="preserve">• </w:t>
+      </w:r>
+      <w:r>
+        <w:t xml:space="preserve">Full round-trip part writing from imported scores</w:t>
+      </w:r>
+    </w:p>
+    <w:p>
+      <w:pPr>
+        <w:spacing w:after="80"/>
+        <w:ind w:left="360" w:hanging="260"/>
+      </w:pPr>
+      <w:r>
+        <w:t xml:space="preserve">• </w:t>
+      </w:r>
+      <w:r>
+        <w:t xml:space="preserve">Drum-specific interpretation</w:t>
+      </w:r>
+    </w:p>
+    <w:p>
+      <w:pPr>
+        <w:spacing w:after="160"/>
+      </w:pPr>
+      <w:r>
+        <w:t xml:space="preserve">Multiple parts are detected, but today they mostly provide role hints rather than literal "use this exact part" instructions.</w:t>
+      </w:r>
+    </w:p>
+    <w:p>
+      <w:pPr>
+        <w:pStyle w:val="Heading2"/>
+        <w:spacing w:after="100" w:before="160"/>
+      </w:pPr>
+      <w:r>
+        <w:t xml:space="preserve">11.4 Sibelius QA status</w:t>
+      </w:r>
+    </w:p>
+    <w:p>
+      <w:pPr>
+        <w:spacing w:after="160"/>
+      </w:pPr>
+      <w:r>
+        <w:t xml:space="preserve">V65 P3 automated QA generated short MusicXML files for all target modes and ran the repository validator.</w:t>
+      </w:r>
+    </w:p>
+    <w:tbl>
+      <w:tblPr>
+        <w:tblW w:type="pct" w:w="100%"/>
+        <w:tblBorders>
+          <w:top w:val="single" w:color="auto" w:sz="4"/>
+          <w:left w:val="single" w:color="auto" w:sz="4"/>
+          <w:bottom w:val="single" w:color="auto" w:sz="4"/>
+          <w:right w:val="single" w:color="auto" w:sz="4"/>
+          <w:insideH w:val="single" w:color="auto" w:sz="4"/>
+          <w:insideV w:val="single" w:color="auto" w:sz="4"/>
+        </w:tblBorders>
+      </w:tblPr>
+      <w:tblGrid>
+        <w:gridCol w:w="3000"/>
+        <w:gridCol w:w="3000"/>
+        <w:gridCol w:w="3000"/>
+      </w:tblGrid>
+      <w:tr>
+        <w:tc>
+          <w:tcPr>
+            <w:tcW w:type="pct" w:w="3000%"/>
+          </w:tcPr>
+          <w:p>
+            <w:pPr>
+              <w:spacing w:after="60"/>
+            </w:pPr>
+            <w:r>
+              <w:t xml:space="preserve">Mode</w:t>
+            </w:r>
+          </w:p>
+        </w:tc>
+        <w:tc>
+          <w:tcPr>
+            <w:tcW w:type="pct" w:w="3000%"/>
+          </w:tcPr>
+          <w:p>
+            <w:pPr>
+              <w:spacing w:after="60"/>
+            </w:pPr>
+            <w:r>
+              <w:t xml:space="preserve">Automated</w:t>
+            </w:r>
+          </w:p>
+        </w:tc>
+        <w:tc>
+          <w:tcPr>
+            <w:tcW w:type="pct" w:w="3000%"/>
+          </w:tcPr>
+          <w:p>
+            <w:pPr>
+              <w:spacing w:after="60"/>
+            </w:pPr>
+            <w:r>
+              <w:t xml:space="preserve">Manual Sibelius</w:t>
+            </w:r>
+          </w:p>
+        </w:tc>
+      </w:tr>
+      <w:tr>
+        <w:tc>
+          <w:tcPr>
+            <w:tcW w:type="pct" w:w="3000%"/>
+          </w:tcPr>
+          <w:p>
+            <w:pPr>
+              <w:spacing w:after="60"/>
+            </w:pPr>
+            <w:r>
+              <w:t xml:space="preserve">Song Mode (`guitar_bass_duo` export path)</w:t>
+            </w:r>
+          </w:p>
+        </w:tc>
+        <w:tc>
+          <w:tcPr>
+            <w:tcW w:type="pct" w:w="3000%"/>
+          </w:tcPr>
+          <w:p>
+            <w:pPr>
+              <w:spacing w:after="60"/>
+            </w:pPr>
+            <w:r>
+              <w:t xml:space="preserve">PASS</w:t>
+            </w:r>
+          </w:p>
+        </w:tc>
+        <w:tc>
+          <w:tcPr>
+            <w:tcW w:type="pct" w:w="3000%"/>
+          </w:tcPr>
+          <w:p>
+            <w:pPr>
+              <w:spacing w:after="60"/>
+            </w:pPr>
+            <w:r>
+              <w:t xml:space="preserve">Confirmed 2026-04-17</w:t>
+            </w:r>
+          </w:p>
+        </w:tc>
+      </w:tr>
+      <w:tr>
+        <w:tc>
+          <w:tcPr>
+            <w:tcW w:type="pct" w:w="3000%"/>
+          </w:tcPr>
+          <w:p>
+            <w:pPr>
+              <w:spacing w:after="60"/>
+            </w:pPr>
+            <w:r>
+              <w:t xml:space="preserve">Guitar-Bass Duo</w:t>
+            </w:r>
+          </w:p>
+        </w:tc>
+        <w:tc>
+          <w:tcPr>
+            <w:tcW w:type="pct" w:w="3000%"/>
+          </w:tcPr>
+          <w:p>
+            <w:pPr>
+              <w:spacing w:after="60"/>
+            </w:pPr>
+            <w:r>
+              <w:t xml:space="preserve">PASS</w:t>
+            </w:r>
+          </w:p>
+        </w:tc>
+        <w:tc>
+          <w:tcPr>
+            <w:tcW w:type="pct" w:w="3000%"/>
+          </w:tcPr>
+          <w:p>
+            <w:pPr>
+              <w:spacing w:after="60"/>
+            </w:pPr>
+            <w:r>
+              <w:t xml:space="preserve">Confirmed 2026-05-02</w:t>
+            </w:r>
+          </w:p>
+        </w:tc>
+      </w:tr>
+      <w:tr>
+        <w:tc>
+          <w:tcPr>
+            <w:tcW w:type="pct" w:w="3000%"/>
+          </w:tcPr>
+          <w:p>
+            <w:pPr>
+              <w:spacing w:after="60"/>
+            </w:pPr>
+            <w:r>
+              <w:t xml:space="preserve">ECM chamber</w:t>
+            </w:r>
+          </w:p>
+        </w:tc>
+        <w:tc>
+          <w:tcPr>
+            <w:tcW w:type="pct" w:w="3000%"/>
+          </w:tcPr>
+          <w:p>
+            <w:pPr>
+              <w:spacing w:after="60"/>
+            </w:pPr>
+            <w:r>
+              <w:t xml:space="preserve">PASS</w:t>
+            </w:r>
+          </w:p>
+        </w:tc>
+        <w:tc>
+          <w:tcPr>
+            <w:tcW w:type="pct" w:w="3000%"/>
+          </w:tcPr>
+          <w:p>
+            <w:pPr>
+              <w:spacing w:after="60"/>
+            </w:pPr>
+            <w:r>
+              <w:t xml:space="preserve">TBD</w:t>
+            </w:r>
+          </w:p>
+        </w:tc>
+      </w:tr>
+      <w:tr>
+        <w:tc>
+          <w:tcPr>
+            <w:tcW w:type="pct" w:w="3000%"/>
+          </w:tcPr>
+          <w:p>
+            <w:pPr>
+              <w:spacing w:after="60"/>
+            </w:pPr>
+            <w:r>
+              <w:t xml:space="preserve">String Quartet</w:t>
+            </w:r>
+          </w:p>
+        </w:tc>
+        <w:tc>
+          <w:tcPr>
+            <w:tcW w:type="pct" w:w="3000%"/>
+          </w:tcPr>
+          <w:p>
+            <w:pPr>
+              <w:spacing w:after="60"/>
+            </w:pPr>
+            <w:r>
+              <w:t xml:space="preserve">PASS</w:t>
+            </w:r>
+          </w:p>
+        </w:tc>
+        <w:tc>
+          <w:tcPr>
+            <w:tcW w:type="pct" w:w="3000%"/>
+          </w:tcPr>
+          <w:p>
+            <w:pPr>
+              <w:spacing w:after="60"/>
+            </w:pPr>
+            <w:r>
+              <w:t xml:space="preserve">TBD</w:t>
+            </w:r>
+          </w:p>
+        </w:tc>
+      </w:tr>
+      <w:tr>
+        <w:tc>
+          <w:tcPr>
+            <w:tcW w:type="pct" w:w="3000%"/>
+          </w:tcPr>
+          <w:p>
+            <w:pPr>
+              <w:spacing w:after="60"/>
+            </w:pPr>
+            <w:r>
+              <w:t xml:space="preserve">Big Band</w:t>
+            </w:r>
+          </w:p>
+        </w:tc>
+        <w:tc>
+          <w:tcPr>
+            <w:tcW w:type="pct" w:w="3000%"/>
+          </w:tcPr>
+          <w:p>
+            <w:pPr>
+              <w:spacing w:after="60"/>
+            </w:pPr>
+            <w:r>
+              <w:t xml:space="preserve">PASS</w:t>
+            </w:r>
+          </w:p>
+        </w:tc>
+        <w:tc>
+          <w:tcPr>
+            <w:tcW w:type="pct" w:w="3000%"/>
+          </w:tcPr>
+          <w:p>
+            <w:pPr>
+              <w:spacing w:after="60"/>
+            </w:pPr>
+            <w:r>
+              <w:t xml:space="preserve">TBD</w:t>
+            </w:r>
+          </w:p>
+        </w:tc>
+      </w:tr>
+      <w:tr>
+        <w:tc>
+          <w:tcPr>
+            <w:tcW w:type="pct" w:w="3000%"/>
+          </w:tcPr>
+          <w:p>
+            <w:pPr>
+              <w:spacing w:after="60"/>
+            </w:pPr>
+            <w:r>
+              <w:t xml:space="preserve">Riff generator</w:t>
+            </w:r>
+          </w:p>
+        </w:tc>
+        <w:tc>
+          <w:tcPr>
+            <w:tcW w:type="pct" w:w="3000%"/>
+          </w:tcPr>
+          <w:p>
+            <w:pPr>
+              <w:spacing w:after="60"/>
+            </w:pPr>
+            <w:r>
+              <w:t xml:space="preserve">PASS</w:t>
+            </w:r>
+          </w:p>
+        </w:tc>
+        <w:tc>
+          <w:tcPr>
+            <w:tcW w:type="pct" w:w="3000%"/>
+          </w:tcPr>
+          <w:p>
+            <w:pPr>
+              <w:spacing w:after="60"/>
+            </w:pPr>
+            <w:r>
+              <w:t xml:space="preserve">TBD</w:t>
+            </w:r>
+          </w:p>
+        </w:tc>
+      </w:tr>
+      <w:tr>
+        <w:tc>
+          <w:tcPr>
+            <w:tcW w:type="pct" w:w="3000%"/>
+          </w:tcPr>
+          <w:p>
+            <w:pPr>
+              <w:spacing w:after="60"/>
+            </w:pPr>
+            <w:r>
+              <w:t xml:space="preserve">Wyble etude</w:t>
+            </w:r>
+          </w:p>
+        </w:tc>
+        <w:tc>
+          <w:tcPr>
+            <w:tcW w:type="pct" w:w="3000%"/>
+          </w:tcPr>
+          <w:p>
+            <w:pPr>
+              <w:spacing w:after="60"/>
+            </w:pPr>
+            <w:r>
+              <w:t xml:space="preserve">PASS</w:t>
+            </w:r>
+          </w:p>
+        </w:tc>
+        <w:tc>
+          <w:tcPr>
+            <w:tcW w:type="pct" w:w="3000%"/>
+          </w:tcPr>
+          <w:p>
+            <w:pPr>
+              <w:spacing w:after="60"/>
+            </w:pPr>
+            <w:r>
+              <w:t xml:space="preserve">TBD</w:t>
+            </w:r>
+          </w:p>
+        </w:tc>
+      </w:tr>
+      <w:tr>
+        <w:tc>
+          <w:tcPr>
+            <w:tcW w:type="pct" w:w="3000%"/>
+          </w:tcPr>
+          <w:p>
+            <w:pPr>
+              <w:spacing w:after="60"/>
+            </w:pPr>
+            <w:r>
+              <w:t xml:space="preserve">Slonimsky etude</w:t>
+            </w:r>
+          </w:p>
+        </w:tc>
+        <w:tc>
+          <w:tcPr>
+            <w:tcW w:type="pct" w:w="3000%"/>
+          </w:tcPr>
+          <w:p>
+            <w:pPr>
+              <w:spacing w:after="60"/>
+            </w:pPr>
+            <w:r>
+              <w:t xml:space="preserve">PASS</w:t>
+            </w:r>
+          </w:p>
+        </w:tc>
+        <w:tc>
+          <w:tcPr>
+            <w:tcW w:type="pct" w:w="3000%"/>
+          </w:tcPr>
+          <w:p>
+            <w:pPr>
+              <w:spacing w:after="60"/>
+            </w:pPr>
+            <w:r>
+              <w:t xml:space="preserve">TBD</w:t>
+            </w:r>
+          </w:p>
+        </w:tc>
+      </w:tr>
+    </w:tbl>
+    <w:p>
+      <w:pPr>
+        <w:spacing w:after="160"/>
+      </w:pPr>
+    </w:p>
+    <w:p>
+      <w:pPr>
+        <w:spacing w:after="160"/>
+      </w:pPr>
+      <w:r>
+        <w:t xml:space="preserve">Detailed report: `docs/SIBELIUS_QA_REPORT.md`.</w:t>
+      </w:r>
+    </w:p>
+    <w:p>
+      <w:pPr>
+        <w:spacing w:after="160"/>
+      </w:pPr>
+      <w:r>
+        <w:rPr>
+          <w:b/>
+          <w:bCs/>
+        </w:rPr>
+        <w:t xml:space="preserve">Golden verification (off smoke until V65 closeout):</w:t>
+      </w:r>
+      <w:r>
+        <w:t xml:space="preserve"> `engines/composer-os-v2/scripts/runMusicXmlDeepImportGolden.ts`</w:t>
       </w:r>
     </w:p>
     <w:p>

</xml_diff>

<commit_message>
feat(groove): V65 P4 add Song Mode groove scaffold
Adds opt-in section-aware groove drums before duo score sealing so the percussion part participates in bar math and export validation.

Co-authored-by: Cursor <cursoragent@cursor.com>
</commit_message>
<xml_diff>
--- a/docs/COMPOSER_OS_MUSICIAN_GUIDE.docx
+++ b/docs/COMPOSER_OS_MUSICIAN_GUIDE.docx
@@ -183,6 +183,201 @@
       </w:r>
       <w:r>
         <w:t xml:space="preserve"> Jazz heads, pop writing, singer-songwriter ideas, ECM-style ballads, film themes.</w:t>
+      </w:r>
+    </w:p>
+    <w:p>
+      <w:pPr>
+        <w:pStyle w:val="Heading2"/>
+        <w:spacing w:after="100" w:before="160"/>
+      </w:pPr>
+      <w:r>
+        <w:t xml:space="preserve">1.1a Groove Scaffold — opt-in Song Mode drums</w:t>
+      </w:r>
+    </w:p>
+    <w:p>
+      <w:pPr>
+        <w:spacing w:after="160"/>
+      </w:pPr>
+      <w:r>
+        <w:rPr>
+          <w:b/>
+          <w:bCs/>
+        </w:rPr>
+        <w:t xml:space="preserve">What it provides:</w:t>
+      </w:r>
+      <w:r>
+        <w:t xml:space="preserve"> A simple symbolic drum staff for Song Mode when the composition includes a Song object with `globalDefaults.grooveScaffold.enabled: true`. The exported score gains one `Groove Drums` part: one unpitched percussion staff, one voice, GM drum pitches, MusicXML percussion clef, and MIDI channel 10.</w:t>
+      </w:r>
+    </w:p>
+    <w:p>
+      <w:pPr>
+        <w:spacing w:after="160"/>
+      </w:pPr>
+      <w:r>
+        <w:rPr>
+          <w:b/>
+          <w:bCs/>
+        </w:rPr>
+        <w:t xml:space="preserve">What it does not do:</w:t>
+      </w:r>
+      <w:r>
+        <w:t xml:space="preserve"> It is not a full drum engine. It does not imitate named drummers, write jazz comping intelligence, use custom kits, add brush nuance, or create multi-staff percussion notation. Existing compositions without the opt-in Song object are unchanged.</w:t>
+      </w:r>
+    </w:p>
+    <w:p>
+      <w:pPr>
+        <w:spacing w:after="160"/>
+      </w:pPr>
+      <w:r>
+        <w:rPr>
+          <w:b/>
+          <w:bCs/>
+        </w:rPr>
+        <w:t xml:space="preserve">Six feels:</w:t>
+      </w:r>
+    </w:p>
+    <w:p>
+      <w:pPr>
+        <w:spacing w:after="80"/>
+        <w:ind w:left="360" w:hanging="260"/>
+      </w:pPr>
+      <w:r>
+        <w:t xml:space="preserve">• </w:t>
+      </w:r>
+      <w:r>
+        <w:t xml:space="preserve">`swing` — ride-led time with hi-hat on 2 and 4; exported as straight notation with swing-triplet receipt metadata.</w:t>
+      </w:r>
+    </w:p>
+    <w:p>
+      <w:pPr>
+        <w:spacing w:after="80"/>
+        <w:ind w:left="360" w:hanging="260"/>
+      </w:pPr>
+      <w:r>
+        <w:t xml:space="preserve">• </w:t>
+      </w:r>
+      <w:r>
+        <w:t xml:space="preserve">`funk` — 16th-note grid, tight hi-hat, restrained ghost-snare color.</w:t>
+      </w:r>
+    </w:p>
+    <w:p>
+      <w:pPr>
+        <w:spacing w:after="80"/>
+        <w:ind w:left="360" w:hanging="260"/>
+      </w:pPr>
+      <w:r>
+        <w:t xml:space="preserve">• </w:t>
+      </w:r>
+      <w:r>
+        <w:t xml:space="preserve">`rock` — 8th-note grid, strong backbeat, occasional open-hat lift.</w:t>
+      </w:r>
+    </w:p>
+    <w:p>
+      <w:pPr>
+        <w:spacing w:after="80"/>
+        <w:ind w:left="360" w:hanging="260"/>
+      </w:pPr>
+      <w:r>
+        <w:t xml:space="preserve">• </w:t>
+      </w:r>
+      <w:r>
+        <w:t xml:space="preserve">`bossa` — light 8th-note cross-stick posture with minimal kick.</w:t>
+      </w:r>
+    </w:p>
+    <w:p>
+      <w:pPr>
+        <w:spacing w:after="80"/>
+        <w:ind w:left="360" w:hanging="260"/>
+      </w:pPr>
+      <w:r>
+        <w:t xml:space="preserve">• </w:t>
+      </w:r>
+      <w:r>
+        <w:t xml:space="preserve">`ballad` — sparse 8th-note pulse with soft side-stick/snare behavior.</w:t>
+      </w:r>
+    </w:p>
+    <w:p>
+      <w:pPr>
+        <w:spacing w:after="80"/>
+        <w:ind w:left="360" w:hanging="260"/>
+      </w:pPr>
+      <w:r>
+        <w:t xml:space="preserve">• </w:t>
+      </w:r>
+      <w:r>
+        <w:t xml:space="preserve">`odd_meter` — automatic per-bar fallback when a Song section or request meter uses non-4/4, using a simple meter-derived ostinato.</w:t>
+      </w:r>
+    </w:p>
+    <w:p>
+      <w:pPr>
+        <w:spacing w:after="160"/>
+      </w:pPr>
+      <w:r>
+        <w:rPr>
+          <w:b/>
+          <w:bCs/>
+        </w:rPr>
+        <w:t xml:space="preserve">How section energy changes density:</w:t>
+      </w:r>
+      <w:r>
+        <w:t xml:space="preserve"> Intro stays sparse, verse stays steady, chorus lifts cymbal/hat activity, bridge stays contrasting rather than fill-heavy, and outro tapers into a deterministic ending gesture. Higher section energy raises density tier and fill chance, but caps keep the part readable.</w:t>
+      </w:r>
+    </w:p>
+    <w:p>
+      <w:pPr>
+        <w:spacing w:after="160"/>
+      </w:pPr>
+      <w:r>
+        <w:rPr>
+          <w:b/>
+          <w:bCs/>
+        </w:rPr>
+        <w:t xml:space="preserve">Fill behavior:</w:t>
+      </w:r>
+      <w:r>
+        <w:t xml:space="preserve"> Fills are sparse and rule-based. Section-final bars get a 35-60% fill window by feel and energy; mid-section cadences get only 10-20% and only after enough space. No two fills occur within two bars except ending/tag behavior. After a fill, the next bar is a reset. Fills use kick, snare, and toms only; crashes happen on section arrivals, not on fill bars.</w:t>
+      </w:r>
+    </w:p>
+    <w:p>
+      <w:pPr>
+        <w:spacing w:after="160"/>
+      </w:pPr>
+      <w:r>
+        <w:rPr>
+          <w:b/>
+          <w:bCs/>
+        </w:rPr>
+        <w:t xml:space="preserve">How to enable:</w:t>
+      </w:r>
+      <w:r>
+        <w:t xml:space="preserve"> Include a Song architecture document in the generation request and set:</w:t>
+      </w:r>
+    </w:p>
+    <w:p>
+      <w:pPr>
+        <w:shd w:fill="F5F5F5"/>
+        <w:spacing w:after="120"/>
+      </w:pPr>
+      <w:r>
+        <w:rPr>
+          <w:rFonts w:ascii="Consolas" w:cs="Consolas" w:eastAsia="Consolas" w:hAnsi="Consolas"/>
+          <w:sz w:val="20"/>
+          <w:szCs w:val="20"/>
+        </w:rPr>
+        <w:t xml:space="preserve">"globalDefaults": {
+  "grooveScaffold": {
+    "enabled": true,
+    "feel": "rock"
+  }
+}</w:t>
+      </w:r>
+    </w:p>
+    <w:p>
+      <w:pPr>
+        <w:spacing w:after="160"/>
+      </w:pPr>
+      <w:r>
+        <w:t xml:space="preserve">Valid `feel` values are `swing`, `funk`, `rock`, `bossa`, `ballad`, and `odd_meter`.</w:t>
       </w:r>
     </w:p>
     <w:p>

</xml_diff>

<commit_message>
feat(zappa): promote V65 diff receipts
Promote the Zappa differentiator receipts into runtime riff patches and expose per-section Zappa behavior diagnostics so manifests explain density/register changes without altering fz:d1-d5 receipt semantics.

Co-authored-by: Cursor <cursoragent@cursor.com>
</commit_message>
<xml_diff>
--- a/docs/COMPOSER_OS_MUSICIAN_GUIDE.docx
+++ b/docs/COMPOSER_OS_MUSICIAN_GUIDE.docx
@@ -2553,7 +2553,7 @@
         <w:spacing w:after="100" w:before="160"/>
       </w:pPr>
       <w:r>
-        <w:t xml:space="preserve">2.7 Frank Zappa — FZ_* receipt fingerprints (V64 P3)</w:t>
+        <w:t xml:space="preserve">2.7 Frank Zappa — FZ_* receipt fingerprints (V65 P5)</w:t>
       </w:r>
     </w:p>
     <w:p>
@@ -2636,27 +2636,67 @@
         <w:t xml:space="preserve">When they fire:</w:t>
       </w:r>
       <w:r>
-        <w:t xml:space="preserve"> On every generate where `frank_zappa` resolves to the Frank Zappa VRB — Song Mode duo, riff generator, and blues-rock ferocity solo path. Receipts merge into `riffProfile` before notes are written. Twelve receipts apply broad prefix rules (harmony, melody, rhythm, etc.); </w:t>
-      </w:r>
-      <w:r>
-        <w:rPr>
-          <w:b/>
-          <w:bCs/>
-        </w:rPr>
-        <w:t xml:space="preserve">three are fully promoted (P3)</w:t>
-      </w:r>
-      <w:r>
-        <w:t xml:space="preserve"> with dedicated patches and golden fixtures (seeds </w:t>
-      </w:r>
-      <w:r>
-        <w:rPr>
-          <w:b/>
-          <w:bCs/>
-        </w:rPr>
-        <w:t xml:space="preserve">77001–77003</w:t>
-      </w:r>
-      <w:r>
-        <w:t xml:space="preserve">, off smoke until P8).</w:t>
+        <w:t xml:space="preserve"> On every generate where `frank_zappa` resolves to the Frank Zappa VRB — Song Mode duo, riff generator, and blues-rock ferocity solo path. Receipts merge into `riffProfile` before notes are written. Ten receipts apply broad prefix rules (harmony, melody, rhythm, etc.); </w:t>
+      </w:r>
+      <w:r>
+        <w:rPr>
+          <w:b/>
+          <w:bCs/>
+        </w:rPr>
+        <w:t xml:space="preserve">five are fully promoted</w:t>
+      </w:r>
+      <w:r>
+        <w:t xml:space="preserve"> with dedicated patches and golden fixtures: </w:t>
+      </w:r>
+      <w:r>
+        <w:rPr>
+          <w:b/>
+          <w:bCs/>
+        </w:rPr>
+        <w:t xml:space="preserve">FZ_BURST</w:t>
+      </w:r>
+      <w:r>
+        <w:t xml:space="preserve">, </w:t>
+      </w:r>
+      <w:r>
+        <w:rPr>
+          <w:b/>
+          <w:bCs/>
+        </w:rPr>
+        <w:t xml:space="preserve">FZ_METRIC_SHIFT</w:t>
+      </w:r>
+      <w:r>
+        <w:t xml:space="preserve">, </w:t>
+      </w:r>
+      <w:r>
+        <w:rPr>
+          <w:b/>
+          <w:bCs/>
+        </w:rPr>
+        <w:t xml:space="preserve">FZ_REGISTER_COLLISION</w:t>
+      </w:r>
+      <w:r>
+        <w:t xml:space="preserve">, </w:t>
+      </w:r>
+      <w:r>
+        <w:rPr>
+          <w:b/>
+          <w:bCs/>
+        </w:rPr>
+        <w:t xml:space="preserve">FZ_DIFF_01</w:t>
+      </w:r>
+      <w:r>
+        <w:t xml:space="preserve">, and </w:t>
+      </w:r>
+      <w:r>
+        <w:rPr>
+          <w:b/>
+          <w:bCs/>
+        </w:rPr>
+        <w:t xml:space="preserve">FZ_DIFF_02</w:t>
+      </w:r>
+      <w:r>
+        <w:t xml:space="preserve">.</w:t>
       </w:r>
     </w:p>
     <w:p>
@@ -3176,7 +3216,14 @@
               <w:spacing w:after="60"/>
             </w:pPr>
             <w:r>
-              <w:t xml:space="preserve">Not fusion smooth jazz: no continuous diatonic 8th-note spine.</w:t>
+              <w:rPr>
+                <w:b/>
+                <w:bCs/>
+              </w:rPr>
+              <w:t xml:space="preserve">Promoted (V65 P5)</w:t>
+            </w:r>
+            <w:r>
+              <w:t xml:space="preserve"> — not fusion smooth jazz; forces structural contrast against continuous diatonic 8ths.</w:t>
             </w:r>
           </w:p>
         </w:tc>
@@ -3208,7 +3255,14 @@
               <w:spacing w:after="60"/>
             </w:pPr>
             <w:r>
-              <w:t xml:space="preserve">Not minimalism: no steady pulse without pitch chaos on top.</w:t>
+              <w:rPr>
+                <w:b/>
+                <w:bCs/>
+              </w:rPr>
+              <w:t xml:space="preserve">Promoted (V65 P5)</w:t>
+            </w:r>
+            <w:r>
+              <w:t xml:space="preserve"> — not minimalism; marks style boundaries with pitch-chaos overlays.</w:t>
             </w:r>
           </w:p>
         </w:tc>
@@ -3224,7 +3278,7 @@
         <w:spacing w:after="160"/>
       </w:pPr>
       <w:r>
-        <w:t xml:space="preserve">`FZ_DIFF_*` are metadata-only guardrails (they steer planning text, not a numeric patch). The other prefix families (`FZ_HARM_*`, `FZ_MELO_*`, etc.) already compile to riff-profile fields.</w:t>
+        <w:t xml:space="preserve">`FZ_DIFF_*` are now runtime receipts. They also appear as `frankZappaDiffReceipts` in generation metadata and manifests. The `fz:d1-d5:*` harmony device receipts remain harmony-only and keep their existing format.</w:t>
       </w:r>
     </w:p>
     <w:p>
@@ -3722,6 +3776,187 @@
       </w:r>
       <w:r>
         <w:t xml:space="preserve"> run on the same seed/chords.</w:t>
+      </w:r>
+    </w:p>
+    <w:p>
+      <w:pPr>
+        <w:pStyle w:val="Heading3"/>
+        <w:spacing w:after="80" w:before="120"/>
+      </w:pPr>
+      <w:r>
+        <w:t xml:space="preserve">FZ_DIFF_01 — structural contrast marker</w:t>
+      </w:r>
+    </w:p>
+    <w:p>
+      <w:pPr>
+        <w:spacing w:after="160"/>
+      </w:pPr>
+      <w:r>
+        <w:rPr>
+          <w:b/>
+          <w:bCs/>
+        </w:rPr>
+        <w:t xml:space="preserve">What it does:</w:t>
+      </w:r>
+      <w:r>
+        <w:t xml:space="preserve"> Adds a Zappa-specific rest-window and section-density contrast patch. It breaks up smooth, continuous eighth-note spines with interrupted attacks, ghosted openings, and low repeat persistence.</w:t>
+      </w:r>
+    </w:p>
+    <w:p>
+      <w:pPr>
+        <w:spacing w:after="160"/>
+      </w:pPr>
+      <w:r>
+        <w:rPr>
+          <w:b/>
+          <w:bCs/>
+        </w:rPr>
+        <w:t xml:space="preserve">When it fires:</w:t>
+      </w:r>
+      <w:r>
+        <w:t xml:space="preserve"> During Frank Zappa VRB profile build. It affects riff/Song Mode guitar behavior before notes are emitted, and is echoed in `frankZappaDiffReceipts`.</w:t>
+      </w:r>
+    </w:p>
+    <w:p>
+      <w:pPr>
+        <w:spacing w:after="160"/>
+      </w:pPr>
+      <w:r>
+        <w:rPr>
+          <w:b/>
+          <w:bCs/>
+        </w:rPr>
+        <w:t xml:space="preserve">What you hear:</w:t>
+      </w:r>
+      <w:r>
+        <w:t xml:space="preserve"> A line that refuses to become polite fusion. It drops or ghosts early-bar attacks, makes section contrast more jagged, and pushes phrase endings toward hard interruption rather than smooth continuation.</w:t>
+      </w:r>
+    </w:p>
+    <w:p>
+      <w:pPr>
+        <w:pStyle w:val="Heading3"/>
+        <w:spacing w:after="80" w:before="120"/>
+      </w:pPr>
+      <w:r>
+        <w:t xml:space="preserve">FZ_DIFF_02 — style boundary signal</w:t>
+      </w:r>
+    </w:p>
+    <w:p>
+      <w:pPr>
+        <w:spacing w:after="160"/>
+      </w:pPr>
+      <w:r>
+        <w:rPr>
+          <w:b/>
+          <w:bCs/>
+        </w:rPr>
+        <w:t xml:space="preserve">What it does:</w:t>
+      </w:r>
+      <w:r>
+        <w:t xml:space="preserve"> Raises chromatic budget, adds pitch-chaos variation operators, reinforces 3+3+2 / 5+3 grouping patterns, and raises solo chromatic behavior. It marks "this section changed identity" rather than letting Zappa settle into minimal pulse.</w:t>
+      </w:r>
+    </w:p>
+    <w:p>
+      <w:pPr>
+        <w:spacing w:after="160"/>
+      </w:pPr>
+      <w:r>
+        <w:rPr>
+          <w:b/>
+          <w:bCs/>
+        </w:rPr>
+        <w:t xml:space="preserve">When it fires:</w:t>
+      </w:r>
+      <w:r>
+        <w:t xml:space="preserve"> During Frank Zappa VRB profile build and in per-section behavior diagnostics when a section boundary, anti-metric rhythm, or high chromatic budget is active.</w:t>
+      </w:r>
+    </w:p>
+    <w:p>
+      <w:pPr>
+        <w:spacing w:after="160"/>
+      </w:pPr>
+      <w:r>
+        <w:rPr>
+          <w:b/>
+          <w:bCs/>
+        </w:rPr>
+        <w:t xml:space="preserve">What you hear:</w:t>
+      </w:r>
+      <w:r>
+        <w:t xml:space="preserve"> New sections arrive with sharper chromatic bite and less steady-state looping. The pulse can stay readable, but pitch content destabilizes it.</w:t>
+      </w:r>
+    </w:p>
+    <w:p>
+      <w:pPr>
+        <w:pStyle w:val="Heading3"/>
+        <w:spacing w:after="80" w:before="120"/>
+      </w:pPr>
+      <w:r>
+        <w:t xml:space="preserve">Per-section Zappa behavior</w:t>
+      </w:r>
+    </w:p>
+    <w:p>
+      <w:pPr>
+        <w:spacing w:after="160"/>
+      </w:pPr>
+      <w:r>
+        <w:t xml:space="preserve">When a generation request includes a Song architecture document, Zappa now reads each section's effective context: section label, density, register profile, rhythm profile, and chromatic budget. `resolveZappaSectionBehaviorForBar()` turns that into per-bar overrides:</w:t>
+      </w:r>
+    </w:p>
+    <w:p>
+      <w:pPr>
+        <w:spacing w:after="80"/>
+        <w:ind w:left="360" w:hanging="260"/>
+      </w:pPr>
+      <w:r>
+        <w:t xml:space="preserve">• </w:t>
+      </w:r>
+      <w:r>
+        <w:t xml:space="preserve">Low/sparse sections pull guitar register down and thin density.</w:t>
+      </w:r>
+    </w:p>
+    <w:p>
+      <w:pPr>
+        <w:spacing w:after="80"/>
+        <w:ind w:left="360" w:hanging="260"/>
+      </w:pPr>
+      <w:r>
+        <w:t xml:space="preserve">• </w:t>
+      </w:r>
+      <w:r>
+        <w:t xml:space="preserve">Dense/high/anti-metric sections push register up, increase density, and mark style boundaries.</w:t>
+      </w:r>
+    </w:p>
+    <w:p>
+      <w:pPr>
+        <w:spacing w:after="80"/>
+        <w:ind w:left="360" w:hanging="260"/>
+      </w:pPr>
+      <w:r>
+        <w:t xml:space="preserve">• </w:t>
+      </w:r>
+      <w:r>
+        <w:t xml:space="preserve">Section changes are written to `zappaSectionBehaviorBySection` for manifest inspection.</w:t>
+      </w:r>
+    </w:p>
+    <w:p>
+      <w:pPr>
+        <w:spacing w:after="80"/>
+        <w:ind w:left="360" w:hanging="260"/>
+      </w:pPr>
+      <w:r>
+        <w:t xml:space="preserve">• </w:t>
+      </w:r>
+      <w:r>
+        <w:t xml:space="preserve">Harmony devices still write only `fz:d1` through `fz:d5` receipts; section behavior does not create new harmony-device receipt kinds.</w:t>
+      </w:r>
+    </w:p>
+    <w:p>
+      <w:pPr>
+        <w:spacing w:after="160"/>
+      </w:pPr>
+      <w:r>
+        <w:t xml:space="preserve">Plain example: Section A can be sparse/low and Section B can be dense/high. Same Zappa writer, same chord loop, but the score should visibly change register and note density across the A→B boundary.</w:t>
       </w:r>
     </w:p>
     <w:p>

</xml_diff>